<commit_message>
Deploy protected TA Guide 2026-09-10 14:19 CDT
</commit_message>
<xml_diff>
--- a/lab-materials/final-project/interpersonal_survey_materials/inter-preproposal.docx
+++ b/lab-materials/final-project/interpersonal_survey_materials/inter-preproposal.docx
@@ -16,18 +16,169 @@
       </w:pPr>
       <w:r>
         <w:t xml:space="preserve">Interpersonal Relationships Variables &amp; References</w:t>
+      </w:r>
+    </w:p>
+    <w:p>
+      <w:pPr>
+        <w:pStyle w:val="FirstParagraph"/>
+      </w:pPr>
+      <w:r>
+        <w:t xml:space="preserve">Choose one of the listed variables as your</w:t>
+      </w:r>
+      <w:r>
+        <w:t xml:space="preserve"> </w:t>
+      </w:r>
+      <w:r>
+        <w:rPr>
+          <w:b/>
+          <w:bCs/>
+        </w:rPr>
+        <w:t xml:space="preserve">core variable</w:t>
+      </w:r>
+      <w:r>
+        <w:t xml:space="preserve">, then find</w:t>
+      </w:r>
+      <w:r>
+        <w:t xml:space="preserve"> </w:t>
+      </w:r>
+      <w:r>
+        <w:rPr>
+          <w:b/>
+          <w:bCs/>
+        </w:rPr>
+        <w:t xml:space="preserve">three references</w:t>
+      </w:r>
+      <w:r>
+        <w:t xml:space="preserve"> </w:t>
+      </w:r>
+      <w:r>
+        <w:t xml:space="preserve">using the requirements in the second column.</w:t>
       </w:r>
     </w:p>
     <w:tbl xmlns:w="http://schemas.openxmlformats.org/wordprocessingml/2006/main" xmlns:r="http://schemas.openxmlformats.org/officeDocument/2006/relationships" xmlns:w14="http://schemas.microsoft.com/office/word/2010/wordml" xmlns:wp="http://schemas.openxmlformats.org/drawingml/2006/wordprocessingDrawing" xmlns:a="http://schemas.openxmlformats.org/drawingml/2006/main" xmlns:pic="http://schemas.openxmlformats.org/drawingml/2006/picture">
       <w:tblPr>
         <w:tblLayout w:type="fixed"/>
         <w:jc w:val="center"/>
-        <w:tblLook w:firstRow="1" w:lastRow="0" w:firstColumn="0" w:lastColumn="0" w:noHBand="0" w:noVBand="1"/>
+        <w:tblLook w:firstRow="1" w:lastRow="0" w:firstColumn="0" w:lastColumn="0" w:noHBand="0" w:noVBand="1" w:val="0020"/>
       </w:tblPr>
       <w:tblGrid>
-        <w:gridCol w:w="4320"/>
-        <w:gridCol w:w="7200"/>
+        <w:gridCol w:w="4032"/>
+        <w:gridCol w:w="5328"/>
       </w:tblGrid>
+      <w:tr>
+        <w:trPr>
+          <w:trHeight w:val="360" w:hRule="auto"/>
+          <w:tblHeader/>
+        </w:trPr>
+        <w:tc>
+          <w:tcPr>
+            <w:tcBorders>
+              <w:bottom w:val="single" w:sz="16" w:space="0" w:color="000000"/>
+              <w:top w:val="single" w:sz="16" w:space="0" w:color="000000"/>
+              <w:left w:val="single" w:sz="16" w:space="0" w:color="000000"/>
+              <w:right w:val="single" w:sz="8" w:space="0" w:color="000000"/>
+            </w:tcBorders>
+            <w:shd w:val="clear" w:color="auto" w:fill="1F1F1F"/>
+            <w:tcMar>
+              <w:top w:w="0" w:type="dxa"/>
+              <w:bottom w:w="0" w:type="dxa"/>
+              <w:left w:w="0" w:type="dxa"/>
+              <w:right w:w="0" w:type="dxa"/>
+            </w:tcMar>
+            <w:vAlign w:val="top"/>
+          </w:tcPr>
+          <w:p>
+            <w:pPr>
+              <w:jc w:val="left"/>
+              <w:pBdr>
+                <w:bottom w:val="none" w:sz="0" w:space="0" w:color="000000"/>
+                <w:top w:val="none" w:sz="0" w:space="0" w:color="000000"/>
+                <w:left w:val="none" w:sz="0" w:space="0" w:color="000000"/>
+                <w:right w:val="none" w:sz="0" w:space="0" w:color="000000"/>
+              </w:pBdr>
+              <w:spacing w:after="100" w:before="100" w:line="240"/>
+              <w:ind w:left="100" w:right="100" w:firstLine="0" w:firstLineChars="0"/>
+              <w:rPr>
+                <w:rFonts w:ascii="Arial" w:hAnsi="Arial" w:eastAsia="Arial" w:cs="Arial"/>
+                <w:i w:val="false"/>
+                <w:b w:val="true"/>
+                <w:u w:val="none"/>
+                <w:strike w:val="false"/>
+                <w:sz w:val="22"/>
+                <w:szCs w:val="22"/>
+                <w:color w:val="FFFFFF"/>
+              </w:rPr>
+            </w:pPr>
+            <w:r xmlns:w="http://schemas.openxmlformats.org/wordprocessingml/2006/main" xmlns:wp="http://schemas.openxmlformats.org/drawingml/2006/wordprocessingDrawing" xmlns:r="http://schemas.openxmlformats.org/officeDocument/2006/relationships" xmlns:w14="http://schemas.microsoft.com/office/word/2010/wordml">
+              <w:rPr>
+                <w:rFonts w:ascii="Arial" w:hAnsi="Arial" w:eastAsia="Arial" w:cs="Arial"/>
+                <w:i w:val="false"/>
+                <w:b w:val="true"/>
+                <w:u w:val="none"/>
+                <w:strike w:val="false"/>
+                <w:sz w:val="22"/>
+                <w:szCs w:val="22"/>
+                <w:color w:val="FFFFFF"/>
+              </w:rPr>
+              <w:t xml:space="preserve">Step 1 Core variable</w:t>
+            </w:r>
+          </w:p>
+        </w:tc>
+        <w:tc>
+          <w:tcPr>
+            <w:tcBorders>
+              <w:bottom w:val="single" w:sz="16" w:space="0" w:color="000000"/>
+              <w:top w:val="single" w:sz="16" w:space="0" w:color="000000"/>
+              <w:left w:val="single" w:sz="8" w:space="0" w:color="000000"/>
+              <w:right w:val="single" w:sz="16" w:space="0" w:color="000000"/>
+            </w:tcBorders>
+            <w:shd w:val="clear" w:color="auto" w:fill="1F1F1F"/>
+            <w:tcMar>
+              <w:top w:w="0" w:type="dxa"/>
+              <w:bottom w:w="0" w:type="dxa"/>
+              <w:left w:w="0" w:type="dxa"/>
+              <w:right w:w="0" w:type="dxa"/>
+            </w:tcMar>
+            <w:vAlign w:val="top"/>
+          </w:tcPr>
+          <w:p>
+            <w:pPr>
+              <w:jc w:val="left"/>
+              <w:pBdr>
+                <w:bottom w:val="none" w:sz="0" w:space="0" w:color="000000"/>
+                <w:top w:val="none" w:sz="0" w:space="0" w:color="000000"/>
+                <w:left w:val="none" w:sz="0" w:space="0" w:color="000000"/>
+                <w:right w:val="none" w:sz="0" w:space="0" w:color="000000"/>
+              </w:pBdr>
+              <w:spacing w:after="100" w:before="100" w:line="240"/>
+              <w:ind w:left="100" w:right="100" w:firstLine="0" w:firstLineChars="0"/>
+              <w:rPr>
+                <w:rFonts w:ascii="Arial" w:hAnsi="Arial" w:eastAsia="Arial" w:cs="Arial"/>
+                <w:i w:val="false"/>
+                <w:b w:val="true"/>
+                <w:u w:val="none"/>
+                <w:strike w:val="false"/>
+                <w:sz w:val="22"/>
+                <w:szCs w:val="22"/>
+                <w:color w:val="FFFFFF"/>
+              </w:rPr>
+            </w:pPr>
+            <w:r xmlns:w="http://schemas.openxmlformats.org/wordprocessingml/2006/main" xmlns:wp="http://schemas.openxmlformats.org/drawingml/2006/wordprocessingDrawing" xmlns:r="http://schemas.openxmlformats.org/officeDocument/2006/relationships" xmlns:w14="http://schemas.microsoft.com/office/word/2010/wordml">
+              <w:rPr>
+                <w:rFonts w:ascii="Arial" w:hAnsi="Arial" w:eastAsia="Arial" w:cs="Arial"/>
+                <w:i w:val="false"/>
+                <w:b w:val="true"/>
+                <w:u w:val="none"/>
+                <w:strike w:val="false"/>
+                <w:sz w:val="22"/>
+                <w:szCs w:val="22"/>
+                <w:color w:val="FFFFFF"/>
+              </w:rPr>
+              <w:t xml:space="preserve">Step 2 Three references</w:t>
+            </w:r>
+          </w:p>
+        </w:tc>
+      </w:tr>
       <w:tr>
         <w:trPr>
           <w:trHeight w:val="360" w:hRule="auto"/>
@@ -61,7 +212,7 @@
               <w:spacing w:after="240" w:before="240" w:line="240"/>
               <w:ind w:left="240" w:right="240" w:firstLine="0" w:firstLineChars="0"/>
               <w:rPr>
-                <w:rFonts w:ascii="Helvetica" w:hAnsi="Helvetica" w:eastAsia="Helvetica" w:cs="Helvetica"/>
+                <w:rFonts w:ascii="Arial" w:hAnsi="Arial" w:eastAsia="Arial" w:cs="Arial"/>
                 <w:i w:val="false"/>
                 <w:b w:val="false"/>
                 <w:u w:val="none"/>
@@ -75,45 +226,6 @@
               <w:rPr>
                 <w:rFonts w:ascii="Arial" w:hAnsi="Arial" w:eastAsia="Arial" w:cs="Arial"/>
                 <w:i w:val="false"/>
-                <w:b w:val="true"/>
-                <w:u w:val="none"/>
-                <w:strike w:val="false"/>
-                <w:sz w:val="20"/>
-                <w:szCs w:val="20"/>
-                <w:color w:val="000000"/>
-              </w:rPr>
-              <w:t xml:space="preserve">Step #1 – Pick one of the following as your "Core variable"</w:t>
-            </w:r>
-            <w:r xmlns:w="http://schemas.openxmlformats.org/wordprocessingml/2006/main" xmlns:wp="http://schemas.openxmlformats.org/drawingml/2006/wordprocessingDrawing" xmlns:r="http://schemas.openxmlformats.org/officeDocument/2006/relationships" xmlns:w14="http://schemas.microsoft.com/office/word/2010/wordml">
-              <w:rPr>
-                <w:rFonts w:ascii="Arial" w:hAnsi="Arial" w:eastAsia="Arial" w:cs="Arial"/>
-                <w:i w:val="false"/>
-                <w:b w:val="true"/>
-                <w:u w:val="none"/>
-                <w:strike w:val="false"/>
-                <w:sz w:val="20"/>
-                <w:szCs w:val="20"/>
-                <w:color w:val="000000"/>
-              </w:rPr>
-              <w:br/>
-            </w:r>
-            <w:r xmlns:w="http://schemas.openxmlformats.org/wordprocessingml/2006/main" xmlns:wp="http://schemas.openxmlformats.org/drawingml/2006/wordprocessingDrawing" xmlns:r="http://schemas.openxmlformats.org/officeDocument/2006/relationships" xmlns:w14="http://schemas.microsoft.com/office/word/2010/wordml">
-              <w:rPr>
-                <w:rFonts w:ascii="Arial" w:hAnsi="Arial" w:eastAsia="Arial" w:cs="Arial"/>
-                <w:i w:val="false"/>
-                <w:b w:val="true"/>
-                <w:u w:val="none"/>
-                <w:strike w:val="false"/>
-                <w:sz w:val="20"/>
-                <w:szCs w:val="20"/>
-                <w:color w:val="000000"/>
-              </w:rPr>
-              <w:br/>
-            </w:r>
-            <w:r xmlns:w="http://schemas.openxmlformats.org/wordprocessingml/2006/main" xmlns:wp="http://schemas.openxmlformats.org/drawingml/2006/wordprocessingDrawing" xmlns:r="http://schemas.openxmlformats.org/officeDocument/2006/relationships" xmlns:w14="http://schemas.microsoft.com/office/word/2010/wordml">
-              <w:rPr>
-                <w:rFonts w:ascii="Arial" w:hAnsi="Arial" w:eastAsia="Arial" w:cs="Arial"/>
-                <w:i w:val="false"/>
                 <w:b w:val="false"/>
                 <w:u w:val="none"/>
                 <w:strike w:val="false"/>
@@ -190,7 +302,7 @@
             </w:r>
             <w:r xmlns:w="http://schemas.openxmlformats.org/wordprocessingml/2006/main" xmlns:wp="http://schemas.openxmlformats.org/drawingml/2006/wordprocessingDrawing" xmlns:r="http://schemas.openxmlformats.org/officeDocument/2006/relationships" xmlns:w14="http://schemas.microsoft.com/office/word/2010/wordml">
               <w:rPr>
-                <w:rFonts w:ascii="Helvetica" w:hAnsi="Helvetica" w:eastAsia="Helvetica" w:cs="Helvetica"/>
+                <w:rFonts w:ascii="Arial" w:hAnsi="Arial" w:eastAsia="Arial" w:cs="Arial"/>
                 <w:i w:val="false"/>
                 <w:b w:val="false"/>
                 <w:u w:val="none"/>
@@ -203,7 +315,7 @@
             </w:r>
             <w:r xmlns:w="http://schemas.openxmlformats.org/wordprocessingml/2006/main" xmlns:wp="http://schemas.openxmlformats.org/drawingml/2006/wordprocessingDrawing" xmlns:r="http://schemas.openxmlformats.org/officeDocument/2006/relationships" xmlns:w14="http://schemas.microsoft.com/office/word/2010/wordml">
               <w:rPr>
-                <w:rFonts w:ascii="Helvetica" w:hAnsi="Helvetica" w:eastAsia="Helvetica" w:cs="Helvetica"/>
+                <w:rFonts w:ascii="Arial" w:hAnsi="Arial" w:eastAsia="Arial" w:cs="Arial"/>
                 <w:i w:val="false"/>
                 <w:b w:val="false"/>
                 <w:u w:val="none"/>
@@ -216,7 +328,7 @@
             </w:r>
             <w:r xmlns:w="http://schemas.openxmlformats.org/wordprocessingml/2006/main" xmlns:wp="http://schemas.openxmlformats.org/drawingml/2006/wordprocessingDrawing" xmlns:r="http://schemas.openxmlformats.org/officeDocument/2006/relationships" xmlns:w14="http://schemas.microsoft.com/office/word/2010/wordml">
               <w:rPr>
-                <w:rFonts w:ascii="Helvetica" w:hAnsi="Helvetica" w:eastAsia="Helvetica" w:cs="Helvetica"/>
+                <w:rFonts w:ascii="Arial" w:hAnsi="Arial" w:eastAsia="Arial" w:cs="Arial"/>
                 <w:i w:val="false"/>
                 <w:b w:val="false"/>
                 <w:u w:val="none"/>
@@ -229,7 +341,7 @@
             </w:r>
             <w:r xmlns:w="http://schemas.openxmlformats.org/wordprocessingml/2006/main" xmlns:wp="http://schemas.openxmlformats.org/drawingml/2006/wordprocessingDrawing" xmlns:r="http://schemas.openxmlformats.org/officeDocument/2006/relationships" xmlns:w14="http://schemas.microsoft.com/office/word/2010/wordml">
               <w:rPr>
-                <w:rFonts w:ascii="Helvetica" w:hAnsi="Helvetica" w:eastAsia="Helvetica" w:cs="Helvetica"/>
+                <w:rFonts w:ascii="Arial" w:hAnsi="Arial" w:eastAsia="Arial" w:cs="Arial"/>
                 <w:i w:val="false"/>
                 <w:b w:val="false"/>
                 <w:u w:val="none"/>
@@ -242,7 +354,7 @@
             </w:r>
             <w:r xmlns:w="http://schemas.openxmlformats.org/wordprocessingml/2006/main" xmlns:wp="http://schemas.openxmlformats.org/drawingml/2006/wordprocessingDrawing" xmlns:r="http://schemas.openxmlformats.org/officeDocument/2006/relationships" xmlns:w14="http://schemas.microsoft.com/office/word/2010/wordml">
               <w:rPr>
-                <w:rFonts w:ascii="Helvetica" w:hAnsi="Helvetica" w:eastAsia="Helvetica" w:cs="Helvetica"/>
+                <w:rFonts w:ascii="Arial" w:hAnsi="Arial" w:eastAsia="Arial" w:cs="Arial"/>
                 <w:i w:val="false"/>
                 <w:b w:val="false"/>
                 <w:u w:val="none"/>
@@ -255,7 +367,7 @@
             </w:r>
             <w:r xmlns:w="http://schemas.openxmlformats.org/wordprocessingml/2006/main" xmlns:wp="http://schemas.openxmlformats.org/drawingml/2006/wordprocessingDrawing" xmlns:r="http://schemas.openxmlformats.org/officeDocument/2006/relationships" xmlns:w14="http://schemas.microsoft.com/office/word/2010/wordml">
               <w:rPr>
-                <w:rFonts w:ascii="Helvetica" w:hAnsi="Helvetica" w:eastAsia="Helvetica" w:cs="Helvetica"/>
+                <w:rFonts w:ascii="Arial" w:hAnsi="Arial" w:eastAsia="Arial" w:cs="Arial"/>
                 <w:i w:val="false"/>
                 <w:b w:val="false"/>
                 <w:u w:val="none"/>
@@ -268,7 +380,7 @@
             </w:r>
             <w:r xmlns:w="http://schemas.openxmlformats.org/wordprocessingml/2006/main" xmlns:wp="http://schemas.openxmlformats.org/drawingml/2006/wordprocessingDrawing" xmlns:r="http://schemas.openxmlformats.org/officeDocument/2006/relationships" xmlns:w14="http://schemas.microsoft.com/office/word/2010/wordml">
               <w:rPr>
-                <w:rFonts w:ascii="Helvetica" w:hAnsi="Helvetica" w:eastAsia="Helvetica" w:cs="Helvetica"/>
+                <w:rFonts w:ascii="Arial" w:hAnsi="Arial" w:eastAsia="Arial" w:cs="Arial"/>
                 <w:i w:val="false"/>
                 <w:b w:val="false"/>
                 <w:u w:val="none"/>
@@ -281,7 +393,7 @@
             </w:r>
             <w:r xmlns:w="http://schemas.openxmlformats.org/wordprocessingml/2006/main" xmlns:wp="http://schemas.openxmlformats.org/drawingml/2006/wordprocessingDrawing" xmlns:r="http://schemas.openxmlformats.org/officeDocument/2006/relationships" xmlns:w14="http://schemas.microsoft.com/office/word/2010/wordml">
               <w:rPr>
-                <w:rFonts w:ascii="Helvetica" w:hAnsi="Helvetica" w:eastAsia="Helvetica" w:cs="Helvetica"/>
+                <w:rFonts w:ascii="Arial" w:hAnsi="Arial" w:eastAsia="Arial" w:cs="Arial"/>
                 <w:i w:val="false"/>
                 <w:b w:val="false"/>
                 <w:u w:val="none"/>
@@ -294,7 +406,7 @@
             </w:r>
             <w:r xmlns:w="http://schemas.openxmlformats.org/wordprocessingml/2006/main" xmlns:wp="http://schemas.openxmlformats.org/drawingml/2006/wordprocessingDrawing" xmlns:r="http://schemas.openxmlformats.org/officeDocument/2006/relationships" xmlns:w14="http://schemas.microsoft.com/office/word/2010/wordml">
               <w:rPr>
-                <w:rFonts w:ascii="Helvetica" w:hAnsi="Helvetica" w:eastAsia="Helvetica" w:cs="Helvetica"/>
+                <w:rFonts w:ascii="Arial" w:hAnsi="Arial" w:eastAsia="Arial" w:cs="Arial"/>
                 <w:i w:val="false"/>
                 <w:b w:val="false"/>
                 <w:u w:val="none"/>
@@ -307,7 +419,7 @@
             </w:r>
             <w:r xmlns:w="http://schemas.openxmlformats.org/wordprocessingml/2006/main" xmlns:wp="http://schemas.openxmlformats.org/drawingml/2006/wordprocessingDrawing" xmlns:r="http://schemas.openxmlformats.org/officeDocument/2006/relationships" xmlns:w14="http://schemas.microsoft.com/office/word/2010/wordml">
               <w:rPr>
-                <w:rFonts w:ascii="Helvetica" w:hAnsi="Helvetica" w:eastAsia="Helvetica" w:cs="Helvetica"/>
+                <w:rFonts w:ascii="Arial" w:hAnsi="Arial" w:eastAsia="Arial" w:cs="Arial"/>
                 <w:i w:val="false"/>
                 <w:b w:val="false"/>
                 <w:u w:val="none"/>
@@ -320,7 +432,7 @@
             </w:r>
             <w:r xmlns:w="http://schemas.openxmlformats.org/wordprocessingml/2006/main" xmlns:wp="http://schemas.openxmlformats.org/drawingml/2006/wordprocessingDrawing" xmlns:r="http://schemas.openxmlformats.org/officeDocument/2006/relationships" xmlns:w14="http://schemas.microsoft.com/office/word/2010/wordml">
               <w:rPr>
-                <w:rFonts w:ascii="Helvetica" w:hAnsi="Helvetica" w:eastAsia="Helvetica" w:cs="Helvetica"/>
+                <w:rFonts w:ascii="Arial" w:hAnsi="Arial" w:eastAsia="Arial" w:cs="Arial"/>
                 <w:i w:val="false"/>
                 <w:b w:val="false"/>
                 <w:u w:val="none"/>
@@ -333,7 +445,7 @@
             </w:r>
             <w:r xmlns:w="http://schemas.openxmlformats.org/wordprocessingml/2006/main" xmlns:wp="http://schemas.openxmlformats.org/drawingml/2006/wordprocessingDrawing" xmlns:r="http://schemas.openxmlformats.org/officeDocument/2006/relationships" xmlns:w14="http://schemas.microsoft.com/office/word/2010/wordml">
               <w:rPr>
-                <w:rFonts w:ascii="Helvetica" w:hAnsi="Helvetica" w:eastAsia="Helvetica" w:cs="Helvetica"/>
+                <w:rFonts w:ascii="Arial" w:hAnsi="Arial" w:eastAsia="Arial" w:cs="Arial"/>
                 <w:i w:val="false"/>
                 <w:b w:val="false"/>
                 <w:u w:val="none"/>
@@ -346,7 +458,7 @@
             </w:r>
             <w:r xmlns:w="http://schemas.openxmlformats.org/wordprocessingml/2006/main" xmlns:wp="http://schemas.openxmlformats.org/drawingml/2006/wordprocessingDrawing" xmlns:r="http://schemas.openxmlformats.org/officeDocument/2006/relationships" xmlns:w14="http://schemas.microsoft.com/office/word/2010/wordml">
               <w:rPr>
-                <w:rFonts w:ascii="Helvetica" w:hAnsi="Helvetica" w:eastAsia="Helvetica" w:cs="Helvetica"/>
+                <w:rFonts w:ascii="Arial" w:hAnsi="Arial" w:eastAsia="Arial" w:cs="Arial"/>
                 <w:i w:val="false"/>
                 <w:b w:val="false"/>
                 <w:u w:val="none"/>
@@ -359,7 +471,7 @@
             </w:r>
             <w:r xmlns:w="http://schemas.openxmlformats.org/wordprocessingml/2006/main" xmlns:wp="http://schemas.openxmlformats.org/drawingml/2006/wordprocessingDrawing" xmlns:r="http://schemas.openxmlformats.org/officeDocument/2006/relationships" xmlns:w14="http://schemas.microsoft.com/office/word/2010/wordml">
               <w:rPr>
-                <w:rFonts w:ascii="Helvetica" w:hAnsi="Helvetica" w:eastAsia="Helvetica" w:cs="Helvetica"/>
+                <w:rFonts w:ascii="Arial" w:hAnsi="Arial" w:eastAsia="Arial" w:cs="Arial"/>
                 <w:i w:val="false"/>
                 <w:b w:val="false"/>
                 <w:u w:val="none"/>
@@ -372,7 +484,7 @@
             </w:r>
             <w:r xmlns:w="http://schemas.openxmlformats.org/wordprocessingml/2006/main" xmlns:wp="http://schemas.openxmlformats.org/drawingml/2006/wordprocessingDrawing" xmlns:r="http://schemas.openxmlformats.org/officeDocument/2006/relationships" xmlns:w14="http://schemas.microsoft.com/office/word/2010/wordml">
               <w:rPr>
-                <w:rFonts w:ascii="Helvetica" w:hAnsi="Helvetica" w:eastAsia="Helvetica" w:cs="Helvetica"/>
+                <w:rFonts w:ascii="Arial" w:hAnsi="Arial" w:eastAsia="Arial" w:cs="Arial"/>
                 <w:i w:val="false"/>
                 <w:b w:val="false"/>
                 <w:u w:val="none"/>
@@ -385,7 +497,7 @@
             </w:r>
             <w:r xmlns:w="http://schemas.openxmlformats.org/wordprocessingml/2006/main" xmlns:wp="http://schemas.openxmlformats.org/drawingml/2006/wordprocessingDrawing" xmlns:r="http://schemas.openxmlformats.org/officeDocument/2006/relationships" xmlns:w14="http://schemas.microsoft.com/office/word/2010/wordml">
               <w:rPr>
-                <w:rFonts w:ascii="Helvetica" w:hAnsi="Helvetica" w:eastAsia="Helvetica" w:cs="Helvetica"/>
+                <w:rFonts w:ascii="Arial" w:hAnsi="Arial" w:eastAsia="Arial" w:cs="Arial"/>
                 <w:i w:val="false"/>
                 <w:b w:val="false"/>
                 <w:u w:val="none"/>
@@ -398,7 +510,7 @@
             </w:r>
             <w:r xmlns:w="http://schemas.openxmlformats.org/wordprocessingml/2006/main" xmlns:wp="http://schemas.openxmlformats.org/drawingml/2006/wordprocessingDrawing" xmlns:r="http://schemas.openxmlformats.org/officeDocument/2006/relationships" xmlns:w14="http://schemas.microsoft.com/office/word/2010/wordml">
               <w:rPr>
-                <w:rFonts w:ascii="Helvetica" w:hAnsi="Helvetica" w:eastAsia="Helvetica" w:cs="Helvetica"/>
+                <w:rFonts w:ascii="Arial" w:hAnsi="Arial" w:eastAsia="Arial" w:cs="Arial"/>
                 <w:i w:val="false"/>
                 <w:b w:val="false"/>
                 <w:u w:val="none"/>
@@ -411,7 +523,7 @@
             </w:r>
             <w:r xmlns:w="http://schemas.openxmlformats.org/wordprocessingml/2006/main" xmlns:wp="http://schemas.openxmlformats.org/drawingml/2006/wordprocessingDrawing" xmlns:r="http://schemas.openxmlformats.org/officeDocument/2006/relationships" xmlns:w14="http://schemas.microsoft.com/office/word/2010/wordml">
               <w:rPr>
-                <w:rFonts w:ascii="Helvetica" w:hAnsi="Helvetica" w:eastAsia="Helvetica" w:cs="Helvetica"/>
+                <w:rFonts w:ascii="Arial" w:hAnsi="Arial" w:eastAsia="Arial" w:cs="Arial"/>
                 <w:i w:val="false"/>
                 <w:b w:val="false"/>
                 <w:u w:val="none"/>
@@ -424,7 +536,7 @@
             </w:r>
             <w:r xmlns:w="http://schemas.openxmlformats.org/wordprocessingml/2006/main" xmlns:wp="http://schemas.openxmlformats.org/drawingml/2006/wordprocessingDrawing" xmlns:r="http://schemas.openxmlformats.org/officeDocument/2006/relationships" xmlns:w14="http://schemas.microsoft.com/office/word/2010/wordml">
               <w:rPr>
-                <w:rFonts w:ascii="Helvetica" w:hAnsi="Helvetica" w:eastAsia="Helvetica" w:cs="Helvetica"/>
+                <w:rFonts w:ascii="Arial" w:hAnsi="Arial" w:eastAsia="Arial" w:cs="Arial"/>
                 <w:i w:val="false"/>
                 <w:b w:val="false"/>
                 <w:u w:val="none"/>
@@ -437,7 +549,7 @@
             </w:r>
             <w:r xmlns:w="http://schemas.openxmlformats.org/wordprocessingml/2006/main" xmlns:wp="http://schemas.openxmlformats.org/drawingml/2006/wordprocessingDrawing" xmlns:r="http://schemas.openxmlformats.org/officeDocument/2006/relationships" xmlns:w14="http://schemas.microsoft.com/office/word/2010/wordml">
               <w:rPr>
-                <w:rFonts w:ascii="Helvetica" w:hAnsi="Helvetica" w:eastAsia="Helvetica" w:cs="Helvetica"/>
+                <w:rFonts w:ascii="Arial" w:hAnsi="Arial" w:eastAsia="Arial" w:cs="Arial"/>
                 <w:i w:val="false"/>
                 <w:b w:val="false"/>
                 <w:u w:val="none"/>
@@ -450,7 +562,7 @@
             </w:r>
             <w:r xmlns:w="http://schemas.openxmlformats.org/wordprocessingml/2006/main" xmlns:wp="http://schemas.openxmlformats.org/drawingml/2006/wordprocessingDrawing" xmlns:r="http://schemas.openxmlformats.org/officeDocument/2006/relationships" xmlns:w14="http://schemas.microsoft.com/office/word/2010/wordml">
               <w:rPr>
-                <w:rFonts w:ascii="Helvetica" w:hAnsi="Helvetica" w:eastAsia="Helvetica" w:cs="Helvetica"/>
+                <w:rFonts w:ascii="Arial" w:hAnsi="Arial" w:eastAsia="Arial" w:cs="Arial"/>
                 <w:i w:val="false"/>
                 <w:b w:val="false"/>
                 <w:u w:val="none"/>
@@ -463,7 +575,7 @@
             </w:r>
             <w:r xmlns:w="http://schemas.openxmlformats.org/wordprocessingml/2006/main" xmlns:wp="http://schemas.openxmlformats.org/drawingml/2006/wordprocessingDrawing" xmlns:r="http://schemas.openxmlformats.org/officeDocument/2006/relationships" xmlns:w14="http://schemas.microsoft.com/office/word/2010/wordml">
               <w:rPr>
-                <w:rFonts w:ascii="Helvetica" w:hAnsi="Helvetica" w:eastAsia="Helvetica" w:cs="Helvetica"/>
+                <w:rFonts w:ascii="Arial" w:hAnsi="Arial" w:eastAsia="Arial" w:cs="Arial"/>
                 <w:i w:val="false"/>
                 <w:b w:val="false"/>
                 <w:u w:val="none"/>
@@ -476,7 +588,7 @@
             </w:r>
             <w:r xmlns:w="http://schemas.openxmlformats.org/wordprocessingml/2006/main" xmlns:wp="http://schemas.openxmlformats.org/drawingml/2006/wordprocessingDrawing" xmlns:r="http://schemas.openxmlformats.org/officeDocument/2006/relationships" xmlns:w14="http://schemas.microsoft.com/office/word/2010/wordml">
               <w:rPr>
-                <w:rFonts w:ascii="Helvetica" w:hAnsi="Helvetica" w:eastAsia="Helvetica" w:cs="Helvetica"/>
+                <w:rFonts w:ascii="Arial" w:hAnsi="Arial" w:eastAsia="Arial" w:cs="Arial"/>
                 <w:i w:val="false"/>
                 <w:b w:val="false"/>
                 <w:u w:val="none"/>
@@ -489,7 +601,7 @@
             </w:r>
             <w:r xmlns:w="http://schemas.openxmlformats.org/wordprocessingml/2006/main" xmlns:wp="http://schemas.openxmlformats.org/drawingml/2006/wordprocessingDrawing" xmlns:r="http://schemas.openxmlformats.org/officeDocument/2006/relationships" xmlns:w14="http://schemas.microsoft.com/office/word/2010/wordml">
               <w:rPr>
-                <w:rFonts w:ascii="Helvetica" w:hAnsi="Helvetica" w:eastAsia="Helvetica" w:cs="Helvetica"/>
+                <w:rFonts w:ascii="Arial" w:hAnsi="Arial" w:eastAsia="Arial" w:cs="Arial"/>
                 <w:i w:val="false"/>
                 <w:b w:val="false"/>
                 <w:u w:val="none"/>
@@ -502,7 +614,7 @@
             </w:r>
             <w:r xmlns:w="http://schemas.openxmlformats.org/wordprocessingml/2006/main" xmlns:wp="http://schemas.openxmlformats.org/drawingml/2006/wordprocessingDrawing" xmlns:r="http://schemas.openxmlformats.org/officeDocument/2006/relationships" xmlns:w14="http://schemas.microsoft.com/office/word/2010/wordml">
               <w:rPr>
-                <w:rFonts w:ascii="Helvetica" w:hAnsi="Helvetica" w:eastAsia="Helvetica" w:cs="Helvetica"/>
+                <w:rFonts w:ascii="Arial" w:hAnsi="Arial" w:eastAsia="Arial" w:cs="Arial"/>
                 <w:i w:val="false"/>
                 <w:b w:val="false"/>
                 <w:u w:val="none"/>
@@ -515,7 +627,7 @@
             </w:r>
             <w:r xmlns:w="http://schemas.openxmlformats.org/wordprocessingml/2006/main" xmlns:wp="http://schemas.openxmlformats.org/drawingml/2006/wordprocessingDrawing" xmlns:r="http://schemas.openxmlformats.org/officeDocument/2006/relationships" xmlns:w14="http://schemas.microsoft.com/office/word/2010/wordml">
               <w:rPr>
-                <w:rFonts w:ascii="Helvetica" w:hAnsi="Helvetica" w:eastAsia="Helvetica" w:cs="Helvetica"/>
+                <w:rFonts w:ascii="Arial" w:hAnsi="Arial" w:eastAsia="Arial" w:cs="Arial"/>
                 <w:i w:val="false"/>
                 <w:b w:val="false"/>
                 <w:u w:val="none"/>
@@ -528,7 +640,7 @@
             </w:r>
             <w:r xmlns:w="http://schemas.openxmlformats.org/wordprocessingml/2006/main" xmlns:wp="http://schemas.openxmlformats.org/drawingml/2006/wordprocessingDrawing" xmlns:r="http://schemas.openxmlformats.org/officeDocument/2006/relationships" xmlns:w14="http://schemas.microsoft.com/office/word/2010/wordml">
               <w:rPr>
-                <w:rFonts w:ascii="Helvetica" w:hAnsi="Helvetica" w:eastAsia="Helvetica" w:cs="Helvetica"/>
+                <w:rFonts w:ascii="Arial" w:hAnsi="Arial" w:eastAsia="Arial" w:cs="Arial"/>
                 <w:i w:val="false"/>
                 <w:b w:val="false"/>
                 <w:u w:val="none"/>
@@ -570,7 +682,7 @@
               <w:spacing w:after="240" w:before="240" w:line="240"/>
               <w:ind w:left="240" w:right="240" w:firstLine="0" w:firstLineChars="0"/>
               <w:rPr>
-                <w:rFonts w:ascii="Helvetica" w:hAnsi="Helvetica" w:eastAsia="Helvetica" w:cs="Helvetica"/>
+                <w:rFonts w:ascii="Arial" w:hAnsi="Arial" w:eastAsia="Arial" w:cs="Arial"/>
                 <w:i w:val="false"/>
                 <w:b w:val="false"/>
                 <w:u w:val="none"/>
@@ -584,45 +696,6 @@
               <w:rPr>
                 <w:rFonts w:ascii="Arial" w:hAnsi="Arial" w:eastAsia="Arial" w:cs="Arial"/>
                 <w:i w:val="false"/>
-                <w:b w:val="true"/>
-                <w:u w:val="none"/>
-                <w:strike w:val="false"/>
-                <w:sz w:val="20"/>
-                <w:szCs w:val="20"/>
-                <w:color w:val="000000"/>
-              </w:rPr>
-              <w:t xml:space="preserve">Step #2 – Find three references:</w:t>
-            </w:r>
-            <w:r xmlns:w="http://schemas.openxmlformats.org/wordprocessingml/2006/main" xmlns:wp="http://schemas.openxmlformats.org/drawingml/2006/wordprocessingDrawing" xmlns:r="http://schemas.openxmlformats.org/officeDocument/2006/relationships" xmlns:w14="http://schemas.microsoft.com/office/word/2010/wordml">
-              <w:rPr>
-                <w:rFonts w:ascii="Arial" w:hAnsi="Arial" w:eastAsia="Arial" w:cs="Arial"/>
-                <w:i w:val="false"/>
-                <w:b w:val="true"/>
-                <w:u w:val="none"/>
-                <w:strike w:val="false"/>
-                <w:sz w:val="20"/>
-                <w:szCs w:val="20"/>
-                <w:color w:val="000000"/>
-              </w:rPr>
-              <w:br/>
-            </w:r>
-            <w:r xmlns:w="http://schemas.openxmlformats.org/wordprocessingml/2006/main" xmlns:wp="http://schemas.openxmlformats.org/drawingml/2006/wordprocessingDrawing" xmlns:r="http://schemas.openxmlformats.org/officeDocument/2006/relationships" xmlns:w14="http://schemas.microsoft.com/office/word/2010/wordml">
-              <w:rPr>
-                <w:rFonts w:ascii="Arial" w:hAnsi="Arial" w:eastAsia="Arial" w:cs="Arial"/>
-                <w:i w:val="false"/>
-                <w:b w:val="true"/>
-                <w:u w:val="none"/>
-                <w:strike w:val="false"/>
-                <w:sz w:val="20"/>
-                <w:szCs w:val="20"/>
-                <w:color w:val="000000"/>
-              </w:rPr>
-              <w:br/>
-            </w:r>
-            <w:r xmlns:w="http://schemas.openxmlformats.org/wordprocessingml/2006/main" xmlns:wp="http://schemas.openxmlformats.org/drawingml/2006/wordprocessingDrawing" xmlns:r="http://schemas.openxmlformats.org/officeDocument/2006/relationships" xmlns:w14="http://schemas.microsoft.com/office/word/2010/wordml">
-              <w:rPr>
-                <w:rFonts w:ascii="Helvetica" w:hAnsi="Helvetica" w:eastAsia="Helvetica" w:cs="Helvetica"/>
-                <w:i w:val="false"/>
                 <w:b w:val="false"/>
                 <w:u w:val="none"/>
                 <w:strike w:val="false"/>
@@ -634,7 +707,7 @@
             </w:r>
             <w:r xmlns:w="http://schemas.openxmlformats.org/wordprocessingml/2006/main" xmlns:wp="http://schemas.openxmlformats.org/drawingml/2006/wordprocessingDrawing" xmlns:r="http://schemas.openxmlformats.org/officeDocument/2006/relationships" xmlns:w14="http://schemas.microsoft.com/office/word/2010/wordml">
               <w:rPr>
-                <w:rFonts w:ascii="Helvetica" w:hAnsi="Helvetica" w:eastAsia="Helvetica" w:cs="Helvetica"/>
+                <w:rFonts w:ascii="Arial" w:hAnsi="Arial" w:eastAsia="Arial" w:cs="Arial"/>
                 <w:i w:val="false"/>
                 <w:b w:val="false"/>
                 <w:u w:val="none"/>
@@ -647,7 +720,7 @@
             </w:r>
             <w:r xmlns:w="http://schemas.openxmlformats.org/wordprocessingml/2006/main" xmlns:wp="http://schemas.openxmlformats.org/drawingml/2006/wordprocessingDrawing" xmlns:r="http://schemas.openxmlformats.org/officeDocument/2006/relationships" xmlns:w14="http://schemas.microsoft.com/office/word/2010/wordml">
               <w:rPr>
-                <w:rFonts w:ascii="Helvetica" w:hAnsi="Helvetica" w:eastAsia="Helvetica" w:cs="Helvetica"/>
+                <w:rFonts w:ascii="Arial" w:hAnsi="Arial" w:eastAsia="Arial" w:cs="Arial"/>
                 <w:i w:val="false"/>
                 <w:b w:val="false"/>
                 <w:u w:val="none"/>
@@ -660,7 +733,7 @@
             </w:r>
             <w:r xmlns:w="http://schemas.openxmlformats.org/wordprocessingml/2006/main" xmlns:wp="http://schemas.openxmlformats.org/drawingml/2006/wordprocessingDrawing" xmlns:r="http://schemas.openxmlformats.org/officeDocument/2006/relationships" xmlns:w14="http://schemas.microsoft.com/office/word/2010/wordml">
               <w:rPr>
-                <w:rFonts w:ascii="Helvetica" w:hAnsi="Helvetica" w:eastAsia="Helvetica" w:cs="Helvetica"/>
+                <w:rFonts w:ascii="Arial" w:hAnsi="Arial" w:eastAsia="Arial" w:cs="Arial"/>
                 <w:i w:val="false"/>
                 <w:b w:val="false"/>
                 <w:u w:val="none"/>
@@ -673,7 +746,7 @@
             </w:r>
             <w:r xmlns:w="http://schemas.openxmlformats.org/wordprocessingml/2006/main" xmlns:wp="http://schemas.openxmlformats.org/drawingml/2006/wordprocessingDrawing" xmlns:r="http://schemas.openxmlformats.org/officeDocument/2006/relationships" xmlns:w14="http://schemas.microsoft.com/office/word/2010/wordml">
               <w:rPr>
-                <w:rFonts w:ascii="Helvetica" w:hAnsi="Helvetica" w:eastAsia="Helvetica" w:cs="Helvetica"/>
+                <w:rFonts w:ascii="Arial" w:hAnsi="Arial" w:eastAsia="Arial" w:cs="Arial"/>
                 <w:i w:val="false"/>
                 <w:b w:val="false"/>
                 <w:u w:val="none"/>
@@ -686,7 +759,7 @@
             </w:r>
             <w:r xmlns:w="http://schemas.openxmlformats.org/wordprocessingml/2006/main" xmlns:wp="http://schemas.openxmlformats.org/drawingml/2006/wordprocessingDrawing" xmlns:r="http://schemas.openxmlformats.org/officeDocument/2006/relationships" xmlns:w14="http://schemas.microsoft.com/office/word/2010/wordml">
               <w:rPr>
-                <w:rFonts w:ascii="Helvetica" w:hAnsi="Helvetica" w:eastAsia="Helvetica" w:cs="Helvetica"/>
+                <w:rFonts w:ascii="Arial" w:hAnsi="Arial" w:eastAsia="Arial" w:cs="Arial"/>
                 <w:i w:val="false"/>
                 <w:b w:val="false"/>
                 <w:u w:val="none"/>
@@ -699,7 +772,7 @@
             </w:r>
             <w:r xmlns:w="http://schemas.openxmlformats.org/wordprocessingml/2006/main" xmlns:wp="http://schemas.openxmlformats.org/drawingml/2006/wordprocessingDrawing" xmlns:r="http://schemas.openxmlformats.org/officeDocument/2006/relationships" xmlns:w14="http://schemas.microsoft.com/office/word/2010/wordml">
               <w:rPr>
-                <w:rFonts w:ascii="Helvetica" w:hAnsi="Helvetica" w:eastAsia="Helvetica" w:cs="Helvetica"/>
+                <w:rFonts w:ascii="Arial" w:hAnsi="Arial" w:eastAsia="Arial" w:cs="Arial"/>
                 <w:i w:val="false"/>
                 <w:b w:val="false"/>
                 <w:u w:val="none"/>
@@ -712,7 +785,7 @@
             </w:r>
             <w:r xmlns:w="http://schemas.openxmlformats.org/wordprocessingml/2006/main" xmlns:wp="http://schemas.openxmlformats.org/drawingml/2006/wordprocessingDrawing" xmlns:r="http://schemas.openxmlformats.org/officeDocument/2006/relationships" xmlns:w14="http://schemas.microsoft.com/office/word/2010/wordml">
               <w:rPr>
-                <w:rFonts w:ascii="Helvetica" w:hAnsi="Helvetica" w:eastAsia="Helvetica" w:cs="Helvetica"/>
+                <w:rFonts w:ascii="Arial" w:hAnsi="Arial" w:eastAsia="Arial" w:cs="Arial"/>
                 <w:i w:val="false"/>
                 <w:b w:val="false"/>
                 <w:u w:val="none"/>
@@ -725,7 +798,7 @@
             </w:r>
             <w:r xmlns:w="http://schemas.openxmlformats.org/wordprocessingml/2006/main" xmlns:wp="http://schemas.openxmlformats.org/drawingml/2006/wordprocessingDrawing" xmlns:r="http://schemas.openxmlformats.org/officeDocument/2006/relationships" xmlns:w14="http://schemas.microsoft.com/office/word/2010/wordml">
               <w:rPr>
-                <w:rFonts w:ascii="Helvetica" w:hAnsi="Helvetica" w:eastAsia="Helvetica" w:cs="Helvetica"/>
+                <w:rFonts w:ascii="Arial" w:hAnsi="Arial" w:eastAsia="Arial" w:cs="Arial"/>
                 <w:i w:val="false"/>
                 <w:b w:val="false"/>
                 <w:u w:val="none"/>
@@ -738,7 +811,7 @@
             </w:r>
             <w:r xmlns:w="http://schemas.openxmlformats.org/wordprocessingml/2006/main" xmlns:wp="http://schemas.openxmlformats.org/drawingml/2006/wordprocessingDrawing" xmlns:r="http://schemas.openxmlformats.org/officeDocument/2006/relationships" xmlns:w14="http://schemas.microsoft.com/office/word/2010/wordml">
               <w:rPr>
-                <w:rFonts w:ascii="Helvetica" w:hAnsi="Helvetica" w:eastAsia="Helvetica" w:cs="Helvetica"/>
+                <w:rFonts w:ascii="Arial" w:hAnsi="Arial" w:eastAsia="Arial" w:cs="Arial"/>
                 <w:i w:val="false"/>
                 <w:b w:val="false"/>
                 <w:u w:val="none"/>
@@ -751,7 +824,7 @@
             </w:r>
             <w:r xmlns:w="http://schemas.openxmlformats.org/wordprocessingml/2006/main" xmlns:wp="http://schemas.openxmlformats.org/drawingml/2006/wordprocessingDrawing" xmlns:r="http://schemas.openxmlformats.org/officeDocument/2006/relationships" xmlns:w14="http://schemas.microsoft.com/office/word/2010/wordml">
               <w:rPr>
-                <w:rFonts w:ascii="Helvetica" w:hAnsi="Helvetica" w:eastAsia="Helvetica" w:cs="Helvetica"/>
+                <w:rFonts w:ascii="Arial" w:hAnsi="Arial" w:eastAsia="Arial" w:cs="Arial"/>
                 <w:i w:val="false"/>
                 <w:b w:val="false"/>
                 <w:u w:val="none"/>
@@ -764,7 +837,7 @@
             </w:r>
             <w:r xmlns:w="http://schemas.openxmlformats.org/wordprocessingml/2006/main" xmlns:wp="http://schemas.openxmlformats.org/drawingml/2006/wordprocessingDrawing" xmlns:r="http://schemas.openxmlformats.org/officeDocument/2006/relationships" xmlns:w14="http://schemas.microsoft.com/office/word/2010/wordml">
               <w:rPr>
-                <w:rFonts w:ascii="Helvetica" w:hAnsi="Helvetica" w:eastAsia="Helvetica" w:cs="Helvetica"/>
+                <w:rFonts w:ascii="Arial" w:hAnsi="Arial" w:eastAsia="Arial" w:cs="Arial"/>
                 <w:i w:val="false"/>
                 <w:b w:val="false"/>
                 <w:u w:val="none"/>
@@ -777,7 +850,7 @@
             </w:r>
             <w:r xmlns:w="http://schemas.openxmlformats.org/wordprocessingml/2006/main" xmlns:wp="http://schemas.openxmlformats.org/drawingml/2006/wordprocessingDrawing" xmlns:r="http://schemas.openxmlformats.org/officeDocument/2006/relationships" xmlns:w14="http://schemas.microsoft.com/office/word/2010/wordml">
               <w:rPr>
-                <w:rFonts w:ascii="Helvetica" w:hAnsi="Helvetica" w:eastAsia="Helvetica" w:cs="Helvetica"/>
+                <w:rFonts w:ascii="Arial" w:hAnsi="Arial" w:eastAsia="Arial" w:cs="Arial"/>
                 <w:i w:val="false"/>
                 <w:b w:val="false"/>
                 <w:u w:val="none"/>
@@ -790,7 +863,7 @@
             </w:r>
             <w:r xmlns:w="http://schemas.openxmlformats.org/wordprocessingml/2006/main" xmlns:wp="http://schemas.openxmlformats.org/drawingml/2006/wordprocessingDrawing" xmlns:r="http://schemas.openxmlformats.org/officeDocument/2006/relationships" xmlns:w14="http://schemas.microsoft.com/office/word/2010/wordml">
               <w:rPr>
-                <w:rFonts w:ascii="Helvetica" w:hAnsi="Helvetica" w:eastAsia="Helvetica" w:cs="Helvetica"/>
+                <w:rFonts w:ascii="Arial" w:hAnsi="Arial" w:eastAsia="Arial" w:cs="Arial"/>
                 <w:i w:val="false"/>
                 <w:b w:val="false"/>
                 <w:u w:val="none"/>
@@ -803,7 +876,7 @@
             </w:r>
             <w:r xmlns:w="http://schemas.openxmlformats.org/wordprocessingml/2006/main" xmlns:wp="http://schemas.openxmlformats.org/drawingml/2006/wordprocessingDrawing" xmlns:r="http://schemas.openxmlformats.org/officeDocument/2006/relationships" xmlns:w14="http://schemas.microsoft.com/office/word/2010/wordml">
               <w:rPr>
-                <w:rFonts w:ascii="Helvetica" w:hAnsi="Helvetica" w:eastAsia="Helvetica" w:cs="Helvetica"/>
+                <w:rFonts w:ascii="Arial" w:hAnsi="Arial" w:eastAsia="Arial" w:cs="Arial"/>
                 <w:i w:val="false"/>
                 <w:b w:val="false"/>
                 <w:u w:val="none"/>
@@ -816,7 +889,7 @@
             </w:r>
             <w:r xmlns:w="http://schemas.openxmlformats.org/wordprocessingml/2006/main" xmlns:wp="http://schemas.openxmlformats.org/drawingml/2006/wordprocessingDrawing" xmlns:r="http://schemas.openxmlformats.org/officeDocument/2006/relationships" xmlns:w14="http://schemas.microsoft.com/office/word/2010/wordml">
               <w:rPr>
-                <w:rFonts w:ascii="Helvetica" w:hAnsi="Helvetica" w:eastAsia="Helvetica" w:cs="Helvetica"/>
+                <w:rFonts w:ascii="Arial" w:hAnsi="Arial" w:eastAsia="Arial" w:cs="Arial"/>
                 <w:i w:val="false"/>
                 <w:b w:val="false"/>
                 <w:u w:val="none"/>
@@ -829,7 +902,7 @@
             </w:r>
             <w:r xmlns:w="http://schemas.openxmlformats.org/wordprocessingml/2006/main" xmlns:wp="http://schemas.openxmlformats.org/drawingml/2006/wordprocessingDrawing" xmlns:r="http://schemas.openxmlformats.org/officeDocument/2006/relationships" xmlns:w14="http://schemas.microsoft.com/office/word/2010/wordml">
               <w:rPr>
-                <w:rFonts w:ascii="Helvetica" w:hAnsi="Helvetica" w:eastAsia="Helvetica" w:cs="Helvetica"/>
+                <w:rFonts w:ascii="Arial" w:hAnsi="Arial" w:eastAsia="Arial" w:cs="Arial"/>
                 <w:i w:val="false"/>
                 <w:b w:val="false"/>
                 <w:u w:val="none"/>
@@ -842,7 +915,7 @@
             </w:r>
             <w:r xmlns:w="http://schemas.openxmlformats.org/wordprocessingml/2006/main" xmlns:wp="http://schemas.openxmlformats.org/drawingml/2006/wordprocessingDrawing" xmlns:r="http://schemas.openxmlformats.org/officeDocument/2006/relationships" xmlns:w14="http://schemas.microsoft.com/office/word/2010/wordml">
               <w:rPr>
-                <w:rFonts w:ascii="Helvetica" w:hAnsi="Helvetica" w:eastAsia="Helvetica" w:cs="Helvetica"/>
+                <w:rFonts w:ascii="Arial" w:hAnsi="Arial" w:eastAsia="Arial" w:cs="Arial"/>
                 <w:i w:val="false"/>
                 <w:b w:val="false"/>
                 <w:u w:val="none"/>
@@ -855,7 +928,7 @@
             </w:r>
             <w:r xmlns:w="http://schemas.openxmlformats.org/wordprocessingml/2006/main" xmlns:wp="http://schemas.openxmlformats.org/drawingml/2006/wordprocessingDrawing" xmlns:r="http://schemas.openxmlformats.org/officeDocument/2006/relationships" xmlns:w14="http://schemas.microsoft.com/office/word/2010/wordml">
               <w:rPr>
-                <w:rFonts w:ascii="Helvetica" w:hAnsi="Helvetica" w:eastAsia="Helvetica" w:cs="Helvetica"/>
+                <w:rFonts w:ascii="Arial" w:hAnsi="Arial" w:eastAsia="Arial" w:cs="Arial"/>
                 <w:i w:val="false"/>
                 <w:b w:val="false"/>
                 <w:u w:val="none"/>
@@ -868,7 +941,7 @@
             </w:r>
             <w:r xmlns:w="http://schemas.openxmlformats.org/wordprocessingml/2006/main" xmlns:wp="http://schemas.openxmlformats.org/drawingml/2006/wordprocessingDrawing" xmlns:r="http://schemas.openxmlformats.org/officeDocument/2006/relationships" xmlns:w14="http://schemas.microsoft.com/office/word/2010/wordml">
               <w:rPr>
-                <w:rFonts w:ascii="Helvetica" w:hAnsi="Helvetica" w:eastAsia="Helvetica" w:cs="Helvetica"/>
+                <w:rFonts w:ascii="Arial" w:hAnsi="Arial" w:eastAsia="Arial" w:cs="Arial"/>
                 <w:i w:val="false"/>
                 <w:b w:val="false"/>
                 <w:u w:val="none"/>
@@ -881,7 +954,7 @@
             </w:r>
             <w:r xmlns:w="http://schemas.openxmlformats.org/wordprocessingml/2006/main" xmlns:wp="http://schemas.openxmlformats.org/drawingml/2006/wordprocessingDrawing" xmlns:r="http://schemas.openxmlformats.org/officeDocument/2006/relationships" xmlns:w14="http://schemas.microsoft.com/office/word/2010/wordml">
               <w:rPr>
-                <w:rFonts w:ascii="Helvetica" w:hAnsi="Helvetica" w:eastAsia="Helvetica" w:cs="Helvetica"/>
+                <w:rFonts w:ascii="Arial" w:hAnsi="Arial" w:eastAsia="Arial" w:cs="Arial"/>
                 <w:i w:val="false"/>
                 <w:b w:val="false"/>
                 <w:u w:val="none"/>
@@ -894,7 +967,7 @@
             </w:r>
             <w:r xmlns:w="http://schemas.openxmlformats.org/wordprocessingml/2006/main" xmlns:wp="http://schemas.openxmlformats.org/drawingml/2006/wordprocessingDrawing" xmlns:r="http://schemas.openxmlformats.org/officeDocument/2006/relationships" xmlns:w14="http://schemas.microsoft.com/office/word/2010/wordml">
               <w:rPr>
-                <w:rFonts w:ascii="Helvetica" w:hAnsi="Helvetica" w:eastAsia="Helvetica" w:cs="Helvetica"/>
+                <w:rFonts w:ascii="Arial" w:hAnsi="Arial" w:eastAsia="Arial" w:cs="Arial"/>
                 <w:i w:val="false"/>
                 <w:b w:val="false"/>
                 <w:u w:val="none"/>
@@ -907,7 +980,7 @@
             </w:r>
             <w:r xmlns:w="http://schemas.openxmlformats.org/wordprocessingml/2006/main" xmlns:wp="http://schemas.openxmlformats.org/drawingml/2006/wordprocessingDrawing" xmlns:r="http://schemas.openxmlformats.org/officeDocument/2006/relationships" xmlns:w14="http://schemas.microsoft.com/office/word/2010/wordml">
               <w:rPr>
-                <w:rFonts w:ascii="Helvetica" w:hAnsi="Helvetica" w:eastAsia="Helvetica" w:cs="Helvetica"/>
+                <w:rFonts w:ascii="Arial" w:hAnsi="Arial" w:eastAsia="Arial" w:cs="Arial"/>
                 <w:i w:val="false"/>
                 <w:b w:val="false"/>
                 <w:u w:val="none"/>
@@ -920,7 +993,7 @@
             </w:r>
             <w:r xmlns:w="http://schemas.openxmlformats.org/wordprocessingml/2006/main" xmlns:wp="http://schemas.openxmlformats.org/drawingml/2006/wordprocessingDrawing" xmlns:r="http://schemas.openxmlformats.org/officeDocument/2006/relationships" xmlns:w14="http://schemas.microsoft.com/office/word/2010/wordml">
               <w:rPr>
-                <w:rFonts w:ascii="Helvetica" w:hAnsi="Helvetica" w:eastAsia="Helvetica" w:cs="Helvetica"/>
+                <w:rFonts w:ascii="Arial" w:hAnsi="Arial" w:eastAsia="Arial" w:cs="Arial"/>
                 <w:i w:val="false"/>
                 <w:b w:val="false"/>
                 <w:u w:val="none"/>
@@ -933,7 +1006,7 @@
             </w:r>
             <w:r xmlns:w="http://schemas.openxmlformats.org/wordprocessingml/2006/main" xmlns:wp="http://schemas.openxmlformats.org/drawingml/2006/wordprocessingDrawing" xmlns:r="http://schemas.openxmlformats.org/officeDocument/2006/relationships" xmlns:w14="http://schemas.microsoft.com/office/word/2010/wordml">
               <w:rPr>
-                <w:rFonts w:ascii="Helvetica" w:hAnsi="Helvetica" w:eastAsia="Helvetica" w:cs="Helvetica"/>
+                <w:rFonts w:ascii="Arial" w:hAnsi="Arial" w:eastAsia="Arial" w:cs="Arial"/>
                 <w:i w:val="false"/>
                 <w:b w:val="false"/>
                 <w:u w:val="none"/>
@@ -946,7 +1019,7 @@
             </w:r>
             <w:r xmlns:w="http://schemas.openxmlformats.org/wordprocessingml/2006/main" xmlns:wp="http://schemas.openxmlformats.org/drawingml/2006/wordprocessingDrawing" xmlns:r="http://schemas.openxmlformats.org/officeDocument/2006/relationships" xmlns:w14="http://schemas.microsoft.com/office/word/2010/wordml">
               <w:rPr>
-                <w:rFonts w:ascii="Helvetica" w:hAnsi="Helvetica" w:eastAsia="Helvetica" w:cs="Helvetica"/>
+                <w:rFonts w:ascii="Arial" w:hAnsi="Arial" w:eastAsia="Arial" w:cs="Arial"/>
                 <w:i w:val="false"/>
                 <w:b w:val="false"/>
                 <w:u w:val="none"/>
@@ -959,7 +1032,7 @@
             </w:r>
             <w:r xmlns:w="http://schemas.openxmlformats.org/wordprocessingml/2006/main" xmlns:wp="http://schemas.openxmlformats.org/drawingml/2006/wordprocessingDrawing" xmlns:r="http://schemas.openxmlformats.org/officeDocument/2006/relationships" xmlns:w14="http://schemas.microsoft.com/office/word/2010/wordml">
               <w:rPr>
-                <w:rFonts w:ascii="Helvetica" w:hAnsi="Helvetica" w:eastAsia="Helvetica" w:cs="Helvetica"/>
+                <w:rFonts w:ascii="Arial" w:hAnsi="Arial" w:eastAsia="Arial" w:cs="Arial"/>
                 <w:i w:val="false"/>
                 <w:b w:val="false"/>
                 <w:u w:val="none"/>
@@ -972,7 +1045,7 @@
             </w:r>
             <w:r xmlns:w="http://schemas.openxmlformats.org/wordprocessingml/2006/main" xmlns:wp="http://schemas.openxmlformats.org/drawingml/2006/wordprocessingDrawing" xmlns:r="http://schemas.openxmlformats.org/officeDocument/2006/relationships" xmlns:w14="http://schemas.microsoft.com/office/word/2010/wordml">
               <w:rPr>
-                <w:rFonts w:ascii="Helvetica" w:hAnsi="Helvetica" w:eastAsia="Helvetica" w:cs="Helvetica"/>
+                <w:rFonts w:ascii="Arial" w:hAnsi="Arial" w:eastAsia="Arial" w:cs="Arial"/>
                 <w:i w:val="false"/>
                 <w:b w:val="false"/>
                 <w:u w:val="none"/>
@@ -992,40 +1065,58 @@
         <w:br w:type="page"/>
       </w:r>
     </w:p>
-    <w:bookmarkStart w:id="20" w:name="variable-selection-tables"/>
+    <w:bookmarkStart w:id="20" w:name="step-3-choose-variables-13"/>
     <w:p>
       <w:pPr>
-        <w:pStyle w:val="Heading2"/>
+        <w:pStyle w:val="Heading1"/>
       </w:pPr>
       <w:r>
-        <w:t xml:space="preserve">Variable Selection Tables</w:t>
+        <w:t xml:space="preserve">Step 3 Choose variables 1–3</w:t>
+      </w:r>
+    </w:p>
+    <w:p>
+      <w:pPr>
+        <w:pStyle w:val="FirstParagraph"/>
+      </w:pPr>
+      <w:r>
+        <w:t xml:space="preserve">At least some choices should correspond to variables from your three references, so you can use those references to support your research hypotheses.</w:t>
+      </w:r>
+      <w:r>
+        <w:t xml:space="preserve"> </w:t>
+      </w:r>
+      <w:r>
+        <w:rPr>
+          <w:b/>
+          <w:bCs/>
+        </w:rPr>
+        <w:t xml:space="preserve">Pick one variable from each column. Do not pick your core variable.</w:t>
       </w:r>
     </w:p>
     <w:tbl xmlns:w="http://schemas.openxmlformats.org/wordprocessingml/2006/main" xmlns:r="http://schemas.openxmlformats.org/officeDocument/2006/relationships" xmlns:w14="http://schemas.microsoft.com/office/word/2010/wordml" xmlns:wp="http://schemas.openxmlformats.org/drawingml/2006/wordprocessingDrawing" xmlns:a="http://schemas.openxmlformats.org/drawingml/2006/main" xmlns:pic="http://schemas.openxmlformats.org/drawingml/2006/picture">
       <w:tblPr>
         <w:tblLayout w:type="fixed"/>
         <w:jc w:val="center"/>
-        <w:tblLook w:firstRow="1" w:lastRow="0" w:firstColumn="0" w:lastColumn="0" w:noHBand="0" w:noVBand="1"/>
+        <w:tblLook w:firstRow="1" w:lastRow="0" w:firstColumn="0" w:lastColumn="0" w:noHBand="0" w:noVBand="1" w:val="0020"/>
       </w:tblPr>
       <w:tblGrid>
-        <w:gridCol w:w="4032"/>
-        <w:gridCol w:w="4032"/>
         <w:gridCol w:w="3168"/>
+        <w:gridCol w:w="3168"/>
+        <w:gridCol w:w="3024"/>
       </w:tblGrid>
       <w:tr>
         <w:trPr>
           <w:trHeight w:val="360" w:hRule="auto"/>
+          <w:tblHeader/>
         </w:trPr>
         <w:tc>
           <w:tcPr>
-            <w:gridSpan w:val="3"/>
             <w:tcBorders>
-              <w:bottom w:val="single" w:sz="8" w:space="0" w:color="000000"/>
+              <w:bottom w:val="single" w:sz="16" w:space="0" w:color="000000"/>
               <w:top w:val="single" w:sz="16" w:space="0" w:color="000000"/>
               <w:left w:val="single" w:sz="16" w:space="0" w:color="000000"/>
-              <w:right w:val="single" w:sz="16" w:space="0" w:color="000000"/>
+              <w:right w:val="single" w:sz="8" w:space="0" w:color="000000"/>
             </w:tcBorders>
-            <w:shd w:val="clear" w:color="auto" w:fill="FFFFFF"/>
+            <w:shd w:val="clear" w:color="auto" w:fill="1F1F1F"/>
             <w:tcMar>
               <w:top w:w="0" w:type="dxa"/>
               <w:bottom w:w="0" w:type="dxa"/>
@@ -1043,17 +1134,17 @@
                 <w:left w:val="none" w:sz="0" w:space="0" w:color="000000"/>
                 <w:right w:val="none" w:sz="0" w:space="0" w:color="000000"/>
               </w:pBdr>
-              <w:spacing w:after="200" w:before="200" w:line="240"/>
-              <w:ind w:left="200" w:right="200" w:firstLine="0" w:firstLineChars="0"/>
-              <w:rPr>
-                <w:rFonts w:ascii="Helvetica" w:hAnsi="Helvetica" w:eastAsia="Helvetica" w:cs="Helvetica"/>
-                <w:i w:val="false"/>
-                <w:b w:val="false"/>
-                <w:u w:val="none"/>
-                <w:strike w:val="false"/>
-                <w:sz w:val="20"/>
-                <w:szCs w:val="20"/>
-                <w:color w:val="000000"/>
+              <w:spacing w:after="100" w:before="100" w:line="240"/>
+              <w:ind w:left="100" w:right="100" w:firstLine="0" w:firstLineChars="0"/>
+              <w:rPr>
+                <w:rFonts w:ascii="Arial" w:hAnsi="Arial" w:eastAsia="Arial" w:cs="Arial"/>
+                <w:i w:val="false"/>
+                <w:b w:val="true"/>
+                <w:u w:val="none"/>
+                <w:strike w:val="false"/>
+                <w:sz w:val="22"/>
+                <w:szCs w:val="22"/>
+                <w:color w:val="FFFFFF"/>
               </w:rPr>
             </w:pPr>
             <w:r xmlns:w="http://schemas.openxmlformats.org/wordprocessingml/2006/main" xmlns:wp="http://schemas.openxmlformats.org/drawingml/2006/wordprocessingDrawing" xmlns:r="http://schemas.openxmlformats.org/officeDocument/2006/relationships" xmlns:w14="http://schemas.microsoft.com/office/word/2010/wordml">
@@ -1063,37 +1154,119 @@
                 <w:b w:val="true"/>
                 <w:u w:val="none"/>
                 <w:strike w:val="false"/>
-                <w:sz w:val="20"/>
-                <w:szCs w:val="20"/>
-                <w:color w:val="000000"/>
-              </w:rPr>
-              <w:t xml:space="preserve">Step #3 – </w:t>
-            </w:r>
-            <w:r xmlns:w="http://schemas.openxmlformats.org/wordprocessingml/2006/main" xmlns:wp="http://schemas.openxmlformats.org/drawingml/2006/wordprocessingDrawing" xmlns:r="http://schemas.openxmlformats.org/officeDocument/2006/relationships" xmlns:w14="http://schemas.microsoft.com/office/word/2010/wordml">
-              <w:rPr>
-                <w:rFonts w:ascii="Helvetica" w:hAnsi="Helvetica" w:eastAsia="Helvetica" w:cs="Helvetica"/>
-                <w:i w:val="false"/>
-                <w:b w:val="false"/>
-                <w:u w:val="none"/>
-                <w:strike w:val="false"/>
-                <w:sz w:val="20"/>
-                <w:szCs w:val="20"/>
-                <w:color w:val="000000"/>
-              </w:rPr>
-              <w:t xml:space="preserve">Picking other variables for your project. At least some of these choices should correspond to variables from your three references, so you can use those references to support your research hypotheses. </w:t>
-            </w:r>
-            <w:r xmlns:w="http://schemas.openxmlformats.org/wordprocessingml/2006/main" xmlns:wp="http://schemas.openxmlformats.org/drawingml/2006/wordprocessingDrawing" xmlns:r="http://schemas.openxmlformats.org/officeDocument/2006/relationships" xmlns:w14="http://schemas.microsoft.com/office/word/2010/wordml">
+                <w:sz w:val="22"/>
+                <w:szCs w:val="22"/>
+                <w:color w:val="FFFFFF"/>
+              </w:rPr>
+              <w:t xml:space="preserve">Variable #1 Quantitative</w:t>
+            </w:r>
+          </w:p>
+        </w:tc>
+        <w:tc>
+          <w:tcPr>
+            <w:tcBorders>
+              <w:bottom w:val="single" w:sz="16" w:space="0" w:color="000000"/>
+              <w:top w:val="single" w:sz="16" w:space="0" w:color="000000"/>
+              <w:left w:val="single" w:sz="8" w:space="0" w:color="000000"/>
+              <w:right w:val="single" w:sz="8" w:space="0" w:color="000000"/>
+            </w:tcBorders>
+            <w:shd w:val="clear" w:color="auto" w:fill="1F1F1F"/>
+            <w:tcMar>
+              <w:top w:w="0" w:type="dxa"/>
+              <w:bottom w:w="0" w:type="dxa"/>
+              <w:left w:w="0" w:type="dxa"/>
+              <w:right w:w="0" w:type="dxa"/>
+            </w:tcMar>
+            <w:vAlign w:val="top"/>
+          </w:tcPr>
+          <w:p>
+            <w:pPr>
+              <w:jc w:val="left"/>
+              <w:pBdr>
+                <w:bottom w:val="none" w:sz="0" w:space="0" w:color="000000"/>
+                <w:top w:val="none" w:sz="0" w:space="0" w:color="000000"/>
+                <w:left w:val="none" w:sz="0" w:space="0" w:color="000000"/>
+                <w:right w:val="none" w:sz="0" w:space="0" w:color="000000"/>
+              </w:pBdr>
+              <w:spacing w:after="100" w:before="100" w:line="240"/>
+              <w:ind w:left="100" w:right="100" w:firstLine="0" w:firstLineChars="0"/>
               <w:rPr>
                 <w:rFonts w:ascii="Arial" w:hAnsi="Arial" w:eastAsia="Arial" w:cs="Arial"/>
                 <w:i w:val="false"/>
                 <w:b w:val="true"/>
                 <w:u w:val="none"/>
                 <w:strike w:val="false"/>
-                <w:sz w:val="20"/>
-                <w:szCs w:val="20"/>
-                <w:color w:val="000000"/>
-              </w:rPr>
-              <w:t xml:space="preserve">Pick one variable from each column (Do not pick your "core variable"!)</w:t>
+                <w:sz w:val="22"/>
+                <w:szCs w:val="22"/>
+                <w:color w:val="FFFFFF"/>
+              </w:rPr>
+            </w:pPr>
+            <w:r xmlns:w="http://schemas.openxmlformats.org/wordprocessingml/2006/main" xmlns:wp="http://schemas.openxmlformats.org/drawingml/2006/wordprocessingDrawing" xmlns:r="http://schemas.openxmlformats.org/officeDocument/2006/relationships" xmlns:w14="http://schemas.microsoft.com/office/word/2010/wordml">
+              <w:rPr>
+                <w:rFonts w:ascii="Arial" w:hAnsi="Arial" w:eastAsia="Arial" w:cs="Arial"/>
+                <w:i w:val="false"/>
+                <w:b w:val="true"/>
+                <w:u w:val="none"/>
+                <w:strike w:val="false"/>
+                <w:sz w:val="22"/>
+                <w:szCs w:val="22"/>
+                <w:color w:val="FFFFFF"/>
+              </w:rPr>
+              <w:t xml:space="preserve">Variable #2 Quantitative</w:t>
+            </w:r>
+          </w:p>
+        </w:tc>
+        <w:tc>
+          <w:tcPr>
+            <w:tcBorders>
+              <w:bottom w:val="single" w:sz="16" w:space="0" w:color="000000"/>
+              <w:top w:val="single" w:sz="16" w:space="0" w:color="000000"/>
+              <w:left w:val="single" w:sz="8" w:space="0" w:color="000000"/>
+              <w:right w:val="single" w:sz="16" w:space="0" w:color="000000"/>
+            </w:tcBorders>
+            <w:shd w:val="clear" w:color="auto" w:fill="1F1F1F"/>
+            <w:tcMar>
+              <w:top w:w="0" w:type="dxa"/>
+              <w:bottom w:w="0" w:type="dxa"/>
+              <w:left w:w="0" w:type="dxa"/>
+              <w:right w:w="0" w:type="dxa"/>
+            </w:tcMar>
+            <w:vAlign w:val="top"/>
+          </w:tcPr>
+          <w:p>
+            <w:pPr>
+              <w:jc w:val="left"/>
+              <w:pBdr>
+                <w:bottom w:val="none" w:sz="0" w:space="0" w:color="000000"/>
+                <w:top w:val="none" w:sz="0" w:space="0" w:color="000000"/>
+                <w:left w:val="none" w:sz="0" w:space="0" w:color="000000"/>
+                <w:right w:val="none" w:sz="0" w:space="0" w:color="000000"/>
+              </w:pBdr>
+              <w:spacing w:after="100" w:before="100" w:line="240"/>
+              <w:ind w:left="100" w:right="100" w:firstLine="0" w:firstLineChars="0"/>
+              <w:rPr>
+                <w:rFonts w:ascii="Arial" w:hAnsi="Arial" w:eastAsia="Arial" w:cs="Arial"/>
+                <w:i w:val="false"/>
+                <w:b w:val="true"/>
+                <w:u w:val="none"/>
+                <w:strike w:val="false"/>
+                <w:sz w:val="22"/>
+                <w:szCs w:val="22"/>
+                <w:color w:val="FFFFFF"/>
+              </w:rPr>
+            </w:pPr>
+            <w:r xmlns:w="http://schemas.openxmlformats.org/wordprocessingml/2006/main" xmlns:wp="http://schemas.openxmlformats.org/drawingml/2006/wordprocessingDrawing" xmlns:r="http://schemas.openxmlformats.org/officeDocument/2006/relationships" xmlns:w14="http://schemas.microsoft.com/office/word/2010/wordml">
+              <w:rPr>
+                <w:rFonts w:ascii="Arial" w:hAnsi="Arial" w:eastAsia="Arial" w:cs="Arial"/>
+                <w:i w:val="false"/>
+                <w:b w:val="true"/>
+                <w:u w:val="none"/>
+                <w:strike w:val="false"/>
+                <w:sz w:val="22"/>
+                <w:szCs w:val="22"/>
+                <w:color w:val="FFFFFF"/>
+              </w:rPr>
+              <w:t xml:space="preserve">Variable #3 Categorical</w:t>
             </w:r>
           </w:p>
         </w:tc>
@@ -1106,7 +1279,7 @@
           <w:tcPr>
             <w:tcBorders>
               <w:bottom w:val="single" w:sz="16" w:space="0" w:color="000000"/>
-              <w:top w:val="single" w:sz="8" w:space="0" w:color="000000"/>
+              <w:top w:val="single" w:sz="16" w:space="0" w:color="000000"/>
               <w:left w:val="single" w:sz="16" w:space="0" w:color="000000"/>
               <w:right w:val="single" w:sz="8" w:space="0" w:color="000000"/>
             </w:tcBorders>
@@ -1131,7 +1304,7 @@
               <w:spacing w:after="200" w:before="200" w:line="240"/>
               <w:ind w:left="200" w:right="200" w:firstLine="0" w:firstLineChars="0"/>
               <w:rPr>
-                <w:rFonts w:ascii="Helvetica" w:hAnsi="Helvetica" w:eastAsia="Helvetica" w:cs="Helvetica"/>
+                <w:rFonts w:ascii="Arial" w:hAnsi="Arial" w:eastAsia="Arial" w:cs="Arial"/>
                 <w:i w:val="false"/>
                 <w:b w:val="false"/>
                 <w:u w:val="none"/>
@@ -1141,45 +1314,6 @@
                 <w:color w:val="000000"/>
               </w:rPr>
             </w:pPr>
-            <w:r xmlns:w="http://schemas.openxmlformats.org/wordprocessingml/2006/main" xmlns:wp="http://schemas.openxmlformats.org/drawingml/2006/wordprocessingDrawing" xmlns:r="http://schemas.openxmlformats.org/officeDocument/2006/relationships" xmlns:w14="http://schemas.microsoft.com/office/word/2010/wordml">
-              <w:rPr>
-                <w:rFonts w:ascii="Arial" w:hAnsi="Arial" w:eastAsia="Arial" w:cs="Arial"/>
-                <w:i w:val="false"/>
-                <w:b w:val="true"/>
-                <w:u w:val="none"/>
-                <w:strike w:val="false"/>
-                <w:sz w:val="22"/>
-                <w:szCs w:val="22"/>
-                <w:color w:val="000000"/>
-              </w:rPr>
-              <w:t xml:space="preserve">Variable #1 Quantitative</w:t>
-            </w:r>
-            <w:r xmlns:w="http://schemas.openxmlformats.org/wordprocessingml/2006/main" xmlns:wp="http://schemas.openxmlformats.org/drawingml/2006/wordprocessingDrawing" xmlns:r="http://schemas.openxmlformats.org/officeDocument/2006/relationships" xmlns:w14="http://schemas.microsoft.com/office/word/2010/wordml">
-              <w:rPr>
-                <w:rFonts w:ascii="Helvetica" w:hAnsi="Helvetica" w:eastAsia="Helvetica" w:cs="Helvetica"/>
-                <w:i w:val="false"/>
-                <w:b w:val="false"/>
-                <w:u w:val="none"/>
-                <w:strike w:val="false"/>
-                <w:sz w:val="20"/>
-                <w:szCs w:val="20"/>
-                <w:color w:val="000000"/>
-              </w:rPr>
-              <w:br/>
-            </w:r>
-            <w:r xmlns:w="http://schemas.openxmlformats.org/wordprocessingml/2006/main" xmlns:wp="http://schemas.openxmlformats.org/drawingml/2006/wordprocessingDrawing" xmlns:r="http://schemas.openxmlformats.org/officeDocument/2006/relationships" xmlns:w14="http://schemas.microsoft.com/office/word/2010/wordml">
-              <w:rPr>
-                <w:rFonts w:ascii="Helvetica" w:hAnsi="Helvetica" w:eastAsia="Helvetica" w:cs="Helvetica"/>
-                <w:i w:val="false"/>
-                <w:b w:val="false"/>
-                <w:u w:val="none"/>
-                <w:strike w:val="false"/>
-                <w:sz w:val="20"/>
-                <w:szCs w:val="20"/>
-                <w:color w:val="000000"/>
-              </w:rPr>
-              <w:br/>
-            </w:r>
             <w:r xmlns:w="http://schemas.openxmlformats.org/wordprocessingml/2006/main" xmlns:wp="http://schemas.openxmlformats.org/drawingml/2006/wordprocessingDrawing" xmlns:r="http://schemas.openxmlformats.org/officeDocument/2006/relationships" xmlns:w14="http://schemas.microsoft.com/office/word/2010/wordml">
               <w:rPr>
                 <w:rFonts w:ascii="Arial" w:hAnsi="Arial" w:eastAsia="Arial" w:cs="Arial"/>
@@ -1195,20 +1329,20 @@
             </w:r>
             <w:r xmlns:w="http://schemas.openxmlformats.org/wordprocessingml/2006/main" xmlns:wp="http://schemas.openxmlformats.org/drawingml/2006/wordprocessingDrawing" xmlns:r="http://schemas.openxmlformats.org/officeDocument/2006/relationships" xmlns:w14="http://schemas.microsoft.com/office/word/2010/wordml">
               <w:rPr>
-                <w:rFonts w:ascii="Helvetica" w:hAnsi="Helvetica" w:eastAsia="Helvetica" w:cs="Helvetica"/>
-                <w:i w:val="false"/>
-                <w:b w:val="false"/>
-                <w:u w:val="none"/>
-                <w:strike w:val="false"/>
-                <w:sz w:val="20"/>
-                <w:szCs w:val="20"/>
-                <w:color w:val="000000"/>
-              </w:rPr>
-              <w:br/>
-            </w:r>
-            <w:r xmlns:w="http://schemas.openxmlformats.org/wordprocessingml/2006/main" xmlns:wp="http://schemas.openxmlformats.org/drawingml/2006/wordprocessingDrawing" xmlns:r="http://schemas.openxmlformats.org/officeDocument/2006/relationships" xmlns:w14="http://schemas.microsoft.com/office/word/2010/wordml">
-              <w:rPr>
-                <w:rFonts w:ascii="Helvetica" w:hAnsi="Helvetica" w:eastAsia="Helvetica" w:cs="Helvetica"/>
+                <w:rFonts w:ascii="Arial" w:hAnsi="Arial" w:eastAsia="Arial" w:cs="Arial"/>
+                <w:i w:val="false"/>
+                <w:b w:val="false"/>
+                <w:u w:val="none"/>
+                <w:strike w:val="false"/>
+                <w:sz w:val="20"/>
+                <w:szCs w:val="20"/>
+                <w:color w:val="000000"/>
+              </w:rPr>
+              <w:br/>
+            </w:r>
+            <w:r xmlns:w="http://schemas.openxmlformats.org/wordprocessingml/2006/main" xmlns:wp="http://schemas.openxmlformats.org/drawingml/2006/wordprocessingDrawing" xmlns:r="http://schemas.openxmlformats.org/officeDocument/2006/relationships" xmlns:w14="http://schemas.microsoft.com/office/word/2010/wordml">
+              <w:rPr>
+                <w:rFonts w:ascii="Arial" w:hAnsi="Arial" w:eastAsia="Arial" w:cs="Arial"/>
                 <w:i w:val="false"/>
                 <w:b w:val="false"/>
                 <w:u w:val="none"/>
@@ -1234,20 +1368,20 @@
             </w:r>
             <w:r xmlns:w="http://schemas.openxmlformats.org/wordprocessingml/2006/main" xmlns:wp="http://schemas.openxmlformats.org/drawingml/2006/wordprocessingDrawing" xmlns:r="http://schemas.openxmlformats.org/officeDocument/2006/relationships" xmlns:w14="http://schemas.microsoft.com/office/word/2010/wordml">
               <w:rPr>
-                <w:rFonts w:ascii="Helvetica" w:hAnsi="Helvetica" w:eastAsia="Helvetica" w:cs="Helvetica"/>
-                <w:i w:val="false"/>
-                <w:b w:val="false"/>
-                <w:u w:val="none"/>
-                <w:strike w:val="false"/>
-                <w:sz w:val="20"/>
-                <w:szCs w:val="20"/>
-                <w:color w:val="000000"/>
-              </w:rPr>
-              <w:br/>
-            </w:r>
-            <w:r xmlns:w="http://schemas.openxmlformats.org/wordprocessingml/2006/main" xmlns:wp="http://schemas.openxmlformats.org/drawingml/2006/wordprocessingDrawing" xmlns:r="http://schemas.openxmlformats.org/officeDocument/2006/relationships" xmlns:w14="http://schemas.microsoft.com/office/word/2010/wordml">
-              <w:rPr>
-                <w:rFonts w:ascii="Helvetica" w:hAnsi="Helvetica" w:eastAsia="Helvetica" w:cs="Helvetica"/>
+                <w:rFonts w:ascii="Arial" w:hAnsi="Arial" w:eastAsia="Arial" w:cs="Arial"/>
+                <w:i w:val="false"/>
+                <w:b w:val="false"/>
+                <w:u w:val="none"/>
+                <w:strike w:val="false"/>
+                <w:sz w:val="20"/>
+                <w:szCs w:val="20"/>
+                <w:color w:val="000000"/>
+              </w:rPr>
+              <w:br/>
+            </w:r>
+            <w:r xmlns:w="http://schemas.openxmlformats.org/wordprocessingml/2006/main" xmlns:wp="http://schemas.openxmlformats.org/drawingml/2006/wordprocessingDrawing" xmlns:r="http://schemas.openxmlformats.org/officeDocument/2006/relationships" xmlns:w14="http://schemas.microsoft.com/office/word/2010/wordml">
+              <w:rPr>
+                <w:rFonts w:ascii="Arial" w:hAnsi="Arial" w:eastAsia="Arial" w:cs="Arial"/>
                 <w:i w:val="false"/>
                 <w:b w:val="false"/>
                 <w:u w:val="none"/>
@@ -1849,7 +1983,7 @@
           <w:tcPr>
             <w:tcBorders>
               <w:bottom w:val="single" w:sz="16" w:space="0" w:color="000000"/>
-              <w:top w:val="single" w:sz="8" w:space="0" w:color="000000"/>
+              <w:top w:val="single" w:sz="16" w:space="0" w:color="000000"/>
               <w:left w:val="single" w:sz="8" w:space="0" w:color="000000"/>
               <w:right w:val="single" w:sz="8" w:space="0" w:color="000000"/>
             </w:tcBorders>
@@ -1874,7 +2008,7 @@
               <w:spacing w:after="200" w:before="200" w:line="240"/>
               <w:ind w:left="200" w:right="200" w:firstLine="0" w:firstLineChars="0"/>
               <w:rPr>
-                <w:rFonts w:ascii="Helvetica" w:hAnsi="Helvetica" w:eastAsia="Helvetica" w:cs="Helvetica"/>
+                <w:rFonts w:ascii="Arial" w:hAnsi="Arial" w:eastAsia="Arial" w:cs="Arial"/>
                 <w:i w:val="false"/>
                 <w:b w:val="false"/>
                 <w:u w:val="none"/>
@@ -1884,45 +2018,6 @@
                 <w:color w:val="000000"/>
               </w:rPr>
             </w:pPr>
-            <w:r xmlns:w="http://schemas.openxmlformats.org/wordprocessingml/2006/main" xmlns:wp="http://schemas.openxmlformats.org/drawingml/2006/wordprocessingDrawing" xmlns:r="http://schemas.openxmlformats.org/officeDocument/2006/relationships" xmlns:w14="http://schemas.microsoft.com/office/word/2010/wordml">
-              <w:rPr>
-                <w:rFonts w:ascii="Arial" w:hAnsi="Arial" w:eastAsia="Arial" w:cs="Arial"/>
-                <w:i w:val="false"/>
-                <w:b w:val="true"/>
-                <w:u w:val="none"/>
-                <w:strike w:val="false"/>
-                <w:sz w:val="22"/>
-                <w:szCs w:val="22"/>
-                <w:color w:val="000000"/>
-              </w:rPr>
-              <w:t xml:space="preserve">Variable #2 Quantitative</w:t>
-            </w:r>
-            <w:r xmlns:w="http://schemas.openxmlformats.org/wordprocessingml/2006/main" xmlns:wp="http://schemas.openxmlformats.org/drawingml/2006/wordprocessingDrawing" xmlns:r="http://schemas.openxmlformats.org/officeDocument/2006/relationships" xmlns:w14="http://schemas.microsoft.com/office/word/2010/wordml">
-              <w:rPr>
-                <w:rFonts w:ascii="Helvetica" w:hAnsi="Helvetica" w:eastAsia="Helvetica" w:cs="Helvetica"/>
-                <w:i w:val="false"/>
-                <w:b w:val="false"/>
-                <w:u w:val="none"/>
-                <w:strike w:val="false"/>
-                <w:sz w:val="20"/>
-                <w:szCs w:val="20"/>
-                <w:color w:val="000000"/>
-              </w:rPr>
-              <w:br/>
-            </w:r>
-            <w:r xmlns:w="http://schemas.openxmlformats.org/wordprocessingml/2006/main" xmlns:wp="http://schemas.openxmlformats.org/drawingml/2006/wordprocessingDrawing" xmlns:r="http://schemas.openxmlformats.org/officeDocument/2006/relationships" xmlns:w14="http://schemas.microsoft.com/office/word/2010/wordml">
-              <w:rPr>
-                <w:rFonts w:ascii="Helvetica" w:hAnsi="Helvetica" w:eastAsia="Helvetica" w:cs="Helvetica"/>
-                <w:i w:val="false"/>
-                <w:b w:val="false"/>
-                <w:u w:val="none"/>
-                <w:strike w:val="false"/>
-                <w:sz w:val="20"/>
-                <w:szCs w:val="20"/>
-                <w:color w:val="000000"/>
-              </w:rPr>
-              <w:br/>
-            </w:r>
             <w:r xmlns:w="http://schemas.openxmlformats.org/wordprocessingml/2006/main" xmlns:wp="http://schemas.openxmlformats.org/drawingml/2006/wordprocessingDrawing" xmlns:r="http://schemas.openxmlformats.org/officeDocument/2006/relationships" xmlns:w14="http://schemas.microsoft.com/office/word/2010/wordml">
               <w:rPr>
                 <w:rFonts w:ascii="Arial" w:hAnsi="Arial" w:eastAsia="Arial" w:cs="Arial"/>
@@ -1938,20 +2033,20 @@
             </w:r>
             <w:r xmlns:w="http://schemas.openxmlformats.org/wordprocessingml/2006/main" xmlns:wp="http://schemas.openxmlformats.org/drawingml/2006/wordprocessingDrawing" xmlns:r="http://schemas.openxmlformats.org/officeDocument/2006/relationships" xmlns:w14="http://schemas.microsoft.com/office/word/2010/wordml">
               <w:rPr>
-                <w:rFonts w:ascii="Helvetica" w:hAnsi="Helvetica" w:eastAsia="Helvetica" w:cs="Helvetica"/>
-                <w:i w:val="false"/>
-                <w:b w:val="false"/>
-                <w:u w:val="none"/>
-                <w:strike w:val="false"/>
-                <w:sz w:val="20"/>
-                <w:szCs w:val="20"/>
-                <w:color w:val="000000"/>
-              </w:rPr>
-              <w:br/>
-            </w:r>
-            <w:r xmlns:w="http://schemas.openxmlformats.org/wordprocessingml/2006/main" xmlns:wp="http://schemas.openxmlformats.org/drawingml/2006/wordprocessingDrawing" xmlns:r="http://schemas.openxmlformats.org/officeDocument/2006/relationships" xmlns:w14="http://schemas.microsoft.com/office/word/2010/wordml">
-              <w:rPr>
-                <w:rFonts w:ascii="Helvetica" w:hAnsi="Helvetica" w:eastAsia="Helvetica" w:cs="Helvetica"/>
+                <w:rFonts w:ascii="Arial" w:hAnsi="Arial" w:eastAsia="Arial" w:cs="Arial"/>
+                <w:i w:val="false"/>
+                <w:b w:val="false"/>
+                <w:u w:val="none"/>
+                <w:strike w:val="false"/>
+                <w:sz w:val="20"/>
+                <w:szCs w:val="20"/>
+                <w:color w:val="000000"/>
+              </w:rPr>
+              <w:br/>
+            </w:r>
+            <w:r xmlns:w="http://schemas.openxmlformats.org/wordprocessingml/2006/main" xmlns:wp="http://schemas.openxmlformats.org/drawingml/2006/wordprocessingDrawing" xmlns:r="http://schemas.openxmlformats.org/officeDocument/2006/relationships" xmlns:w14="http://schemas.microsoft.com/office/word/2010/wordml">
+              <w:rPr>
+                <w:rFonts w:ascii="Arial" w:hAnsi="Arial" w:eastAsia="Arial" w:cs="Arial"/>
                 <w:i w:val="false"/>
                 <w:b w:val="false"/>
                 <w:u w:val="none"/>
@@ -1977,20 +2072,20 @@
             </w:r>
             <w:r xmlns:w="http://schemas.openxmlformats.org/wordprocessingml/2006/main" xmlns:wp="http://schemas.openxmlformats.org/drawingml/2006/wordprocessingDrawing" xmlns:r="http://schemas.openxmlformats.org/officeDocument/2006/relationships" xmlns:w14="http://schemas.microsoft.com/office/word/2010/wordml">
               <w:rPr>
-                <w:rFonts w:ascii="Helvetica" w:hAnsi="Helvetica" w:eastAsia="Helvetica" w:cs="Helvetica"/>
-                <w:i w:val="false"/>
-                <w:b w:val="false"/>
-                <w:u w:val="none"/>
-                <w:strike w:val="false"/>
-                <w:sz w:val="20"/>
-                <w:szCs w:val="20"/>
-                <w:color w:val="000000"/>
-              </w:rPr>
-              <w:br/>
-            </w:r>
-            <w:r xmlns:w="http://schemas.openxmlformats.org/wordprocessingml/2006/main" xmlns:wp="http://schemas.openxmlformats.org/drawingml/2006/wordprocessingDrawing" xmlns:r="http://schemas.openxmlformats.org/officeDocument/2006/relationships" xmlns:w14="http://schemas.microsoft.com/office/word/2010/wordml">
-              <w:rPr>
-                <w:rFonts w:ascii="Helvetica" w:hAnsi="Helvetica" w:eastAsia="Helvetica" w:cs="Helvetica"/>
+                <w:rFonts w:ascii="Arial" w:hAnsi="Arial" w:eastAsia="Arial" w:cs="Arial"/>
+                <w:i w:val="false"/>
+                <w:b w:val="false"/>
+                <w:u w:val="none"/>
+                <w:strike w:val="false"/>
+                <w:sz w:val="20"/>
+                <w:szCs w:val="20"/>
+                <w:color w:val="000000"/>
+              </w:rPr>
+              <w:br/>
+            </w:r>
+            <w:r xmlns:w="http://schemas.openxmlformats.org/wordprocessingml/2006/main" xmlns:wp="http://schemas.openxmlformats.org/drawingml/2006/wordprocessingDrawing" xmlns:r="http://schemas.openxmlformats.org/officeDocument/2006/relationships" xmlns:w14="http://schemas.microsoft.com/office/word/2010/wordml">
+              <w:rPr>
+                <w:rFonts w:ascii="Arial" w:hAnsi="Arial" w:eastAsia="Arial" w:cs="Arial"/>
                 <w:i w:val="false"/>
                 <w:b w:val="false"/>
                 <w:u w:val="none"/>
@@ -2592,7 +2687,7 @@
           <w:tcPr>
             <w:tcBorders>
               <w:bottom w:val="single" w:sz="16" w:space="0" w:color="000000"/>
-              <w:top w:val="single" w:sz="8" w:space="0" w:color="000000"/>
+              <w:top w:val="single" w:sz="16" w:space="0" w:color="000000"/>
               <w:left w:val="single" w:sz="8" w:space="0" w:color="000000"/>
               <w:right w:val="single" w:sz="16" w:space="0" w:color="000000"/>
             </w:tcBorders>
@@ -2617,7 +2712,7 @@
               <w:spacing w:after="200" w:before="200" w:line="240"/>
               <w:ind w:left="200" w:right="200" w:firstLine="0" w:firstLineChars="0"/>
               <w:rPr>
-                <w:rFonts w:ascii="Helvetica" w:hAnsi="Helvetica" w:eastAsia="Helvetica" w:cs="Helvetica"/>
+                <w:rFonts w:ascii="Arial" w:hAnsi="Arial" w:eastAsia="Arial" w:cs="Arial"/>
                 <w:i w:val="false"/>
                 <w:b w:val="false"/>
                 <w:u w:val="none"/>
@@ -2627,45 +2722,6 @@
                 <w:color w:val="000000"/>
               </w:rPr>
             </w:pPr>
-            <w:r xmlns:w="http://schemas.openxmlformats.org/wordprocessingml/2006/main" xmlns:wp="http://schemas.openxmlformats.org/drawingml/2006/wordprocessingDrawing" xmlns:r="http://schemas.openxmlformats.org/officeDocument/2006/relationships" xmlns:w14="http://schemas.microsoft.com/office/word/2010/wordml">
-              <w:rPr>
-                <w:rFonts w:ascii="Arial" w:hAnsi="Arial" w:eastAsia="Arial" w:cs="Arial"/>
-                <w:i w:val="false"/>
-                <w:b w:val="true"/>
-                <w:u w:val="none"/>
-                <w:strike w:val="false"/>
-                <w:sz w:val="22"/>
-                <w:szCs w:val="22"/>
-                <w:color w:val="000000"/>
-              </w:rPr>
-              <w:t xml:space="preserve">Variable #3 Categorical</w:t>
-            </w:r>
-            <w:r xmlns:w="http://schemas.openxmlformats.org/wordprocessingml/2006/main" xmlns:wp="http://schemas.openxmlformats.org/drawingml/2006/wordprocessingDrawing" xmlns:r="http://schemas.openxmlformats.org/officeDocument/2006/relationships" xmlns:w14="http://schemas.microsoft.com/office/word/2010/wordml">
-              <w:rPr>
-                <w:rFonts w:ascii="Helvetica" w:hAnsi="Helvetica" w:eastAsia="Helvetica" w:cs="Helvetica"/>
-                <w:i w:val="false"/>
-                <w:b w:val="false"/>
-                <w:u w:val="none"/>
-                <w:strike w:val="false"/>
-                <w:sz w:val="20"/>
-                <w:szCs w:val="20"/>
-                <w:color w:val="000000"/>
-              </w:rPr>
-              <w:br/>
-            </w:r>
-            <w:r xmlns:w="http://schemas.openxmlformats.org/wordprocessingml/2006/main" xmlns:wp="http://schemas.openxmlformats.org/drawingml/2006/wordprocessingDrawing" xmlns:r="http://schemas.openxmlformats.org/officeDocument/2006/relationships" xmlns:w14="http://schemas.microsoft.com/office/word/2010/wordml">
-              <w:rPr>
-                <w:rFonts w:ascii="Helvetica" w:hAnsi="Helvetica" w:eastAsia="Helvetica" w:cs="Helvetica"/>
-                <w:i w:val="false"/>
-                <w:b w:val="false"/>
-                <w:u w:val="none"/>
-                <w:strike w:val="false"/>
-                <w:sz w:val="20"/>
-                <w:szCs w:val="20"/>
-                <w:color w:val="000000"/>
-              </w:rPr>
-              <w:br/>
-            </w:r>
             <w:r xmlns:w="http://schemas.openxmlformats.org/wordprocessingml/2006/main" xmlns:wp="http://schemas.openxmlformats.org/drawingml/2006/wordprocessingDrawing" xmlns:r="http://schemas.openxmlformats.org/officeDocument/2006/relationships" xmlns:w14="http://schemas.microsoft.com/office/word/2010/wordml">
               <w:rPr>
                 <w:rFonts w:ascii="Arial" w:hAnsi="Arial" w:eastAsia="Arial" w:cs="Arial"/>
@@ -2681,20 +2737,20 @@
             </w:r>
             <w:r xmlns:w="http://schemas.openxmlformats.org/wordprocessingml/2006/main" xmlns:wp="http://schemas.openxmlformats.org/drawingml/2006/wordprocessingDrawing" xmlns:r="http://schemas.openxmlformats.org/officeDocument/2006/relationships" xmlns:w14="http://schemas.microsoft.com/office/word/2010/wordml">
               <w:rPr>
-                <w:rFonts w:ascii="Helvetica" w:hAnsi="Helvetica" w:eastAsia="Helvetica" w:cs="Helvetica"/>
-                <w:i w:val="false"/>
-                <w:b w:val="false"/>
-                <w:u w:val="none"/>
-                <w:strike w:val="false"/>
-                <w:sz w:val="20"/>
-                <w:szCs w:val="20"/>
-                <w:color w:val="000000"/>
-              </w:rPr>
-              <w:br/>
-            </w:r>
-            <w:r xmlns:w="http://schemas.openxmlformats.org/wordprocessingml/2006/main" xmlns:wp="http://schemas.openxmlformats.org/drawingml/2006/wordprocessingDrawing" xmlns:r="http://schemas.openxmlformats.org/officeDocument/2006/relationships" xmlns:w14="http://schemas.microsoft.com/office/word/2010/wordml">
-              <w:rPr>
-                <w:rFonts w:ascii="Helvetica" w:hAnsi="Helvetica" w:eastAsia="Helvetica" w:cs="Helvetica"/>
+                <w:rFonts w:ascii="Arial" w:hAnsi="Arial" w:eastAsia="Arial" w:cs="Arial"/>
+                <w:i w:val="false"/>
+                <w:b w:val="false"/>
+                <w:u w:val="none"/>
+                <w:strike w:val="false"/>
+                <w:sz w:val="20"/>
+                <w:szCs w:val="20"/>
+                <w:color w:val="000000"/>
+              </w:rPr>
+              <w:br/>
+            </w:r>
+            <w:r xmlns:w="http://schemas.openxmlformats.org/wordprocessingml/2006/main" xmlns:wp="http://schemas.openxmlformats.org/drawingml/2006/wordprocessingDrawing" xmlns:r="http://schemas.openxmlformats.org/officeDocument/2006/relationships" xmlns:w14="http://schemas.microsoft.com/office/word/2010/wordml">
+              <w:rPr>
+                <w:rFonts w:ascii="Arial" w:hAnsi="Arial" w:eastAsia="Arial" w:cs="Arial"/>
                 <w:i w:val="false"/>
                 <w:b w:val="false"/>
                 <w:u w:val="none"/>
@@ -2720,20 +2776,20 @@
             </w:r>
             <w:r xmlns:w="http://schemas.openxmlformats.org/wordprocessingml/2006/main" xmlns:wp="http://schemas.openxmlformats.org/drawingml/2006/wordprocessingDrawing" xmlns:r="http://schemas.openxmlformats.org/officeDocument/2006/relationships" xmlns:w14="http://schemas.microsoft.com/office/word/2010/wordml">
               <w:rPr>
-                <w:rFonts w:ascii="Helvetica" w:hAnsi="Helvetica" w:eastAsia="Helvetica" w:cs="Helvetica"/>
-                <w:i w:val="false"/>
-                <w:b w:val="false"/>
-                <w:u w:val="none"/>
-                <w:strike w:val="false"/>
-                <w:sz w:val="20"/>
-                <w:szCs w:val="20"/>
-                <w:color w:val="000000"/>
-              </w:rPr>
-              <w:br/>
-            </w:r>
-            <w:r xmlns:w="http://schemas.openxmlformats.org/wordprocessingml/2006/main" xmlns:wp="http://schemas.openxmlformats.org/drawingml/2006/wordprocessingDrawing" xmlns:r="http://schemas.openxmlformats.org/officeDocument/2006/relationships" xmlns:w14="http://schemas.microsoft.com/office/word/2010/wordml">
-              <w:rPr>
-                <w:rFonts w:ascii="Helvetica" w:hAnsi="Helvetica" w:eastAsia="Helvetica" w:cs="Helvetica"/>
+                <w:rFonts w:ascii="Arial" w:hAnsi="Arial" w:eastAsia="Arial" w:cs="Arial"/>
+                <w:i w:val="false"/>
+                <w:b w:val="false"/>
+                <w:u w:val="none"/>
+                <w:strike w:val="false"/>
+                <w:sz w:val="20"/>
+                <w:szCs w:val="20"/>
+                <w:color w:val="000000"/>
+              </w:rPr>
+              <w:br/>
+            </w:r>
+            <w:r xmlns:w="http://schemas.openxmlformats.org/wordprocessingml/2006/main" xmlns:wp="http://schemas.openxmlformats.org/drawingml/2006/wordprocessingDrawing" xmlns:r="http://schemas.openxmlformats.org/officeDocument/2006/relationships" xmlns:w14="http://schemas.microsoft.com/office/word/2010/wordml">
+              <w:rPr>
+                <w:rFonts w:ascii="Arial" w:hAnsi="Arial" w:eastAsia="Arial" w:cs="Arial"/>
                 <w:i w:val="false"/>
                 <w:b w:val="false"/>
                 <w:u w:val="none"/>
@@ -3000,31 +3056,72 @@
         <w:br w:type="page"/>
       </w:r>
     </w:p>
+    <w:bookmarkEnd w:id="20"/>
+    <w:bookmarkStart w:id="21" w:name="step-3-continued-choose-variables-46"/>
+    <w:p>
+      <w:pPr>
+        <w:pStyle w:val="Heading1"/>
+      </w:pPr>
+      <w:r>
+        <w:t xml:space="preserve">Step 3 continued Choose variables 4–6</w:t>
+      </w:r>
+    </w:p>
+    <w:p>
+      <w:pPr>
+        <w:pStyle w:val="FirstParagraph"/>
+      </w:pPr>
+      <w:r>
+        <w:t xml:space="preserve">Variable #4 is required. Variables #5 and #6 are</w:t>
+      </w:r>
+      <w:r>
+        <w:t xml:space="preserve"> </w:t>
+      </w:r>
+      <w:r>
+        <w:rPr>
+          <w:b/>
+          <w:bCs/>
+        </w:rPr>
+        <w:t xml:space="preserve">bonus variables for extra credit</w:t>
+      </w:r>
+      <w:r>
+        <w:t xml:space="preserve">.</w:t>
+      </w:r>
+      <w:r>
+        <w:t xml:space="preserve"> </w:t>
+      </w:r>
+      <w:r>
+        <w:rPr>
+          <w:b/>
+          <w:bCs/>
+        </w:rPr>
+        <w:t xml:space="preserve">Pick one variable from each column. Do not pick your core variable.</w:t>
+      </w:r>
+    </w:p>
     <w:tbl xmlns:w="http://schemas.openxmlformats.org/wordprocessingml/2006/main" xmlns:r="http://schemas.openxmlformats.org/officeDocument/2006/relationships" xmlns:w14="http://schemas.microsoft.com/office/word/2010/wordml" xmlns:wp="http://schemas.openxmlformats.org/drawingml/2006/wordprocessingDrawing" xmlns:a="http://schemas.openxmlformats.org/drawingml/2006/main" xmlns:pic="http://schemas.openxmlformats.org/drawingml/2006/picture">
       <w:tblPr>
         <w:tblLayout w:type="fixed"/>
         <w:jc w:val="center"/>
-        <w:tblLook w:firstRow="1" w:lastRow="0" w:firstColumn="0" w:lastColumn="0" w:noHBand="0" w:noVBand="1"/>
+        <w:tblLook w:firstRow="1" w:lastRow="0" w:firstColumn="0" w:lastColumn="0" w:noHBand="0" w:noVBand="1" w:val="0020"/>
       </w:tblPr>
       <w:tblGrid>
-        <w:gridCol w:w="3744"/>
-        <w:gridCol w:w="3744"/>
-        <w:gridCol w:w="3744"/>
+        <w:gridCol w:w="3120"/>
+        <w:gridCol w:w="3120"/>
+        <w:gridCol w:w="3120"/>
       </w:tblGrid>
       <w:tr>
         <w:trPr>
           <w:trHeight w:val="360" w:hRule="auto"/>
+          <w:tblHeader/>
         </w:trPr>
         <w:tc>
           <w:tcPr>
-            <w:gridSpan w:val="3"/>
             <w:tcBorders>
-              <w:bottom w:val="single" w:sz="8" w:space="0" w:color="000000"/>
+              <w:bottom w:val="single" w:sz="16" w:space="0" w:color="000000"/>
               <w:top w:val="single" w:sz="16" w:space="0" w:color="000000"/>
               <w:left w:val="single" w:sz="16" w:space="0" w:color="000000"/>
-              <w:right w:val="single" w:sz="16" w:space="0" w:color="000000"/>
+              <w:right w:val="single" w:sz="8" w:space="0" w:color="000000"/>
             </w:tcBorders>
-            <w:shd w:val="clear" w:color="auto" w:fill="FFFFFF"/>
+            <w:shd w:val="clear" w:color="auto" w:fill="1F1F1F"/>
             <w:tcMar>
               <w:top w:w="0" w:type="dxa"/>
               <w:bottom w:w="0" w:type="dxa"/>
@@ -3042,17 +3139,17 @@
                 <w:left w:val="none" w:sz="0" w:space="0" w:color="000000"/>
                 <w:right w:val="none" w:sz="0" w:space="0" w:color="000000"/>
               </w:pBdr>
-              <w:spacing w:after="200" w:before="200" w:line="240"/>
-              <w:ind w:left="200" w:right="200" w:firstLine="0" w:firstLineChars="0"/>
-              <w:rPr>
-                <w:rFonts w:ascii="Helvetica" w:hAnsi="Helvetica" w:eastAsia="Helvetica" w:cs="Helvetica"/>
-                <w:i w:val="false"/>
-                <w:b w:val="false"/>
-                <w:u w:val="none"/>
-                <w:strike w:val="false"/>
-                <w:sz w:val="20"/>
-                <w:szCs w:val="20"/>
-                <w:color w:val="000000"/>
+              <w:spacing w:after="100" w:before="100" w:line="240"/>
+              <w:ind w:left="100" w:right="100" w:firstLine="0" w:firstLineChars="0"/>
+              <w:rPr>
+                <w:rFonts w:ascii="Arial" w:hAnsi="Arial" w:eastAsia="Arial" w:cs="Arial"/>
+                <w:i w:val="false"/>
+                <w:b w:val="true"/>
+                <w:u w:val="none"/>
+                <w:strike w:val="false"/>
+                <w:sz w:val="22"/>
+                <w:szCs w:val="22"/>
+                <w:color w:val="FFFFFF"/>
               </w:rPr>
             </w:pPr>
             <w:r xmlns:w="http://schemas.openxmlformats.org/wordprocessingml/2006/main" xmlns:wp="http://schemas.openxmlformats.org/drawingml/2006/wordprocessingDrawing" xmlns:r="http://schemas.openxmlformats.org/officeDocument/2006/relationships" xmlns:w14="http://schemas.microsoft.com/office/word/2010/wordml">
@@ -3062,51 +3159,53 @@
                 <w:b w:val="true"/>
                 <w:u w:val="none"/>
                 <w:strike w:val="false"/>
-                <w:sz w:val="20"/>
-                <w:szCs w:val="20"/>
-                <w:color w:val="000000"/>
-              </w:rPr>
-              <w:t xml:space="preserve">Step #3 (continued) – </w:t>
-            </w:r>
-            <w:r xmlns:w="http://schemas.openxmlformats.org/wordprocessingml/2006/main" xmlns:wp="http://schemas.openxmlformats.org/drawingml/2006/wordprocessingDrawing" xmlns:r="http://schemas.openxmlformats.org/officeDocument/2006/relationships" xmlns:w14="http://schemas.microsoft.com/office/word/2010/wordml">
-              <w:rPr>
-                <w:rFonts w:ascii="Helvetica" w:hAnsi="Helvetica" w:eastAsia="Helvetica" w:cs="Helvetica"/>
-                <w:i w:val="false"/>
-                <w:b w:val="false"/>
-                <w:u w:val="none"/>
-                <w:strike w:val="false"/>
-                <w:sz w:val="20"/>
-                <w:szCs w:val="20"/>
-                <w:color w:val="000000"/>
-              </w:rPr>
-              <w:t xml:space="preserve">Variable #4 is required. Variables #5 and #6 are </w:t>
-            </w:r>
-            <w:r xmlns:w="http://schemas.openxmlformats.org/wordprocessingml/2006/main" xmlns:wp="http://schemas.openxmlformats.org/drawingml/2006/wordprocessingDrawing" xmlns:r="http://schemas.openxmlformats.org/officeDocument/2006/relationships" xmlns:w14="http://schemas.microsoft.com/office/word/2010/wordml">
+                <w:sz w:val="22"/>
+                <w:szCs w:val="22"/>
+                <w:color w:val="FFFFFF"/>
+              </w:rPr>
+              <w:t xml:space="preserve">Variable #4 Categorical</w:t>
+            </w:r>
+          </w:p>
+        </w:tc>
+        <w:tc>
+          <w:tcPr>
+            <w:tcBorders>
+              <w:bottom w:val="single" w:sz="16" w:space="0" w:color="000000"/>
+              <w:top w:val="single" w:sz="16" w:space="0" w:color="000000"/>
+              <w:left w:val="single" w:sz="8" w:space="0" w:color="000000"/>
+              <w:right w:val="single" w:sz="8" w:space="0" w:color="000000"/>
+            </w:tcBorders>
+            <w:shd w:val="clear" w:color="auto" w:fill="1F1F1F"/>
+            <w:tcMar>
+              <w:top w:w="0" w:type="dxa"/>
+              <w:bottom w:w="0" w:type="dxa"/>
+              <w:left w:w="0" w:type="dxa"/>
+              <w:right w:w="0" w:type="dxa"/>
+            </w:tcMar>
+            <w:vAlign w:val="top"/>
+          </w:tcPr>
+          <w:p>
+            <w:pPr>
+              <w:jc w:val="left"/>
+              <w:pBdr>
+                <w:bottom w:val="none" w:sz="0" w:space="0" w:color="000000"/>
+                <w:top w:val="none" w:sz="0" w:space="0" w:color="000000"/>
+                <w:left w:val="none" w:sz="0" w:space="0" w:color="000000"/>
+                <w:right w:val="none" w:sz="0" w:space="0" w:color="000000"/>
+              </w:pBdr>
+              <w:spacing w:after="100" w:before="100" w:line="240"/>
+              <w:ind w:left="100" w:right="100" w:firstLine="0" w:firstLineChars="0"/>
               <w:rPr>
                 <w:rFonts w:ascii="Arial" w:hAnsi="Arial" w:eastAsia="Arial" w:cs="Arial"/>
                 <w:i w:val="false"/>
                 <w:b w:val="true"/>
                 <w:u w:val="none"/>
                 <w:strike w:val="false"/>
-                <w:sz w:val="20"/>
-                <w:szCs w:val="20"/>
-                <w:color w:val="000000"/>
-              </w:rPr>
-              <w:t xml:space="preserve">bonus</w:t>
-            </w:r>
-            <w:r xmlns:w="http://schemas.openxmlformats.org/wordprocessingml/2006/main" xmlns:wp="http://schemas.openxmlformats.org/drawingml/2006/wordprocessingDrawing" xmlns:r="http://schemas.openxmlformats.org/officeDocument/2006/relationships" xmlns:w14="http://schemas.microsoft.com/office/word/2010/wordml">
-              <w:rPr>
-                <w:rFonts w:ascii="Helvetica" w:hAnsi="Helvetica" w:eastAsia="Helvetica" w:cs="Helvetica"/>
-                <w:i w:val="false"/>
-                <w:b w:val="false"/>
-                <w:u w:val="none"/>
-                <w:strike w:val="false"/>
-                <w:sz w:val="20"/>
-                <w:szCs w:val="20"/>
-                <w:color w:val="000000"/>
-              </w:rPr>
-              <w:t xml:space="preserve"> variables for extra credit. </w:t>
-            </w:r>
+                <w:sz w:val="22"/>
+                <w:szCs w:val="22"/>
+                <w:color w:val="FFFFFF"/>
+              </w:rPr>
+            </w:pPr>
             <w:r xmlns:w="http://schemas.openxmlformats.org/wordprocessingml/2006/main" xmlns:wp="http://schemas.openxmlformats.org/drawingml/2006/wordprocessingDrawing" xmlns:r="http://schemas.openxmlformats.org/officeDocument/2006/relationships" xmlns:w14="http://schemas.microsoft.com/office/word/2010/wordml">
               <w:rPr>
                 <w:rFonts w:ascii="Arial" w:hAnsi="Arial" w:eastAsia="Arial" w:cs="Arial"/>
@@ -3114,11 +3213,65 @@
                 <w:b w:val="true"/>
                 <w:u w:val="none"/>
                 <w:strike w:val="false"/>
-                <w:sz w:val="20"/>
-                <w:szCs w:val="20"/>
-                <w:color w:val="000000"/>
-              </w:rPr>
-              <w:t xml:space="preserve">Pick one variable from each column (Do not pick your "core variable"!)</w:t>
+                <w:sz w:val="22"/>
+                <w:szCs w:val="22"/>
+                <w:color w:val="FFFFFF"/>
+              </w:rPr>
+              <w:t xml:space="preserve">Bonus Variable #5 Quantitative</w:t>
+            </w:r>
+          </w:p>
+        </w:tc>
+        <w:tc>
+          <w:tcPr>
+            <w:tcBorders>
+              <w:bottom w:val="single" w:sz="16" w:space="0" w:color="000000"/>
+              <w:top w:val="single" w:sz="16" w:space="0" w:color="000000"/>
+              <w:left w:val="single" w:sz="8" w:space="0" w:color="000000"/>
+              <w:right w:val="single" w:sz="16" w:space="0" w:color="000000"/>
+            </w:tcBorders>
+            <w:shd w:val="clear" w:color="auto" w:fill="1F1F1F"/>
+            <w:tcMar>
+              <w:top w:w="0" w:type="dxa"/>
+              <w:bottom w:w="0" w:type="dxa"/>
+              <w:left w:w="0" w:type="dxa"/>
+              <w:right w:w="0" w:type="dxa"/>
+            </w:tcMar>
+            <w:vAlign w:val="top"/>
+          </w:tcPr>
+          <w:p>
+            <w:pPr>
+              <w:jc w:val="left"/>
+              <w:pBdr>
+                <w:bottom w:val="none" w:sz="0" w:space="0" w:color="000000"/>
+                <w:top w:val="none" w:sz="0" w:space="0" w:color="000000"/>
+                <w:left w:val="none" w:sz="0" w:space="0" w:color="000000"/>
+                <w:right w:val="none" w:sz="0" w:space="0" w:color="000000"/>
+              </w:pBdr>
+              <w:spacing w:after="100" w:before="100" w:line="240"/>
+              <w:ind w:left="100" w:right="100" w:firstLine="0" w:firstLineChars="0"/>
+              <w:rPr>
+                <w:rFonts w:ascii="Arial" w:hAnsi="Arial" w:eastAsia="Arial" w:cs="Arial"/>
+                <w:i w:val="false"/>
+                <w:b w:val="true"/>
+                <w:u w:val="none"/>
+                <w:strike w:val="false"/>
+                <w:sz w:val="22"/>
+                <w:szCs w:val="22"/>
+                <w:color w:val="FFFFFF"/>
+              </w:rPr>
+            </w:pPr>
+            <w:r xmlns:w="http://schemas.openxmlformats.org/wordprocessingml/2006/main" xmlns:wp="http://schemas.openxmlformats.org/drawingml/2006/wordprocessingDrawing" xmlns:r="http://schemas.openxmlformats.org/officeDocument/2006/relationships" xmlns:w14="http://schemas.microsoft.com/office/word/2010/wordml">
+              <w:rPr>
+                <w:rFonts w:ascii="Arial" w:hAnsi="Arial" w:eastAsia="Arial" w:cs="Arial"/>
+                <w:i w:val="false"/>
+                <w:b w:val="true"/>
+                <w:u w:val="none"/>
+                <w:strike w:val="false"/>
+                <w:sz w:val="22"/>
+                <w:szCs w:val="22"/>
+                <w:color w:val="FFFFFF"/>
+              </w:rPr>
+              <w:t xml:space="preserve">Bonus Variable #6 Categorical</w:t>
             </w:r>
           </w:p>
         </w:tc>
@@ -3131,7 +3284,7 @@
           <w:tcPr>
             <w:tcBorders>
               <w:bottom w:val="single" w:sz="16" w:space="0" w:color="000000"/>
-              <w:top w:val="single" w:sz="8" w:space="0" w:color="000000"/>
+              <w:top w:val="single" w:sz="16" w:space="0" w:color="000000"/>
               <w:left w:val="single" w:sz="16" w:space="0" w:color="000000"/>
               <w:right w:val="single" w:sz="8" w:space="0" w:color="000000"/>
             </w:tcBorders>
@@ -3156,7 +3309,7 @@
               <w:spacing w:after="200" w:before="200" w:line="240"/>
               <w:ind w:left="200" w:right="200" w:firstLine="0" w:firstLineChars="0"/>
               <w:rPr>
-                <w:rFonts w:ascii="Helvetica" w:hAnsi="Helvetica" w:eastAsia="Helvetica" w:cs="Helvetica"/>
+                <w:rFonts w:ascii="Arial" w:hAnsi="Arial" w:eastAsia="Arial" w:cs="Arial"/>
                 <w:i w:val="false"/>
                 <w:b w:val="false"/>
                 <w:u w:val="none"/>
@@ -3166,45 +3319,6 @@
                 <w:color w:val="000000"/>
               </w:rPr>
             </w:pPr>
-            <w:r xmlns:w="http://schemas.openxmlformats.org/wordprocessingml/2006/main" xmlns:wp="http://schemas.openxmlformats.org/drawingml/2006/wordprocessingDrawing" xmlns:r="http://schemas.openxmlformats.org/officeDocument/2006/relationships" xmlns:w14="http://schemas.microsoft.com/office/word/2010/wordml">
-              <w:rPr>
-                <w:rFonts w:ascii="Arial" w:hAnsi="Arial" w:eastAsia="Arial" w:cs="Arial"/>
-                <w:i w:val="false"/>
-                <w:b w:val="true"/>
-                <w:u w:val="none"/>
-                <w:strike w:val="false"/>
-                <w:sz w:val="22"/>
-                <w:szCs w:val="22"/>
-                <w:color w:val="000000"/>
-              </w:rPr>
-              <w:t xml:space="preserve">Variable #4 Categorical</w:t>
-            </w:r>
-            <w:r xmlns:w="http://schemas.openxmlformats.org/wordprocessingml/2006/main" xmlns:wp="http://schemas.openxmlformats.org/drawingml/2006/wordprocessingDrawing" xmlns:r="http://schemas.openxmlformats.org/officeDocument/2006/relationships" xmlns:w14="http://schemas.microsoft.com/office/word/2010/wordml">
-              <w:rPr>
-                <w:rFonts w:ascii="Helvetica" w:hAnsi="Helvetica" w:eastAsia="Helvetica" w:cs="Helvetica"/>
-                <w:i w:val="false"/>
-                <w:b w:val="false"/>
-                <w:u w:val="none"/>
-                <w:strike w:val="false"/>
-                <w:sz w:val="20"/>
-                <w:szCs w:val="20"/>
-                <w:color w:val="000000"/>
-              </w:rPr>
-              <w:br/>
-            </w:r>
-            <w:r xmlns:w="http://schemas.openxmlformats.org/wordprocessingml/2006/main" xmlns:wp="http://schemas.openxmlformats.org/drawingml/2006/wordprocessingDrawing" xmlns:r="http://schemas.openxmlformats.org/officeDocument/2006/relationships" xmlns:w14="http://schemas.microsoft.com/office/word/2010/wordml">
-              <w:rPr>
-                <w:rFonts w:ascii="Helvetica" w:hAnsi="Helvetica" w:eastAsia="Helvetica" w:cs="Helvetica"/>
-                <w:i w:val="false"/>
-                <w:b w:val="false"/>
-                <w:u w:val="none"/>
-                <w:strike w:val="false"/>
-                <w:sz w:val="20"/>
-                <w:szCs w:val="20"/>
-                <w:color w:val="000000"/>
-              </w:rPr>
-              <w:br/>
-            </w:r>
             <w:r xmlns:w="http://schemas.openxmlformats.org/wordprocessingml/2006/main" xmlns:wp="http://schemas.openxmlformats.org/drawingml/2006/wordprocessingDrawing" xmlns:r="http://schemas.openxmlformats.org/officeDocument/2006/relationships" xmlns:w14="http://schemas.microsoft.com/office/word/2010/wordml">
               <w:rPr>
                 <w:rFonts w:ascii="Arial" w:hAnsi="Arial" w:eastAsia="Arial" w:cs="Arial"/>
@@ -3220,20 +3334,20 @@
             </w:r>
             <w:r xmlns:w="http://schemas.openxmlformats.org/wordprocessingml/2006/main" xmlns:wp="http://schemas.openxmlformats.org/drawingml/2006/wordprocessingDrawing" xmlns:r="http://schemas.openxmlformats.org/officeDocument/2006/relationships" xmlns:w14="http://schemas.microsoft.com/office/word/2010/wordml">
               <w:rPr>
-                <w:rFonts w:ascii="Helvetica" w:hAnsi="Helvetica" w:eastAsia="Helvetica" w:cs="Helvetica"/>
-                <w:i w:val="false"/>
-                <w:b w:val="false"/>
-                <w:u w:val="none"/>
-                <w:strike w:val="false"/>
-                <w:sz w:val="20"/>
-                <w:szCs w:val="20"/>
-                <w:color w:val="000000"/>
-              </w:rPr>
-              <w:br/>
-            </w:r>
-            <w:r xmlns:w="http://schemas.openxmlformats.org/wordprocessingml/2006/main" xmlns:wp="http://schemas.openxmlformats.org/drawingml/2006/wordprocessingDrawing" xmlns:r="http://schemas.openxmlformats.org/officeDocument/2006/relationships" xmlns:w14="http://schemas.microsoft.com/office/word/2010/wordml">
-              <w:rPr>
-                <w:rFonts w:ascii="Helvetica" w:hAnsi="Helvetica" w:eastAsia="Helvetica" w:cs="Helvetica"/>
+                <w:rFonts w:ascii="Arial" w:hAnsi="Arial" w:eastAsia="Arial" w:cs="Arial"/>
+                <w:i w:val="false"/>
+                <w:b w:val="false"/>
+                <w:u w:val="none"/>
+                <w:strike w:val="false"/>
+                <w:sz w:val="20"/>
+                <w:szCs w:val="20"/>
+                <w:color w:val="000000"/>
+              </w:rPr>
+              <w:br/>
+            </w:r>
+            <w:r xmlns:w="http://schemas.openxmlformats.org/wordprocessingml/2006/main" xmlns:wp="http://schemas.openxmlformats.org/drawingml/2006/wordprocessingDrawing" xmlns:r="http://schemas.openxmlformats.org/officeDocument/2006/relationships" xmlns:w14="http://schemas.microsoft.com/office/word/2010/wordml">
+              <w:rPr>
+                <w:rFonts w:ascii="Arial" w:hAnsi="Arial" w:eastAsia="Arial" w:cs="Arial"/>
                 <w:i w:val="false"/>
                 <w:b w:val="false"/>
                 <w:u w:val="none"/>
@@ -3259,20 +3373,20 @@
             </w:r>
             <w:r xmlns:w="http://schemas.openxmlformats.org/wordprocessingml/2006/main" xmlns:wp="http://schemas.openxmlformats.org/drawingml/2006/wordprocessingDrawing" xmlns:r="http://schemas.openxmlformats.org/officeDocument/2006/relationships" xmlns:w14="http://schemas.microsoft.com/office/word/2010/wordml">
               <w:rPr>
-                <w:rFonts w:ascii="Helvetica" w:hAnsi="Helvetica" w:eastAsia="Helvetica" w:cs="Helvetica"/>
-                <w:i w:val="false"/>
-                <w:b w:val="false"/>
-                <w:u w:val="none"/>
-                <w:strike w:val="false"/>
-                <w:sz w:val="20"/>
-                <w:szCs w:val="20"/>
-                <w:color w:val="000000"/>
-              </w:rPr>
-              <w:br/>
-            </w:r>
-            <w:r xmlns:w="http://schemas.openxmlformats.org/wordprocessingml/2006/main" xmlns:wp="http://schemas.openxmlformats.org/drawingml/2006/wordprocessingDrawing" xmlns:r="http://schemas.openxmlformats.org/officeDocument/2006/relationships" xmlns:w14="http://schemas.microsoft.com/office/word/2010/wordml">
-              <w:rPr>
-                <w:rFonts w:ascii="Helvetica" w:hAnsi="Helvetica" w:eastAsia="Helvetica" w:cs="Helvetica"/>
+                <w:rFonts w:ascii="Arial" w:hAnsi="Arial" w:eastAsia="Arial" w:cs="Arial"/>
+                <w:i w:val="false"/>
+                <w:b w:val="false"/>
+                <w:u w:val="none"/>
+                <w:strike w:val="false"/>
+                <w:sz w:val="20"/>
+                <w:szCs w:val="20"/>
+                <w:color w:val="000000"/>
+              </w:rPr>
+              <w:br/>
+            </w:r>
+            <w:r xmlns:w="http://schemas.openxmlformats.org/wordprocessingml/2006/main" xmlns:wp="http://schemas.openxmlformats.org/drawingml/2006/wordprocessingDrawing" xmlns:r="http://schemas.openxmlformats.org/officeDocument/2006/relationships" xmlns:w14="http://schemas.microsoft.com/office/word/2010/wordml">
+              <w:rPr>
+                <w:rFonts w:ascii="Arial" w:hAnsi="Arial" w:eastAsia="Arial" w:cs="Arial"/>
                 <w:i w:val="false"/>
                 <w:b w:val="false"/>
                 <w:u w:val="none"/>
@@ -3536,7 +3650,7 @@
           <w:tcPr>
             <w:tcBorders>
               <w:bottom w:val="single" w:sz="16" w:space="0" w:color="000000"/>
-              <w:top w:val="single" w:sz="8" w:space="0" w:color="000000"/>
+              <w:top w:val="single" w:sz="16" w:space="0" w:color="000000"/>
               <w:left w:val="single" w:sz="8" w:space="0" w:color="000000"/>
               <w:right w:val="single" w:sz="8" w:space="0" w:color="000000"/>
             </w:tcBorders>
@@ -3561,7 +3675,7 @@
               <w:spacing w:after="200" w:before="200" w:line="240"/>
               <w:ind w:left="200" w:right="200" w:firstLine="0" w:firstLineChars="0"/>
               <w:rPr>
-                <w:rFonts w:ascii="Helvetica" w:hAnsi="Helvetica" w:eastAsia="Helvetica" w:cs="Helvetica"/>
+                <w:rFonts w:ascii="Arial" w:hAnsi="Arial" w:eastAsia="Arial" w:cs="Arial"/>
                 <w:i w:val="false"/>
                 <w:b w:val="false"/>
                 <w:u w:val="none"/>
@@ -3571,45 +3685,6 @@
                 <w:color w:val="000000"/>
               </w:rPr>
             </w:pPr>
-            <w:r xmlns:w="http://schemas.openxmlformats.org/wordprocessingml/2006/main" xmlns:wp="http://schemas.openxmlformats.org/drawingml/2006/wordprocessingDrawing" xmlns:r="http://schemas.openxmlformats.org/officeDocument/2006/relationships" xmlns:w14="http://schemas.microsoft.com/office/word/2010/wordml">
-              <w:rPr>
-                <w:rFonts w:ascii="Arial" w:hAnsi="Arial" w:eastAsia="Arial" w:cs="Arial"/>
-                <w:i w:val="false"/>
-                <w:b w:val="true"/>
-                <w:u w:val="none"/>
-                <w:strike w:val="false"/>
-                <w:sz w:val="22"/>
-                <w:szCs w:val="22"/>
-                <w:color w:val="000000"/>
-              </w:rPr>
-              <w:t xml:space="preserve">Bonus Variable #5 Quantitative</w:t>
-            </w:r>
-            <w:r xmlns:w="http://schemas.openxmlformats.org/wordprocessingml/2006/main" xmlns:wp="http://schemas.openxmlformats.org/drawingml/2006/wordprocessingDrawing" xmlns:r="http://schemas.openxmlformats.org/officeDocument/2006/relationships" xmlns:w14="http://schemas.microsoft.com/office/word/2010/wordml">
-              <w:rPr>
-                <w:rFonts w:ascii="Helvetica" w:hAnsi="Helvetica" w:eastAsia="Helvetica" w:cs="Helvetica"/>
-                <w:i w:val="false"/>
-                <w:b w:val="false"/>
-                <w:u w:val="none"/>
-                <w:strike w:val="false"/>
-                <w:sz w:val="20"/>
-                <w:szCs w:val="20"/>
-                <w:color w:val="000000"/>
-              </w:rPr>
-              <w:br/>
-            </w:r>
-            <w:r xmlns:w="http://schemas.openxmlformats.org/wordprocessingml/2006/main" xmlns:wp="http://schemas.openxmlformats.org/drawingml/2006/wordprocessingDrawing" xmlns:r="http://schemas.openxmlformats.org/officeDocument/2006/relationships" xmlns:w14="http://schemas.microsoft.com/office/word/2010/wordml">
-              <w:rPr>
-                <w:rFonts w:ascii="Helvetica" w:hAnsi="Helvetica" w:eastAsia="Helvetica" w:cs="Helvetica"/>
-                <w:i w:val="false"/>
-                <w:b w:val="false"/>
-                <w:u w:val="none"/>
-                <w:strike w:val="false"/>
-                <w:sz w:val="20"/>
-                <w:szCs w:val="20"/>
-                <w:color w:val="000000"/>
-              </w:rPr>
-              <w:br/>
-            </w:r>
             <w:r xmlns:w="http://schemas.openxmlformats.org/wordprocessingml/2006/main" xmlns:wp="http://schemas.openxmlformats.org/drawingml/2006/wordprocessingDrawing" xmlns:r="http://schemas.openxmlformats.org/officeDocument/2006/relationships" xmlns:w14="http://schemas.microsoft.com/office/word/2010/wordml">
               <w:rPr>
                 <w:rFonts w:ascii="Arial" w:hAnsi="Arial" w:eastAsia="Arial" w:cs="Arial"/>
@@ -3625,20 +3700,20 @@
             </w:r>
             <w:r xmlns:w="http://schemas.openxmlformats.org/wordprocessingml/2006/main" xmlns:wp="http://schemas.openxmlformats.org/drawingml/2006/wordprocessingDrawing" xmlns:r="http://schemas.openxmlformats.org/officeDocument/2006/relationships" xmlns:w14="http://schemas.microsoft.com/office/word/2010/wordml">
               <w:rPr>
-                <w:rFonts w:ascii="Helvetica" w:hAnsi="Helvetica" w:eastAsia="Helvetica" w:cs="Helvetica"/>
-                <w:i w:val="false"/>
-                <w:b w:val="false"/>
-                <w:u w:val="none"/>
-                <w:strike w:val="false"/>
-                <w:sz w:val="20"/>
-                <w:szCs w:val="20"/>
-                <w:color w:val="000000"/>
-              </w:rPr>
-              <w:br/>
-            </w:r>
-            <w:r xmlns:w="http://schemas.openxmlformats.org/wordprocessingml/2006/main" xmlns:wp="http://schemas.openxmlformats.org/drawingml/2006/wordprocessingDrawing" xmlns:r="http://schemas.openxmlformats.org/officeDocument/2006/relationships" xmlns:w14="http://schemas.microsoft.com/office/word/2010/wordml">
-              <w:rPr>
-                <w:rFonts w:ascii="Helvetica" w:hAnsi="Helvetica" w:eastAsia="Helvetica" w:cs="Helvetica"/>
+                <w:rFonts w:ascii="Arial" w:hAnsi="Arial" w:eastAsia="Arial" w:cs="Arial"/>
+                <w:i w:val="false"/>
+                <w:b w:val="false"/>
+                <w:u w:val="none"/>
+                <w:strike w:val="false"/>
+                <w:sz w:val="20"/>
+                <w:szCs w:val="20"/>
+                <w:color w:val="000000"/>
+              </w:rPr>
+              <w:br/>
+            </w:r>
+            <w:r xmlns:w="http://schemas.openxmlformats.org/wordprocessingml/2006/main" xmlns:wp="http://schemas.openxmlformats.org/drawingml/2006/wordprocessingDrawing" xmlns:r="http://schemas.openxmlformats.org/officeDocument/2006/relationships" xmlns:w14="http://schemas.microsoft.com/office/word/2010/wordml">
+              <w:rPr>
+                <w:rFonts w:ascii="Arial" w:hAnsi="Arial" w:eastAsia="Arial" w:cs="Arial"/>
                 <w:i w:val="false"/>
                 <w:b w:val="false"/>
                 <w:u w:val="none"/>
@@ -3664,20 +3739,20 @@
             </w:r>
             <w:r xmlns:w="http://schemas.openxmlformats.org/wordprocessingml/2006/main" xmlns:wp="http://schemas.openxmlformats.org/drawingml/2006/wordprocessingDrawing" xmlns:r="http://schemas.openxmlformats.org/officeDocument/2006/relationships" xmlns:w14="http://schemas.microsoft.com/office/word/2010/wordml">
               <w:rPr>
-                <w:rFonts w:ascii="Helvetica" w:hAnsi="Helvetica" w:eastAsia="Helvetica" w:cs="Helvetica"/>
-                <w:i w:val="false"/>
-                <w:b w:val="false"/>
-                <w:u w:val="none"/>
-                <w:strike w:val="false"/>
-                <w:sz w:val="20"/>
-                <w:szCs w:val="20"/>
-                <w:color w:val="000000"/>
-              </w:rPr>
-              <w:br/>
-            </w:r>
-            <w:r xmlns:w="http://schemas.openxmlformats.org/wordprocessingml/2006/main" xmlns:wp="http://schemas.openxmlformats.org/drawingml/2006/wordprocessingDrawing" xmlns:r="http://schemas.openxmlformats.org/officeDocument/2006/relationships" xmlns:w14="http://schemas.microsoft.com/office/word/2010/wordml">
-              <w:rPr>
-                <w:rFonts w:ascii="Helvetica" w:hAnsi="Helvetica" w:eastAsia="Helvetica" w:cs="Helvetica"/>
+                <w:rFonts w:ascii="Arial" w:hAnsi="Arial" w:eastAsia="Arial" w:cs="Arial"/>
+                <w:i w:val="false"/>
+                <w:b w:val="false"/>
+                <w:u w:val="none"/>
+                <w:strike w:val="false"/>
+                <w:sz w:val="20"/>
+                <w:szCs w:val="20"/>
+                <w:color w:val="000000"/>
+              </w:rPr>
+              <w:br/>
+            </w:r>
+            <w:r xmlns:w="http://schemas.openxmlformats.org/wordprocessingml/2006/main" xmlns:wp="http://schemas.openxmlformats.org/drawingml/2006/wordprocessingDrawing" xmlns:r="http://schemas.openxmlformats.org/officeDocument/2006/relationships" xmlns:w14="http://schemas.microsoft.com/office/word/2010/wordml">
+              <w:rPr>
+                <w:rFonts w:ascii="Arial" w:hAnsi="Arial" w:eastAsia="Arial" w:cs="Arial"/>
                 <w:i w:val="false"/>
                 <w:b w:val="false"/>
                 <w:u w:val="none"/>
@@ -4279,7 +4354,7 @@
           <w:tcPr>
             <w:tcBorders>
               <w:bottom w:val="single" w:sz="16" w:space="0" w:color="000000"/>
-              <w:top w:val="single" w:sz="8" w:space="0" w:color="000000"/>
+              <w:top w:val="single" w:sz="16" w:space="0" w:color="000000"/>
               <w:left w:val="single" w:sz="8" w:space="0" w:color="000000"/>
               <w:right w:val="single" w:sz="16" w:space="0" w:color="000000"/>
             </w:tcBorders>
@@ -4304,7 +4379,7 @@
               <w:spacing w:after="200" w:before="200" w:line="240"/>
               <w:ind w:left="200" w:right="200" w:firstLine="0" w:firstLineChars="0"/>
               <w:rPr>
-                <w:rFonts w:ascii="Helvetica" w:hAnsi="Helvetica" w:eastAsia="Helvetica" w:cs="Helvetica"/>
+                <w:rFonts w:ascii="Arial" w:hAnsi="Arial" w:eastAsia="Arial" w:cs="Arial"/>
                 <w:i w:val="false"/>
                 <w:b w:val="false"/>
                 <w:u w:val="none"/>
@@ -4314,45 +4389,6 @@
                 <w:color w:val="000000"/>
               </w:rPr>
             </w:pPr>
-            <w:r xmlns:w="http://schemas.openxmlformats.org/wordprocessingml/2006/main" xmlns:wp="http://schemas.openxmlformats.org/drawingml/2006/wordprocessingDrawing" xmlns:r="http://schemas.openxmlformats.org/officeDocument/2006/relationships" xmlns:w14="http://schemas.microsoft.com/office/word/2010/wordml">
-              <w:rPr>
-                <w:rFonts w:ascii="Arial" w:hAnsi="Arial" w:eastAsia="Arial" w:cs="Arial"/>
-                <w:i w:val="false"/>
-                <w:b w:val="true"/>
-                <w:u w:val="none"/>
-                <w:strike w:val="false"/>
-                <w:sz w:val="22"/>
-                <w:szCs w:val="22"/>
-                <w:color w:val="000000"/>
-              </w:rPr>
-              <w:t xml:space="preserve">Bonus Variable #6 Categorical</w:t>
-            </w:r>
-            <w:r xmlns:w="http://schemas.openxmlformats.org/wordprocessingml/2006/main" xmlns:wp="http://schemas.openxmlformats.org/drawingml/2006/wordprocessingDrawing" xmlns:r="http://schemas.openxmlformats.org/officeDocument/2006/relationships" xmlns:w14="http://schemas.microsoft.com/office/word/2010/wordml">
-              <w:rPr>
-                <w:rFonts w:ascii="Helvetica" w:hAnsi="Helvetica" w:eastAsia="Helvetica" w:cs="Helvetica"/>
-                <w:i w:val="false"/>
-                <w:b w:val="false"/>
-                <w:u w:val="none"/>
-                <w:strike w:val="false"/>
-                <w:sz w:val="20"/>
-                <w:szCs w:val="20"/>
-                <w:color w:val="000000"/>
-              </w:rPr>
-              <w:br/>
-            </w:r>
-            <w:r xmlns:w="http://schemas.openxmlformats.org/wordprocessingml/2006/main" xmlns:wp="http://schemas.openxmlformats.org/drawingml/2006/wordprocessingDrawing" xmlns:r="http://schemas.openxmlformats.org/officeDocument/2006/relationships" xmlns:w14="http://schemas.microsoft.com/office/word/2010/wordml">
-              <w:rPr>
-                <w:rFonts w:ascii="Helvetica" w:hAnsi="Helvetica" w:eastAsia="Helvetica" w:cs="Helvetica"/>
-                <w:i w:val="false"/>
-                <w:b w:val="false"/>
-                <w:u w:val="none"/>
-                <w:strike w:val="false"/>
-                <w:sz w:val="20"/>
-                <w:szCs w:val="20"/>
-                <w:color w:val="000000"/>
-              </w:rPr>
-              <w:br/>
-            </w:r>
             <w:r xmlns:w="http://schemas.openxmlformats.org/wordprocessingml/2006/main" xmlns:wp="http://schemas.openxmlformats.org/drawingml/2006/wordprocessingDrawing" xmlns:r="http://schemas.openxmlformats.org/officeDocument/2006/relationships" xmlns:w14="http://schemas.microsoft.com/office/word/2010/wordml">
               <w:rPr>
                 <w:rFonts w:ascii="Arial" w:hAnsi="Arial" w:eastAsia="Arial" w:cs="Arial"/>
@@ -4368,20 +4404,20 @@
             </w:r>
             <w:r xmlns:w="http://schemas.openxmlformats.org/wordprocessingml/2006/main" xmlns:wp="http://schemas.openxmlformats.org/drawingml/2006/wordprocessingDrawing" xmlns:r="http://schemas.openxmlformats.org/officeDocument/2006/relationships" xmlns:w14="http://schemas.microsoft.com/office/word/2010/wordml">
               <w:rPr>
-                <w:rFonts w:ascii="Helvetica" w:hAnsi="Helvetica" w:eastAsia="Helvetica" w:cs="Helvetica"/>
-                <w:i w:val="false"/>
-                <w:b w:val="false"/>
-                <w:u w:val="none"/>
-                <w:strike w:val="false"/>
-                <w:sz w:val="20"/>
-                <w:szCs w:val="20"/>
-                <w:color w:val="000000"/>
-              </w:rPr>
-              <w:br/>
-            </w:r>
-            <w:r xmlns:w="http://schemas.openxmlformats.org/wordprocessingml/2006/main" xmlns:wp="http://schemas.openxmlformats.org/drawingml/2006/wordprocessingDrawing" xmlns:r="http://schemas.openxmlformats.org/officeDocument/2006/relationships" xmlns:w14="http://schemas.microsoft.com/office/word/2010/wordml">
-              <w:rPr>
-                <w:rFonts w:ascii="Helvetica" w:hAnsi="Helvetica" w:eastAsia="Helvetica" w:cs="Helvetica"/>
+                <w:rFonts w:ascii="Arial" w:hAnsi="Arial" w:eastAsia="Arial" w:cs="Arial"/>
+                <w:i w:val="false"/>
+                <w:b w:val="false"/>
+                <w:u w:val="none"/>
+                <w:strike w:val="false"/>
+                <w:sz w:val="20"/>
+                <w:szCs w:val="20"/>
+                <w:color w:val="000000"/>
+              </w:rPr>
+              <w:br/>
+            </w:r>
+            <w:r xmlns:w="http://schemas.openxmlformats.org/wordprocessingml/2006/main" xmlns:wp="http://schemas.openxmlformats.org/drawingml/2006/wordprocessingDrawing" xmlns:r="http://schemas.openxmlformats.org/officeDocument/2006/relationships" xmlns:w14="http://schemas.microsoft.com/office/word/2010/wordml">
+              <w:rPr>
+                <w:rFonts w:ascii="Arial" w:hAnsi="Arial" w:eastAsia="Arial" w:cs="Arial"/>
                 <w:i w:val="false"/>
                 <w:b w:val="false"/>
                 <w:u w:val="none"/>
@@ -4407,20 +4443,20 @@
             </w:r>
             <w:r xmlns:w="http://schemas.openxmlformats.org/wordprocessingml/2006/main" xmlns:wp="http://schemas.openxmlformats.org/drawingml/2006/wordprocessingDrawing" xmlns:r="http://schemas.openxmlformats.org/officeDocument/2006/relationships" xmlns:w14="http://schemas.microsoft.com/office/word/2010/wordml">
               <w:rPr>
-                <w:rFonts w:ascii="Helvetica" w:hAnsi="Helvetica" w:eastAsia="Helvetica" w:cs="Helvetica"/>
-                <w:i w:val="false"/>
-                <w:b w:val="false"/>
-                <w:u w:val="none"/>
-                <w:strike w:val="false"/>
-                <w:sz w:val="20"/>
-                <w:szCs w:val="20"/>
-                <w:color w:val="000000"/>
-              </w:rPr>
-              <w:br/>
-            </w:r>
-            <w:r xmlns:w="http://schemas.openxmlformats.org/wordprocessingml/2006/main" xmlns:wp="http://schemas.openxmlformats.org/drawingml/2006/wordprocessingDrawing" xmlns:r="http://schemas.openxmlformats.org/officeDocument/2006/relationships" xmlns:w14="http://schemas.microsoft.com/office/word/2010/wordml">
-              <w:rPr>
-                <w:rFonts w:ascii="Helvetica" w:hAnsi="Helvetica" w:eastAsia="Helvetica" w:cs="Helvetica"/>
+                <w:rFonts w:ascii="Arial" w:hAnsi="Arial" w:eastAsia="Arial" w:cs="Arial"/>
+                <w:i w:val="false"/>
+                <w:b w:val="false"/>
+                <w:u w:val="none"/>
+                <w:strike w:val="false"/>
+                <w:sz w:val="20"/>
+                <w:szCs w:val="20"/>
+                <w:color w:val="000000"/>
+              </w:rPr>
+              <w:br/>
+            </w:r>
+            <w:r xmlns:w="http://schemas.openxmlformats.org/wordprocessingml/2006/main" xmlns:wp="http://schemas.openxmlformats.org/drawingml/2006/wordprocessingDrawing" xmlns:r="http://schemas.openxmlformats.org/officeDocument/2006/relationships" xmlns:w14="http://schemas.microsoft.com/office/word/2010/wordml">
+              <w:rPr>
+                <w:rFonts w:ascii="Arial" w:hAnsi="Arial" w:eastAsia="Arial" w:cs="Arial"/>
                 <w:i w:val="false"/>
                 <w:b w:val="false"/>
                 <w:u w:val="none"/>
@@ -4682,7 +4718,7 @@
         </w:tc>
       </w:tr>
     </w:tbl>
-    <w:bookmarkEnd w:id="20"/>
+    <w:bookmarkEnd w:id="21"/>
     <w:sectPr>
       <w:headerReference r:id="rId9" w:type="default"/>
       <w:footerReference r:id="rId10" w:type="even"/>
@@ -4701,394 +4737,112 @@
 </file>
 
 <file path=word/footer1.xml><?xml version="1.0" encoding="utf-8"?>
-<w:ftr xmlns:wpc="http://schemas.microsoft.com/office/word/2010/wordprocessingCanvas" xmlns:cx="http://schemas.microsoft.com/office/drawing/2014/chartex" xmlns:cx1="http://schemas.microsoft.com/office/drawing/2015/9/8/chartex" xmlns:cx2="http://schemas.microsoft.com/office/drawing/2015/10/21/chartex" xmlns:cx3="http://schemas.microsoft.com/office/drawing/2016/5/9/chartex" xmlns:cx4="http://schemas.microsoft.com/office/drawing/2016/5/10/chartex" xmlns:cx5="http://schemas.microsoft.com/office/drawing/2016/5/11/chartex" xmlns:cx6="http://schemas.microsoft.com/office/drawing/2016/5/12/chartex" xmlns:cx7="http://schemas.microsoft.com/office/drawing/2016/5/13/chartex" xmlns:cx8="http://schemas.microsoft.com/office/drawing/2016/5/14/chartex" xmlns:mc="http://schemas.openxmlformats.org/markup-compatibility/2006" xmlns:aink="http://schemas.microsoft.com/office/drawing/2016/ink" xmlns:am3d="http://schemas.microsoft.com/office/drawing/2017/model3d" xmlns:o="urn:schemas-microsoft-com:office:office" xmlns:oel="http://schemas.microsoft.com/office/2019/extlst" xmlns:r="http://schemas.openxmlformats.org/officeDocument/2006/relationships" xmlns:m="http://schemas.openxmlformats.org/officeDocument/2006/math" xmlns:v="urn:schemas-microsoft-com:vml" xmlns:wp14="http://schemas.microsoft.com/office/word/2010/wordprocessingDrawing" xmlns:wp="http://schemas.openxmlformats.org/drawingml/2006/wordprocessingDrawing" xmlns:w10="urn:schemas-microsoft-com:office:word" xmlns:w="http://schemas.openxmlformats.org/wordprocessingml/2006/main" xmlns:w14="http://schemas.microsoft.com/office/word/2010/wordml" xmlns:w15="http://schemas.microsoft.com/office/word/2012/wordml" xmlns:w16cex="http://schemas.microsoft.com/office/word/2018/wordml/cex" xmlns:w16cid="http://schemas.microsoft.com/office/word/2016/wordml/cid" xmlns:w16="http://schemas.microsoft.com/office/word/2018/wordml" xmlns:w16du="http://schemas.microsoft.com/office/word/2023/wordml/word16du" xmlns:w16sdtdh="http://schemas.microsoft.com/office/word/2020/wordml/sdtdatahash" xmlns:w16sdtfl="http://schemas.microsoft.com/office/word/2024/wordml/sdtformatlock" xmlns:w16se="http://schemas.microsoft.com/office/word/2015/wordml/symex" xmlns:wpg="http://schemas.microsoft.com/office/word/2010/wordprocessingGroup" xmlns:wpi="http://schemas.microsoft.com/office/word/2010/wordprocessingInk" xmlns:wne="http://schemas.microsoft.com/office/word/2006/wordml" xmlns:wps="http://schemas.microsoft.com/office/word/2010/wordprocessingShape" mc:Ignorable="w14 w15 w16se w16cid w16 w16cex w16sdtdh w16sdtfl w16du wp14">
-  <w:sdt>
-    <w:sdtPr>
-      <w:rPr>
-        <w:rStyle w:val="PageNumber"/>
-      </w:rPr>
-      <w:id w:val="-1602941162"/>
-      <w:docPartObj>
-        <w:docPartGallery w:val="Page Numbers (Bottom of Page)"/>
-        <w:docPartUnique/>
-      </w:docPartObj>
-    </w:sdtPr>
-    <w:sdtContent>
-      <w:p>
-        <w:pPr>
-          <w:pStyle w:val="Footer"/>
-          <w:framePr w:wrap="none" w:vAnchor="text" w:hAnchor="margin" w:y="1"/>
-          <w:rPr>
-            <w:rStyle w:val="PageNumber"/>
-          </w:rPr>
-        </w:pPr>
-        <w:r>
-          <w:rPr>
-            <w:rStyle w:val="PageNumber"/>
-          </w:rPr>
-          <w:fldChar w:fldCharType="begin"/>
-        </w:r>
-        <w:r>
-          <w:rPr>
-            <w:rStyle w:val="PageNumber"/>
-          </w:rPr>
-          <w:instrText xml:space="preserve"> PAGE </w:instrText>
-        </w:r>
-        <w:r>
-          <w:rPr>
-            <w:rStyle w:val="PageNumber"/>
-          </w:rPr>
-          <w:fldChar w:fldCharType="separate"/>
-        </w:r>
-        <w:r>
-          <w:rPr>
-            <w:rStyle w:val="PageNumber"/>
-            <w:noProof/>
-          </w:rPr>
-          <w:t>1</w:t>
-        </w:r>
-        <w:r>
-          <w:rPr>
-            <w:rStyle w:val="PageNumber"/>
-          </w:rPr>
-          <w:fldChar w:fldCharType="end"/>
-        </w:r>
-      </w:p>
-    </w:sdtContent>
-  </w:sdt>
-  <w:sdt>
-    <w:sdtPr>
-      <w:rPr>
-        <w:rStyle w:val="PageNumber"/>
-      </w:rPr>
-      <w:id w:val="-145356932"/>
-      <w:docPartObj>
-        <w:docPartGallery w:val="Page Numbers (Bottom of Page)"/>
-        <w:docPartUnique/>
-      </w:docPartObj>
-    </w:sdtPr>
-    <w:sdtContent>
-      <w:p>
-        <w:pPr>
-          <w:pStyle w:val="Footer"/>
-          <w:framePr w:wrap="none" w:vAnchor="text" w:hAnchor="margin" w:y="1"/>
-          <w:ind w:right="360" w:firstLine="360"/>
-          <w:rPr>
-            <w:rStyle w:val="PageNumber"/>
-          </w:rPr>
-        </w:pPr>
-        <w:r>
-          <w:rPr>
-            <w:rStyle w:val="PageNumber"/>
-          </w:rPr>
-          <w:fldChar w:fldCharType="begin"/>
-        </w:r>
-        <w:r>
-          <w:rPr>
-            <w:rStyle w:val="PageNumber"/>
-          </w:rPr>
-          <w:instrText xml:space="preserve"> PAGE </w:instrText>
-        </w:r>
-        <w:r>
-          <w:rPr>
-            <w:rStyle w:val="PageNumber"/>
-          </w:rPr>
-          <w:fldChar w:fldCharType="separate"/>
-        </w:r>
-        <w:r>
-          <w:rPr>
-            <w:rStyle w:val="PageNumber"/>
-            <w:noProof/>
-          </w:rPr>
-          <w:t>1</w:t>
-        </w:r>
-        <w:r>
-          <w:rPr>
-            <w:rStyle w:val="PageNumber"/>
-          </w:rPr>
-          <w:fldChar w:fldCharType="end"/>
-        </w:r>
-      </w:p>
-    </w:sdtContent>
-  </w:sdt>
+<w:ftr xmlns:w="http://schemas.openxmlformats.org/wordprocessingml/2006/main">
   <w:p>
     <w:pPr>
       <w:pStyle w:val="Footer"/>
-      <w:ind w:right="360" w:firstLine="360"/>
+      <w:tabs>
+        <w:tab w:val="center" w:pos="4680"/>
+        <w:tab w:val="right" w:pos="9360"/>
+      </w:tabs>
+      <w:pBdr>
+        <w:top w:val="single" w:sz="8" w:space="4" w:color="000000"/>
+      </w:pBdr>
+      <w:spacing w:before="0" w:after="0" w:line="220" w:lineRule="auto"/>
     </w:pPr>
+    <w:r>
+      <w:tab/>
+    </w:r>
+    <w:r>
+      <w:rPr>
+        <w:rFonts w:ascii="Arial" w:hAnsi="Arial"/>
+        <w:b/>
+        <w:color w:val="C8102E"/>
+        <w:spacing w:val="12"/>
+        <w:sz w:val="18"/>
+        <w:szCs w:val="18"/>
+      </w:rPr>
+      <w:t>NEBRASKA</w:t>
+    </w:r>
+    <w:r>
+      <w:tab/>
+    </w:r>
+    <w:r>
+      <w:t xml:space="preserve">- </w:t>
+    </w:r>
+    <w:r>
+      <w:fldChar w:fldCharType="begin"/>
+    </w:r>
+    <w:r>
+      <w:instrText xml:space="preserve"> PAGE </w:instrText>
+    </w:r>
+    <w:r>
+      <w:fldChar w:fldCharType="separate"/>
+    </w:r>
+    <w:r>
+      <w:t>1</w:t>
+    </w:r>
+    <w:r>
+      <w:fldChar w:fldCharType="end"/>
+    </w:r>
+    <w:r>
+      <w:t xml:space="preserve"> -</w:t>
+    </w:r>
   </w:p>
 </w:ftr>
 </file>
 
 <file path=word/footer2.xml><?xml version="1.0" encoding="utf-8"?>
-<w:ftr xmlns:wpc="http://schemas.microsoft.com/office/word/2010/wordprocessingCanvas" xmlns:cx="http://schemas.microsoft.com/office/drawing/2014/chartex" xmlns:cx1="http://schemas.microsoft.com/office/drawing/2015/9/8/chartex" xmlns:cx2="http://schemas.microsoft.com/office/drawing/2015/10/21/chartex" xmlns:cx3="http://schemas.microsoft.com/office/drawing/2016/5/9/chartex" xmlns:cx4="http://schemas.microsoft.com/office/drawing/2016/5/10/chartex" xmlns:cx5="http://schemas.microsoft.com/office/drawing/2016/5/11/chartex" xmlns:cx6="http://schemas.microsoft.com/office/drawing/2016/5/12/chartex" xmlns:cx7="http://schemas.microsoft.com/office/drawing/2016/5/13/chartex" xmlns:cx8="http://schemas.microsoft.com/office/drawing/2016/5/14/chartex" xmlns:mc="http://schemas.openxmlformats.org/markup-compatibility/2006" xmlns:aink="http://schemas.microsoft.com/office/drawing/2016/ink" xmlns:am3d="http://schemas.microsoft.com/office/drawing/2017/model3d" xmlns:o="urn:schemas-microsoft-com:office:office" xmlns:oel="http://schemas.microsoft.com/office/2019/extlst" xmlns:r="http://schemas.openxmlformats.org/officeDocument/2006/relationships" xmlns:m="http://schemas.openxmlformats.org/officeDocument/2006/math" xmlns:v="urn:schemas-microsoft-com:vml" xmlns:wp14="http://schemas.microsoft.com/office/word/2010/wordprocessingDrawing" xmlns:wp="http://schemas.openxmlformats.org/drawingml/2006/wordprocessingDrawing" xmlns:w10="urn:schemas-microsoft-com:office:word" xmlns:w="http://schemas.openxmlformats.org/wordprocessingml/2006/main" xmlns:w14="http://schemas.microsoft.com/office/word/2010/wordml" xmlns:w15="http://schemas.microsoft.com/office/word/2012/wordml" xmlns:w16cex="http://schemas.microsoft.com/office/word/2018/wordml/cex" xmlns:w16cid="http://schemas.microsoft.com/office/word/2016/wordml/cid" xmlns:w16="http://schemas.microsoft.com/office/word/2018/wordml" xmlns:w16du="http://schemas.microsoft.com/office/word/2023/wordml/word16du" xmlns:w16sdtdh="http://schemas.microsoft.com/office/word/2020/wordml/sdtdatahash" xmlns:w16sdtfl="http://schemas.microsoft.com/office/word/2024/wordml/sdtformatlock" xmlns:w16se="http://schemas.microsoft.com/office/word/2015/wordml/symex" xmlns:wpg="http://schemas.microsoft.com/office/word/2010/wordprocessingGroup" xmlns:wpi="http://schemas.microsoft.com/office/word/2010/wordprocessingInk" xmlns:wne="http://schemas.microsoft.com/office/word/2006/wordml" xmlns:wps="http://schemas.microsoft.com/office/word/2010/wordprocessingShape" mc:Ignorable="w14 w15 w16se w16cid w16 w16cex w16sdtdh w16sdtfl w16du wp14">
-  <w:sdt>
-    <w:sdtPr>
-      <w:rPr>
-        <w:rStyle w:val="PageNumber"/>
-      </w:rPr>
-      <w:id w:val="-398136938"/>
-      <w:docPartObj>
-        <w:docPartGallery w:val="Page Numbers (Bottom of Page)"/>
-        <w:docPartUnique/>
-      </w:docPartObj>
-    </w:sdtPr>
-    <w:sdtContent>
-      <w:p>
-        <w:pPr>
-          <w:pStyle w:val="Footer"/>
-          <w:framePr w:wrap="none" w:vAnchor="text" w:hAnchor="margin" w:y="1"/>
-          <w:rPr>
-            <w:rStyle w:val="PageNumber"/>
-          </w:rPr>
-        </w:pPr>
-        <w:r>
-          <w:rPr>
-            <w:rStyle w:val="PageNumber"/>
-          </w:rPr>
-          <w:fldChar w:fldCharType="begin"/>
-        </w:r>
-        <w:r>
-          <w:rPr>
-            <w:rStyle w:val="PageNumber"/>
-          </w:rPr>
-          <w:instrText xml:space="preserve"> PAGE </w:instrText>
-        </w:r>
-        <w:r>
-          <w:rPr>
-            <w:rStyle w:val="PageNumber"/>
-          </w:rPr>
-          <w:fldChar w:fldCharType="separate"/>
-        </w:r>
-        <w:r>
-          <w:rPr>
-            <w:rStyle w:val="PageNumber"/>
-            <w:noProof/>
-          </w:rPr>
-          <w:t>- 1 -</w:t>
-        </w:r>
-        <w:r>
-          <w:rPr>
-            <w:rStyle w:val="PageNumber"/>
-          </w:rPr>
-          <w:fldChar w:fldCharType="end"/>
-        </w:r>
-      </w:p>
-    </w:sdtContent>
-  </w:sdt>
+<w:ftr xmlns:w="http://schemas.openxmlformats.org/wordprocessingml/2006/main">
   <w:p>
     <w:pPr>
       <w:pStyle w:val="Footer"/>
-      <w:ind w:right="360" w:firstLine="360"/>
+      <w:tabs>
+        <w:tab w:val="center" w:pos="4680"/>
+        <w:tab w:val="right" w:pos="9360"/>
+      </w:tabs>
+      <w:pBdr>
+        <w:top w:val="single" w:sz="8" w:space="4" w:color="000000"/>
+      </w:pBdr>
+      <w:spacing w:before="0" w:after="0" w:line="220" w:lineRule="auto"/>
     </w:pPr>
     <w:r>
-      <w:rPr>
-        <w:noProof/>
-      </w:rPr>
-      <w:drawing>
-        <wp:anchor distT="0" distB="0" distL="114300" distR="114300" simplePos="0" relativeHeight="251658240" behindDoc="1" locked="0" layoutInCell="1" allowOverlap="1" wp14:anchorId="3C4A1701" wp14:editId="7E49379E">
-          <wp:simplePos x="0" y="0"/>
-          <wp:positionH relativeFrom="column">
-            <wp:posOffset>5567347</wp:posOffset>
-          </wp:positionH>
-          <wp:positionV relativeFrom="paragraph">
-            <wp:posOffset>112459</wp:posOffset>
-          </wp:positionV>
-          <wp:extent cx="891515" cy="378020"/>
-          <wp:effectExtent l="0" t="0" r="0" b="3175"/>
-          <wp:wrapNone/>
-          <wp:docPr id="724861626" name="Picture 2" descr="A black line and the text NEBRASKA in red. "/>
-          <wp:cNvGraphicFramePr>
-            <a:graphicFrameLocks xmlns:a="http://schemas.openxmlformats.org/drawingml/2006/main" noChangeAspect="1"/>
-          </wp:cNvGraphicFramePr>
-          <a:graphic xmlns:a="http://schemas.openxmlformats.org/drawingml/2006/main">
-            <a:graphicData uri="http://schemas.openxmlformats.org/drawingml/2006/picture">
-              <pic:pic xmlns:pic="http://schemas.openxmlformats.org/drawingml/2006/picture">
-                <pic:nvPicPr>
-                  <pic:cNvPr id="724861626" name="Picture 2" descr="A black line and the text NEBRASKA in red. "/>
-                  <pic:cNvPicPr>
-                    <a:picLocks noChangeAspect="1"/>
-                  </pic:cNvPicPr>
-                </pic:nvPicPr>
-                <pic:blipFill rotWithShape="1">
-                  <a:blip r:embed="rId1">
-                    <a:extLst>
-                      <a:ext uri="{28A0092B-C50C-407E-A947-70E740481C1C}">
-                        <a14:useLocalDpi xmlns:a14="http://schemas.microsoft.com/office/drawing/2010/main" val="0"/>
-                      </a:ext>
-                    </a:extLst>
-                  </a:blip>
-                  <a:srcRect l="67772" r="9300"/>
-                  <a:stretch>
-                    <a:fillRect/>
-                  </a:stretch>
-                </pic:blipFill>
-                <pic:spPr bwMode="auto">
-                  <a:xfrm>
-                    <a:off x="0" y="0"/>
-                    <a:ext cx="891515" cy="378020"/>
-                  </a:xfrm>
-                  <a:prstGeom prst="rect">
-                    <a:avLst/>
-                  </a:prstGeom>
-                  <a:ln>
-                    <a:noFill/>
-                  </a:ln>
-                  <a:extLst>
-                    <a:ext uri="{53640926-AAD7-44D8-BBD7-CCE9431645EC}">
-                      <a14:shadowObscured xmlns:a14="http://schemas.microsoft.com/office/drawing/2010/main"/>
-                    </a:ext>
-                  </a:extLst>
-                </pic:spPr>
-              </pic:pic>
-            </a:graphicData>
-          </a:graphic>
-          <wp14:sizeRelH relativeFrom="margin">
-            <wp14:pctWidth>0</wp14:pctWidth>
-          </wp14:sizeRelH>
-          <wp14:sizeRelV relativeFrom="margin">
-            <wp14:pctHeight>0</wp14:pctHeight>
-          </wp14:sizeRelV>
-        </wp:anchor>
-      </w:drawing>
+      <w:tab/>
     </w:r>
     <w:r>
       <w:rPr>
-        <w:noProof/>
-      </w:rPr>
-      <mc:AlternateContent>
-        <mc:Choice Requires="wps">
-          <w:drawing>
-            <wp:anchor distT="0" distB="0" distL="114300" distR="114300" simplePos="0" relativeHeight="251669504" behindDoc="1" locked="0" layoutInCell="1" allowOverlap="1" wp14:anchorId="21D6F732" wp14:editId="54604F3B">
-              <wp:simplePos x="0" y="0"/>
-              <wp:positionH relativeFrom="column">
-                <wp:posOffset>-914400</wp:posOffset>
-              </wp:positionH>
-              <wp:positionV relativeFrom="paragraph">
-                <wp:posOffset>83816</wp:posOffset>
-              </wp:positionV>
-              <wp:extent cx="847991" cy="0"/>
-              <wp:effectExtent l="0" t="12700" r="28575" b="25400"/>
-              <wp:wrapNone/>
-              <wp:docPr id="1138935457" name="Straight Connector 1">
-                <ns0:decorative xmlns:ns0="http://schemas.microsoft.com/office/drawing/2017/decorative" val="1"/>
-              </wp:docPr>
-              <wp:cNvGraphicFramePr/>
-              <a:graphic xmlns:a="http://schemas.openxmlformats.org/drawingml/2006/main">
-                <a:graphicData uri="http://schemas.microsoft.com/office/word/2010/wordprocessingShape">
-                  <wps:wsp>
-                    <wps:cNvCnPr/>
-                    <wps:spPr>
-                      <a:xfrm>
-                        <a:off x="0" y="0"/>
-                        <a:ext cx="847991" cy="0"/>
-                      </a:xfrm>
-                      <a:prstGeom prst="line">
-                        <a:avLst/>
-                      </a:prstGeom>
-                      <a:ln w="38100"/>
-                    </wps:spPr>
-                    <wps:style>
-                      <a:lnRef idx="3">
-                        <a:schemeClr val="dk1"/>
-                      </a:lnRef>
-                      <a:fillRef idx="0">
-                        <a:schemeClr val="dk1"/>
-                      </a:fillRef>
-                      <a:effectRef idx="2">
-                        <a:schemeClr val="dk1"/>
-                      </a:effectRef>
-                      <a:fontRef idx="minor">
-                        <a:schemeClr val="tx1"/>
-                      </a:fontRef>
-                    </wps:style>
-                    <wps:bodyPr/>
-                  </wps:wsp>
-                </a:graphicData>
-              </a:graphic>
-              <wp14:sizeRelH relativeFrom="margin">
-                <wp14:pctWidth>0</wp14:pctWidth>
-              </wp14:sizeRelH>
-              <wp14:sizeRelV relativeFrom="margin">
-                <wp14:pctHeight>0</wp14:pctHeight>
-              </wp14:sizeRelV>
-            </wp:anchor>
-          </w:drawing>
-        </mc:Choice>
-        <mc:Fallback>
-          <w:pict>
-            <v:line w14:anchorId="48B09629" id="Straight Connector 1" o:spid="_x0000_s1026" style="position:absolute;z-index:-251646976;visibility:visible;mso-wrap-style:square;mso-width-percent:0;mso-height-percent:0;mso-wrap-distance-left:9pt;mso-wrap-distance-top:0;mso-wrap-distance-right:9pt;mso-wrap-distance-bottom:0;mso-position-horizontal:absolute;mso-position-horizontal-relative:text;mso-position-vertical:absolute;mso-position-vertical-relative:text;mso-width-percent:0;mso-height-percent:0;mso-width-relative:margin;mso-height-relative:margin" from="-1in,6.6pt" to="-5.25pt,6.6pt" o:gfxdata="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" strokecolor="black [3200]" strokeweight="3pt">
-              <v:stroke joinstyle="miter"/>
-            </v:line>
-          </w:pict>
-        </mc:Fallback>
-      </mc:AlternateContent>
+        <w:rFonts w:ascii="Arial" w:hAnsi="Arial"/>
+        <w:b/>
+        <w:color w:val="C8102E"/>
+        <w:spacing w:val="12"/>
+        <w:sz w:val="18"/>
+        <w:szCs w:val="18"/>
+      </w:rPr>
+      <w:t>NEBRASKA</w:t>
     </w:r>
     <w:r>
-      <w:rPr>
-        <w:noProof/>
-      </w:rPr>
-      <mc:AlternateContent>
-        <mc:Choice Requires="wps">
-          <w:drawing>
-            <wp:anchor distT="0" distB="0" distL="114300" distR="114300" simplePos="0" relativeHeight="251667456" behindDoc="1" locked="0" layoutInCell="1" allowOverlap="1" wp14:anchorId="6DB231D0" wp14:editId="68302D1D">
-              <wp:simplePos x="0" y="0"/>
-              <wp:positionH relativeFrom="column">
-                <wp:posOffset>143034</wp:posOffset>
-              </wp:positionH>
-              <wp:positionV relativeFrom="paragraph">
-                <wp:posOffset>84217</wp:posOffset>
-              </wp:positionV>
-              <wp:extent cx="7010400" cy="0"/>
-              <wp:effectExtent l="0" t="12700" r="25400" b="25400"/>
-              <wp:wrapNone/>
-              <wp:docPr id="1705665425" name="Straight Connector 1">
-                <ns1:decorative xmlns:ns1="http://schemas.microsoft.com/office/drawing/2017/decorative" val="1"/>
-              </wp:docPr>
-              <wp:cNvGraphicFramePr/>
-              <a:graphic xmlns:a="http://schemas.openxmlformats.org/drawingml/2006/main">
-                <a:graphicData uri="http://schemas.microsoft.com/office/word/2010/wordprocessingShape">
-                  <wps:wsp>
-                    <wps:cNvCnPr/>
-                    <wps:spPr>
-                      <a:xfrm>
-                        <a:off x="0" y="0"/>
-                        <a:ext cx="7010400" cy="0"/>
-                      </a:xfrm>
-                      <a:prstGeom prst="line">
-                        <a:avLst/>
-                      </a:prstGeom>
-                      <a:ln w="38100"/>
-                    </wps:spPr>
-                    <wps:style>
-                      <a:lnRef idx="3">
-                        <a:schemeClr val="dk1"/>
-                      </a:lnRef>
-                      <a:fillRef idx="0">
-                        <a:schemeClr val="dk1"/>
-                      </a:fillRef>
-                      <a:effectRef idx="2">
-                        <a:schemeClr val="dk1"/>
-                      </a:effectRef>
-                      <a:fontRef idx="minor">
-                        <a:schemeClr val="tx1"/>
-                      </a:fontRef>
-                    </wps:style>
-                    <wps:bodyPr/>
-                  </wps:wsp>
-                </a:graphicData>
-              </a:graphic>
-            </wp:anchor>
-          </w:drawing>
-        </mc:Choice>
-        <mc:Fallback>
-          <w:pict>
-            <v:line w14:anchorId="145E04E9" id="Straight Connector 1" o:spid="_x0000_s1026" style="position:absolute;z-index:-251649024;visibility:visible;mso-wrap-style:square;mso-wrap-distance-left:9pt;mso-wrap-distance-top:0;mso-wrap-distance-right:9pt;mso-wrap-distance-bottom:0;mso-position-horizontal:absolute;mso-position-horizontal-relative:text;mso-position-vertical:absolute;mso-position-vertical-relative:text" from="11.25pt,6.65pt" to="563.25pt,6.65pt" o:gfxdata="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" strokecolor="black [3200]" strokeweight="3pt">
-              <v:stroke joinstyle="miter"/>
-            </v:line>
-          </w:pict>
-        </mc:Fallback>
-      </mc:AlternateContent>
+      <w:tab/>
+    </w:r>
+    <w:r>
+      <w:t xml:space="preserve">- </w:t>
+    </w:r>
+    <w:r>
+      <w:fldChar w:fldCharType="begin"/>
+    </w:r>
+    <w:r>
+      <w:instrText xml:space="preserve"> PAGE </w:instrText>
+    </w:r>
+    <w:r>
+      <w:fldChar w:fldCharType="separate"/>
+    </w:r>
+    <w:r>
+      <w:t>1</w:t>
+    </w:r>
+    <w:r>
+      <w:fldChar w:fldCharType="end"/>
+    </w:r>
+    <w:r>
+      <w:t xml:space="preserve"> -</w:t>
     </w:r>
   </w:p>
 </w:ftr>
@@ -5114,216 +4868,120 @@
 </file>
 
 <file path=word/header1.xml><?xml version="1.0" encoding="utf-8"?>
-<w:hdr xmlns:adec="http://schemas.microsoft.com/office/drawing/2017/decorative" xmlns:wpc="http://schemas.microsoft.com/office/word/2010/wordprocessingCanvas" xmlns:cx="http://schemas.microsoft.com/office/drawing/2014/chartex" xmlns:cx1="http://schemas.microsoft.com/office/drawing/2015/9/8/chartex" xmlns:cx2="http://schemas.microsoft.com/office/drawing/2015/10/21/chartex" xmlns:cx3="http://schemas.microsoft.com/office/drawing/2016/5/9/chartex" xmlns:cx4="http://schemas.microsoft.com/office/drawing/2016/5/10/chartex" xmlns:cx5="http://schemas.microsoft.com/office/drawing/2016/5/11/chartex" xmlns:cx6="http://schemas.microsoft.com/office/drawing/2016/5/12/chartex" xmlns:cx7="http://schemas.microsoft.com/office/drawing/2016/5/13/chartex" xmlns:cx8="http://schemas.microsoft.com/office/drawing/2016/5/14/chartex" xmlns:mc="http://schemas.openxmlformats.org/markup-compatibility/2006" xmlns:aink="http://schemas.microsoft.com/office/drawing/2016/ink" xmlns:am3d="http://schemas.microsoft.com/office/drawing/2017/model3d" xmlns:o="urn:schemas-microsoft-com:office:office" xmlns:oel="http://schemas.microsoft.com/office/2019/extlst" xmlns:r="http://schemas.openxmlformats.org/officeDocument/2006/relationships" xmlns:m="http://schemas.openxmlformats.org/officeDocument/2006/math" xmlns:v="urn:schemas-microsoft-com:vml" xmlns:wp14="http://schemas.microsoft.com/office/word/2010/wordprocessingDrawing" xmlns:wp="http://schemas.openxmlformats.org/drawingml/2006/wordprocessingDrawing" xmlns:w10="urn:schemas-microsoft-com:office:word" xmlns:w="http://schemas.openxmlformats.org/wordprocessingml/2006/main" xmlns:w14="http://schemas.microsoft.com/office/word/2010/wordml" xmlns:w15="http://schemas.microsoft.com/office/word/2012/wordml" xmlns:w16cex="http://schemas.microsoft.com/office/word/2018/wordml/cex" xmlns:w16cid="http://schemas.microsoft.com/office/word/2016/wordml/cid" xmlns:w16="http://schemas.microsoft.com/office/word/2018/wordml" xmlns:w16du="http://schemas.microsoft.com/office/word/2023/wordml/word16du" xmlns:w16sdtdh="http://schemas.microsoft.com/office/word/2020/wordml/sdtdatahash" xmlns:w16sdtfl="http://schemas.microsoft.com/office/word/2024/wordml/sdtformatlock" xmlns:w16se="http://schemas.microsoft.com/office/word/2015/wordml/symex" xmlns:wpg="http://schemas.microsoft.com/office/word/2010/wordprocessingGroup" xmlns:wpi="http://schemas.microsoft.com/office/word/2010/wordprocessingInk" xmlns:wne="http://schemas.microsoft.com/office/word/2006/wordml" xmlns:wps="http://schemas.microsoft.com/office/word/2010/wordprocessingShape" mc:Ignorable="w14 w15 w16se w16cid w16 w16cex w16sdtdh w16sdtfl w16du wp14">
+<w:hdr xmlns:w="http://schemas.openxmlformats.org/wordprocessingml/2006/main" xmlns:r="http://schemas.openxmlformats.org/officeDocument/2006/relationships" xmlns:wp="http://schemas.openxmlformats.org/drawingml/2006/wordprocessingDrawing" xmlns:a="http://schemas.openxmlformats.org/drawingml/2006/main" xmlns:pic="http://schemas.openxmlformats.org/drawingml/2006/picture">
+  <w:tbl>
+    <w:tblPr>
+      <w:tblW w:w="9360" w:type="dxa"/>
+      <w:tblLayout w:type="fixed"/>
+      <w:tblBorders>
+        <w:top w:val="nil"/>
+        <w:left w:val="nil"/>
+        <w:bottom w:val="single" w:sz="12" w:space="0" w:color="000000"/>
+        <w:right w:val="nil"/>
+        <w:insideH w:val="nil"/>
+        <w:insideV w:val="nil"/>
+      </w:tblBorders>
+      <w:tblCellMar>
+        <w:top w:w="0" w:type="dxa"/>
+        <w:left w:w="0" w:type="dxa"/>
+        <w:bottom w:w="80" w:type="dxa"/>
+        <w:right w:w="0" w:type="dxa"/>
+      </w:tblCellMar>
+      <w:tblCaption w:val="Course header"/>
+      <w:tblDescription w:val="PSYC350 LAB with Nebraska N logo."/>
+      <w:tblLook w:val="0000" w:firstRow="0" w:lastRow="0" w:firstColumn="0" w:lastColumn="0" w:noHBand="1" w:noVBand="1"/>
+    </w:tblPr>
+    <w:tblGrid>
+      <w:gridCol w:w="8000"/>
+      <w:gridCol w:w="1360"/>
+    </w:tblGrid>
+    <w:tr>
+      <w:trPr>
+        <w:cantSplit/>
+      </w:trPr>
+      <w:tc>
+        <w:tcPr>
+          <w:tcW w:w="8000" w:type="dxa"/>
+          <w:vAlign w:val="center"/>
+        </w:tcPr>
+        <w:p>
+          <w:pPr>
+            <w:pStyle w:val="Header"/>
+            <w:spacing w:before="0" w:after="0" w:line="240" w:lineRule="auto"/>
+          </w:pPr>
+          <w:r>
+            <w:rPr>
+              <w:rFonts w:ascii="Arial" w:hAnsi="Arial" w:cs="Arial" w:eastAsia="Arial"/>
+              <w:b/>
+              <w:color w:val="1A1A1A"/>
+              <w:sz w:val="20"/>
+              <w:szCs w:val="20"/>
+            </w:rPr>
+            <w:t>PSYC350 LAB</w:t>
+          </w:r>
+        </w:p>
+      </w:tc>
+      <w:tc>
+        <w:tcPr>
+          <w:tcW w:w="1360" w:type="dxa"/>
+          <w:vAlign w:val="center"/>
+        </w:tcPr>
+        <w:p>
+          <w:pPr>
+            <w:pStyle w:val="Header"/>
+            <w:jc w:val="right"/>
+            <w:spacing w:before="0" w:after="0" w:line="240" w:lineRule="auto"/>
+          </w:pPr>
+          <w:r>
+            <w:drawing>
+              <wp:inline distT="0" distB="0" distL="0" distR="0">
+                <wp:extent cx="411480" cy="360000"/>
+                <wp:effectExtent l="0" t="0" r="0" b="0"/>
+                <wp:docPr id="1" name="Nebraska N logo" descr="Nebraska N logo" title=""/>
+                <wp:cNvGraphicFramePr>
+                  <a:graphicFrameLocks noChangeAspect="1"/>
+                </wp:cNvGraphicFramePr>
+                <a:graphic>
+                  <a:graphicData uri="http://schemas.openxmlformats.org/drawingml/2006/picture">
+                    <pic:pic>
+                      <pic:nvPicPr>
+                        <pic:cNvPr id="1" name="Nebraska N logo" descr="Nebraska N logo"/>
+                        <pic:cNvPicPr>
+                          <a:picLocks noChangeAspect="1"/>
+                        </pic:cNvPicPr>
+                      </pic:nvPicPr>
+                      <pic:blipFill>
+                        <a:blip r:embed="rId1"/>
+                        <a:stretch>
+                          <a:fillRect/>
+                        </a:stretch>
+                      </pic:blipFill>
+                      <pic:spPr>
+                        <a:xfrm>
+                          <a:off x="0" y="0"/>
+                          <a:ext cx="411480" cy="360000"/>
+                        </a:xfrm>
+                        <a:prstGeom prst="rect">
+                          <a:avLst/>
+                        </a:prstGeom>
+                        <a:ln>
+                          <a:noFill/>
+                        </a:ln>
+                      </pic:spPr>
+                    </pic:pic>
+                  </a:graphicData>
+                </a:graphic>
+              </wp:inline>
+            </w:drawing>
+          </w:r>
+        </w:p>
+      </w:tc>
+    </w:tr>
+  </w:tbl>
   <w:p>
     <w:pPr>
-      <w:pStyle w:val="Header"/>
+      <w:spacing w:before="0" w:after="0" w:line="20" w:lineRule="exact"/>
     </w:pPr>
-    <w:r>
-      <w:rPr>
-        <w:noProof/>
-      </w:rPr>
-      <w:drawing>
-        <wp:anchor distT="0" distB="0" distL="114300" distR="114300" simplePos="0" relativeHeight="251665408" behindDoc="1" locked="0" layoutInCell="1" allowOverlap="1" wp14:anchorId="048C4747" wp14:editId="4180D4FB">
-          <wp:simplePos x="0" y="0"/>
-          <wp:positionH relativeFrom="column">
-            <wp:posOffset>6010275</wp:posOffset>
-          </wp:positionH>
-          <wp:positionV relativeFrom="paragraph">
-            <wp:posOffset>-323850</wp:posOffset>
-          </wp:positionV>
-          <wp:extent cx="523374" cy="457200"/>
-          <wp:effectExtent l="0" t="0" r="0" b="0"/>
-          <wp:wrapNone/>
-          <wp:docPr id="1428854869" name="Picture 1" descr="">
-            <adec:decorative val="1"/>
-          </wp:docPr>
-          <wp:cNvGraphicFramePr>
-            <a:graphicFrameLocks xmlns:a="http://schemas.openxmlformats.org/drawingml/2006/main" noChangeAspect="1"/>
-          </wp:cNvGraphicFramePr>
-          <a:graphic xmlns:a="http://schemas.openxmlformats.org/drawingml/2006/main">
-            <a:graphicData uri="http://schemas.openxmlformats.org/drawingml/2006/picture">
-              <pic:pic xmlns:pic="http://schemas.openxmlformats.org/drawingml/2006/picture">
-                <pic:nvPicPr>
-                  <pic:cNvPr id="1428854869" name="Picture 1" descr=""/>
-                  <pic:cNvPicPr>
-                    <a:picLocks noChangeAspect="1"/>
-                  </pic:cNvPicPr>
-                </pic:nvPicPr>
-                <pic:blipFill>
-                  <a:blip r:embed="rId1">
-                    <a:extLst>
-                      <a:ext uri="{28A0092B-C50C-407E-A947-70E740481C1C}">
-                        <a14:useLocalDpi xmlns:a14="http://schemas.microsoft.com/office/drawing/2010/main" val="0"/>
-                      </a:ext>
-                    </a:extLst>
-                  </a:blip>
-                  <a:stretch>
-                    <a:fillRect/>
-                  </a:stretch>
-                </pic:blipFill>
-                <pic:spPr>
-                  <a:xfrm>
-                    <a:off x="0" y="0"/>
-                    <a:ext cx="523374" cy="457200"/>
-                  </a:xfrm>
-                  <a:prstGeom prst="rect">
-                    <a:avLst/>
-                  </a:prstGeom>
-                </pic:spPr>
-              </pic:pic>
-            </a:graphicData>
-          </a:graphic>
-          <wp14:sizeRelH relativeFrom="margin">
-            <wp14:pctWidth>0</wp14:pctWidth>
-          </wp14:sizeRelH>
-          <wp14:sizeRelV relativeFrom="margin">
-            <wp14:pctHeight>0</wp14:pctHeight>
-          </wp14:sizeRelV>
-        </wp:anchor>
-      </w:drawing>
-    </w:r>
-    <w:r>
-      <w:rPr>
-        <w:noProof/>
-      </w:rPr>
-      <mc:AlternateContent>
-        <mc:Choice Requires="wps">
-          <w:drawing>
-            <wp:anchor distT="0" distB="0" distL="114300" distR="114300" simplePos="0" relativeHeight="251663360" behindDoc="1" locked="0" layoutInCell="1" allowOverlap="1" wp14:anchorId="76194198" wp14:editId="377CA5F0">
-              <wp:simplePos x="0" y="0"/>
-              <wp:positionH relativeFrom="column">
-                <wp:posOffset>6416125</wp:posOffset>
-              </wp:positionH>
-              <wp:positionV relativeFrom="paragraph">
-                <wp:posOffset>-76697</wp:posOffset>
-              </wp:positionV>
-              <wp:extent cx="437050" cy="0"/>
-              <wp:effectExtent l="0" t="12700" r="33020" b="25400"/>
-              <wp:wrapNone/>
-              <wp:docPr id="160056721" name="Straight Connector 1">
-                <adec:decorative val="1"/>
-              </wp:docPr>
-              <wp:cNvGraphicFramePr/>
-              <a:graphic xmlns:a="http://schemas.openxmlformats.org/drawingml/2006/main">
-                <a:graphicData uri="http://schemas.microsoft.com/office/word/2010/wordprocessingShape">
-                  <wps:wsp>
-                    <wps:cNvCnPr/>
-                    <wps:spPr>
-                      <a:xfrm>
-                        <a:off x="0" y="0"/>
-                        <a:ext cx="437050" cy="0"/>
-                      </a:xfrm>
-                      <a:prstGeom prst="line">
-                        <a:avLst/>
-                      </a:prstGeom>
-                      <a:ln w="38100"/>
-                    </wps:spPr>
-                    <wps:style>
-                      <a:lnRef idx="3">
-                        <a:schemeClr val="dk1"/>
-                      </a:lnRef>
-                      <a:fillRef idx="0">
-                        <a:schemeClr val="dk1"/>
-                      </a:fillRef>
-                      <a:effectRef idx="2">
-                        <a:schemeClr val="dk1"/>
-                      </a:effectRef>
-                      <a:fontRef idx="minor">
-                        <a:schemeClr val="tx1"/>
-                      </a:fontRef>
-                    </wps:style>
-                    <wps:bodyPr/>
-                  </wps:wsp>
-                </a:graphicData>
-              </a:graphic>
-            </wp:anchor>
-          </w:drawing>
-        </mc:Choice>
-        <mc:Fallback>
-          <w:pict>
-            <v:line w14:anchorId="61EE608E" id="Straight Connector 1" o:spid="_x0000_s1026" style="position:absolute;z-index:-251653120;visibility:visible;mso-wrap-style:square;mso-wrap-distance-left:9pt;mso-wrap-distance-top:0;mso-wrap-distance-right:9pt;mso-wrap-distance-bottom:0;mso-position-horizontal:absolute;mso-position-horizontal-relative:text;mso-position-vertical:absolute;mso-position-vertical-relative:text" from="505.2pt,-6.05pt" to="539.6pt,-6.05pt" o:gfxdata="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" strokecolor="black [3200]" strokeweight="3pt">
-              <v:stroke joinstyle="miter"/>
-            </v:line>
-          </w:pict>
-        </mc:Fallback>
-      </mc:AlternateContent>
-    </w:r>
-    <w:r>
-      <w:rPr>
-        <w:noProof/>
-      </w:rPr>
-      <mc:AlternateContent>
-        <mc:Choice Requires="wps">
-          <w:drawing>
-            <wp:anchor distT="0" distB="0" distL="114300" distR="114300" simplePos="0" relativeHeight="251664384" behindDoc="1" locked="0" layoutInCell="1" allowOverlap="1" wp14:anchorId="2470D6F5" wp14:editId="5BB71F83">
-              <wp:simplePos x="0" y="0"/>
-              <wp:positionH relativeFrom="column">
-                <wp:posOffset>-914400</wp:posOffset>
-              </wp:positionH>
-              <wp:positionV relativeFrom="paragraph">
-                <wp:posOffset>-76697</wp:posOffset>
-              </wp:positionV>
-              <wp:extent cx="7010400" cy="0"/>
-              <wp:effectExtent l="0" t="12700" r="25400" b="25400"/>
-              <wp:wrapNone/>
-              <wp:docPr id="1347243333" name="Straight Connector 1">
-                <adec:decorative val="1"/>
-              </wp:docPr>
-              <wp:cNvGraphicFramePr/>
-              <a:graphic xmlns:a="http://schemas.openxmlformats.org/drawingml/2006/main">
-                <a:graphicData uri="http://schemas.microsoft.com/office/word/2010/wordprocessingShape">
-                  <wps:wsp>
-                    <wps:cNvCnPr/>
-                    <wps:spPr>
-                      <a:xfrm>
-                        <a:off x="0" y="0"/>
-                        <a:ext cx="7010400" cy="0"/>
-                      </a:xfrm>
-                      <a:prstGeom prst="line">
-                        <a:avLst/>
-                      </a:prstGeom>
-                      <a:ln w="38100"/>
-                    </wps:spPr>
-                    <wps:style>
-                      <a:lnRef idx="3">
-                        <a:schemeClr val="dk1"/>
-                      </a:lnRef>
-                      <a:fillRef idx="0">
-                        <a:schemeClr val="dk1"/>
-                      </a:fillRef>
-                      <a:effectRef idx="2">
-                        <a:schemeClr val="dk1"/>
-                      </a:effectRef>
-                      <a:fontRef idx="minor">
-                        <a:schemeClr val="tx1"/>
-                      </a:fontRef>
-                    </wps:style>
-                    <wps:bodyPr/>
-                  </wps:wsp>
-                </a:graphicData>
-              </a:graphic>
-            </wp:anchor>
-          </w:drawing>
-        </mc:Choice>
-        <mc:Fallback>
-          <w:pict>
-            <v:line w14:anchorId="2D0A0F32" id="Straight Connector 1" o:spid="_x0000_s1026" style="position:absolute;z-index:-251652096;visibility:visible;mso-wrap-style:square;mso-wrap-distance-left:9pt;mso-wrap-distance-top:0;mso-wrap-distance-right:9pt;mso-wrap-distance-bottom:0;mso-position-horizontal:absolute;mso-position-horizontal-relative:text;mso-position-vertical:absolute;mso-position-vertical-relative:text" from="-1in,-6.05pt" to="480pt,-6.05pt" o:gfxdata="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" strokecolor="black [3200]" strokeweight="3pt">
-              <v:stroke joinstyle="miter"/>
-            </v:line>
-          </w:pict>
-        </mc:Fallback>
-      </mc:AlternateContent>
-    </w:r>
-    <w:r>
-      <w:t>PSYC350</w:t>
-    </w:r>
-    <w:r>
-      <w:t xml:space="preserve"> L</w:t>
-    </w:r>
-    <w:r>
-      <w:t>AB</w:t>
-    </w:r>
   </w:p>
 </w:hdr>
 </file>
@@ -5528,7 +5186,7 @@
     <w:tmpl w:val="421A2B20"/>
     <w:lvl w:ilvl="0">
       <w:numFmt w:val="bullet"/>
-      <w:lvlText w:val=""/>
+      <w:lvlText w:val="•"/>
       <w:lvlJc w:val="left"/>
       <w:pPr>
         <w:ind w:hanging="360" w:left="720"/>
@@ -5539,7 +5197,7 @@
     </w:lvl>
     <w:lvl w:ilvl="1">
       <w:numFmt w:val="bullet"/>
-      <w:lvlText w:val="o"/>
+      <w:lvlText w:val="◦"/>
       <w:lvlJc w:val="left"/>
       <w:pPr>
         <w:ind w:hanging="360" w:left="1440"/>
@@ -5550,7 +5208,7 @@
     </w:lvl>
     <w:lvl w:ilvl="2">
       <w:numFmt w:val="bullet"/>
-      <w:lvlText w:val=""/>
+      <w:lvlText w:val="▪"/>
       <w:lvlJc w:val="left"/>
       <w:pPr>
         <w:ind w:hanging="360" w:left="2160"/>
@@ -5561,7 +5219,7 @@
     </w:lvl>
     <w:lvl w:ilvl="3">
       <w:numFmt w:val="bullet"/>
-      <w:lvlText w:val=""/>
+      <w:lvlText w:val="•"/>
       <w:lvlJc w:val="left"/>
       <w:pPr>
         <w:ind w:hanging="360" w:left="2880"/>
@@ -5572,7 +5230,7 @@
     </w:lvl>
     <w:lvl w:ilvl="4">
       <w:numFmt w:val="bullet"/>
-      <w:lvlText w:val="o"/>
+      <w:lvlText w:val="◦"/>
       <w:lvlJc w:val="left"/>
       <w:pPr>
         <w:ind w:hanging="360" w:left="3600"/>
@@ -5583,7 +5241,7 @@
     </w:lvl>
     <w:lvl w:ilvl="5">
       <w:numFmt w:val="bullet"/>
-      <w:lvlText w:val=""/>
+      <w:lvlText w:val="▪"/>
       <w:lvlJc w:val="left"/>
       <w:pPr>
         <w:ind w:hanging="360" w:left="4320"/>
@@ -5594,7 +5252,7 @@
     </w:lvl>
     <w:lvl w:ilvl="6">
       <w:numFmt w:val="bullet"/>
-      <w:lvlText w:val=""/>
+      <w:lvlText w:val="•"/>
       <w:lvlJc w:val="left"/>
       <w:pPr>
         <w:ind w:hanging="360" w:left="5040"/>
@@ -5605,7 +5263,7 @@
     </w:lvl>
     <w:lvl w:ilvl="7">
       <w:numFmt w:val="bullet"/>
-      <w:lvlText w:val="o"/>
+      <w:lvlText w:val="◦"/>
       <w:lvlJc w:val="left"/>
       <w:pPr>
         <w:ind w:hanging="360" w:left="5760"/>
@@ -5616,7 +5274,7 @@
     </w:lvl>
     <w:lvl w:ilvl="8">
       <w:numFmt w:val="bullet"/>
-      <w:lvlText w:val=""/>
+      <w:lvlText w:val="▪"/>
       <w:lvlJc w:val="left"/>
       <w:pPr>
         <w:ind w:hanging="360" w:left="6480"/>
@@ -10313,7 +9971,15 @@
       <w:lvlJc w:val="left"/>
       <w:pPr>
         <w:ind w:left="720" w:hanging="360"/>
-      </w:pPr>
+        <w:spacing w:before="0" w:after="120" w:line="288" w:lineRule="auto"/>
+      </w:pPr>
+      <w:rPr>
+        <w:rFonts w:ascii="Arial" w:hAnsi="Arial" w:cs="Arial" w:eastAsia="Arial"/>
+        <w:sz w:val="23"/>
+        <w:szCs w:val="23"/>
+        <w:color w:val="222222"/>
+      </w:rPr>
+      <w:suff w:val="tab"/>
     </w:lvl>
     <w:lvl w:ilvl="1">
       <w:numFmt w:val="bullet"/>
@@ -10321,7 +9987,15 @@
       <w:lvlJc w:val="left"/>
       <w:pPr>
         <w:ind w:left="1440" w:hanging="360"/>
-      </w:pPr>
+        <w:spacing w:before="0" w:after="120" w:line="288" w:lineRule="auto"/>
+      </w:pPr>
+      <w:rPr>
+        <w:rFonts w:ascii="Arial" w:hAnsi="Arial" w:cs="Arial" w:eastAsia="Arial"/>
+        <w:sz w:val="23"/>
+        <w:szCs w:val="23"/>
+        <w:color w:val="222222"/>
+      </w:rPr>
+      <w:suff w:val="tab"/>
     </w:lvl>
     <w:lvl w:ilvl="2">
       <w:numFmt w:val="bullet"/>
@@ -10329,7 +10003,15 @@
       <w:lvlJc w:val="left"/>
       <w:pPr>
         <w:ind w:left="2160" w:hanging="360"/>
-      </w:pPr>
+        <w:spacing w:before="0" w:after="120" w:line="288" w:lineRule="auto"/>
+      </w:pPr>
+      <w:rPr>
+        <w:rFonts w:ascii="Arial" w:hAnsi="Arial" w:cs="Arial" w:eastAsia="Arial"/>
+        <w:sz w:val="23"/>
+        <w:szCs w:val="23"/>
+        <w:color w:val="222222"/>
+      </w:rPr>
+      <w:suff w:val="tab"/>
     </w:lvl>
     <w:lvl w:ilvl="3">
       <w:numFmt w:val="bullet"/>
@@ -10337,7 +10019,15 @@
       <w:lvlJc w:val="left"/>
       <w:pPr>
         <w:ind w:left="2880" w:hanging="360"/>
-      </w:pPr>
+        <w:spacing w:before="0" w:after="120" w:line="288" w:lineRule="auto"/>
+      </w:pPr>
+      <w:rPr>
+        <w:rFonts w:ascii="Arial" w:hAnsi="Arial" w:cs="Arial" w:eastAsia="Arial"/>
+        <w:sz w:val="23"/>
+        <w:szCs w:val="23"/>
+        <w:color w:val="222222"/>
+      </w:rPr>
+      <w:suff w:val="tab"/>
     </w:lvl>
     <w:lvl w:ilvl="4">
       <w:numFmt w:val="bullet"/>
@@ -10345,7 +10035,15 @@
       <w:lvlJc w:val="left"/>
       <w:pPr>
         <w:ind w:left="3600" w:hanging="360"/>
-      </w:pPr>
+        <w:spacing w:before="0" w:after="120" w:line="288" w:lineRule="auto"/>
+      </w:pPr>
+      <w:rPr>
+        <w:rFonts w:ascii="Arial" w:hAnsi="Arial" w:cs="Arial" w:eastAsia="Arial"/>
+        <w:sz w:val="23"/>
+        <w:szCs w:val="23"/>
+        <w:color w:val="222222"/>
+      </w:rPr>
+      <w:suff w:val="tab"/>
     </w:lvl>
     <w:lvl w:ilvl="5">
       <w:numFmt w:val="bullet"/>
@@ -10353,7 +10051,15 @@
       <w:lvlJc w:val="left"/>
       <w:pPr>
         <w:ind w:left="4320" w:hanging="360"/>
-      </w:pPr>
+        <w:spacing w:before="0" w:after="120" w:line="288" w:lineRule="auto"/>
+      </w:pPr>
+      <w:rPr>
+        <w:rFonts w:ascii="Arial" w:hAnsi="Arial" w:cs="Arial" w:eastAsia="Arial"/>
+        <w:sz w:val="23"/>
+        <w:szCs w:val="23"/>
+        <w:color w:val="222222"/>
+      </w:rPr>
+      <w:suff w:val="tab"/>
     </w:lvl>
     <w:lvl w:ilvl="6">
       <w:numFmt w:val="bullet"/>
@@ -10361,7 +10067,15 @@
       <w:lvlJc w:val="left"/>
       <w:pPr>
         <w:ind w:left="5040" w:hanging="360"/>
-      </w:pPr>
+        <w:spacing w:before="0" w:after="120" w:line="288" w:lineRule="auto"/>
+      </w:pPr>
+      <w:rPr>
+        <w:rFonts w:ascii="Arial" w:hAnsi="Arial" w:cs="Arial" w:eastAsia="Arial"/>
+        <w:sz w:val="23"/>
+        <w:szCs w:val="23"/>
+        <w:color w:val="222222"/>
+      </w:rPr>
+      <w:suff w:val="tab"/>
     </w:lvl>
     <w:lvl w:ilvl="7">
       <w:numFmt w:val="bullet"/>
@@ -10369,7 +10083,15 @@
       <w:lvlJc w:val="left"/>
       <w:pPr>
         <w:ind w:left="5760" w:hanging="360"/>
-      </w:pPr>
+        <w:spacing w:before="0" w:after="120" w:line="288" w:lineRule="auto"/>
+      </w:pPr>
+      <w:rPr>
+        <w:rFonts w:ascii="Arial" w:hAnsi="Arial" w:cs="Arial" w:eastAsia="Arial"/>
+        <w:sz w:val="23"/>
+        <w:szCs w:val="23"/>
+        <w:color w:val="222222"/>
+      </w:rPr>
+      <w:suff w:val="tab"/>
     </w:lvl>
     <w:lvl w:ilvl="8">
       <w:numFmt w:val="bullet"/>
@@ -10377,7 +10099,15 @@
       <w:lvlJc w:val="left"/>
       <w:pPr>
         <w:ind w:left="6480" w:hanging="360"/>
-      </w:pPr>
+        <w:spacing w:before="0" w:after="120" w:line="288" w:lineRule="auto"/>
+      </w:pPr>
+      <w:rPr>
+        <w:rFonts w:ascii="Arial" w:hAnsi="Arial" w:cs="Arial" w:eastAsia="Arial"/>
+        <w:sz w:val="23"/>
+        <w:szCs w:val="23"/>
+        <w:color w:val="222222"/>
+      </w:rPr>
+      <w:suff w:val="tab"/>
     </w:lvl>
   </w:abstractNum>
   <w:num w16cid:durableId="313026888" w:numId="1">
@@ -10604,17 +10334,18 @@
   <w:docDefaults>
     <w:rPrDefault>
       <w:rPr>
-        <w:rFonts w:asciiTheme="minorHAnsi" w:cstheme="minorBidi" w:eastAsiaTheme="minorHAnsi" w:hAnsiTheme="minorHAnsi"/>
+        <w:rFonts w:ascii="Arial" w:asciiTheme="minorHAnsi" w:cs="Arial" w:cstheme="minorBidi" w:eastAsia="Arial" w:eastAsiaTheme="minorHAnsi" w:hAnsi="Arial" w:hAnsiTheme="minorHAnsi"/>
         <w:kern w:val="2"/>
-        <w:sz w:val="24"/>
-        <w:szCs w:val="24"/>
+        <w:sz w:val="23"/>
+        <w:szCs w:val="23"/>
         <w:lang w:bidi="ar-SA" w:eastAsia="en-US" w:val="en-US"/>
         <w14:ligatures w14:val="standardContextual"/>
+        <w:color w:val="222222"/>
       </w:rPr>
     </w:rPrDefault>
     <w:pPrDefault>
       <w:pPr>
-        <w:spacing w:after="160" w:line="278" w:lineRule="auto"/>
+        <w:spacing w:after="160" w:before="0" w:line="300" w:lineRule="auto"/>
       </w:pPr>
     </w:pPrDefault>
   </w:docDefaults>
@@ -11000,6 +10731,16 @@
     <w:name w:val="Normal"/>
     <w:qFormat/>
     <w:rsid w:val="00E6184A"/>
+    <w:pPr>
+      <w:spacing w:after="160" w:before="0" w:line="300" w:lineRule="auto"/>
+      <w:widowControl/>
+    </w:pPr>
+    <w:rPr>
+      <w:rFonts w:ascii="Arial" w:cs="Arial" w:eastAsia="Arial" w:hAnsi="Arial"/>
+      <w:sz w:val="23"/>
+      <w:szCs w:val="23"/>
+      <w:color w:val="222222"/>
+    </w:rPr>
   </w:style>
   <w:style w:styleId="Heading1" w:type="paragraph">
     <w:name w:val="heading 1"/>
@@ -11023,7 +10764,7 @@
         <w:right w:color="000000" w:shadow="1" w:space="4" w:sz="4" w:themeColor="text1" w:val="single"/>
       </w:pBdr>
       <w:shd w:color="F2F2F2" w:fill="F2F2F2" w:themeColor="background1" w:themeFill="background1" w:themeFillShade="F2" w:themeShade="F2" w:val="solid"/>
-      <w:spacing w:after="480" w:before="360"/>
+      <w:spacing w:after="200" w:before="360" w:line="300" w:lineRule="auto"/>
       <w:outlineLvl w:val="0"/>
     </w:pPr>
     <w:rPr>
@@ -11049,15 +10790,17 @@
         <w:ilvl w:val="1"/>
         <w:numId w:val="42"/>
       </w:numPr>
-      <w:spacing w:after="80" w:before="160"/>
+      <w:spacing w:after="140" w:before="300" w:line="300" w:lineRule="auto"/>
       <w:outlineLvl w:val="1"/>
+      <w:keepNext/>
+      <w:keepLines/>
     </w:pPr>
     <w:rPr>
-      <w:rFonts w:cstheme="majorBidi" w:eastAsiaTheme="majorEastAsia"/>
+      <w:rFonts w:ascii="Arial" w:cs="Arial" w:cstheme="majorBidi" w:eastAsia="Arial" w:eastAsiaTheme="majorEastAsia" w:hAnsi="Arial"/>
       <w:b/>
-      <w:color w:themeColor="text1" w:val="000000"/>
-      <w:sz w:val="32"/>
-      <w:szCs w:val="32"/>
+      <w:color w:themeColor="text1" w:val="1A1A1A"/>
+      <w:sz w:val="30"/>
+      <w:szCs w:val="30"/>
     </w:rPr>
   </w:style>
   <w:style w:styleId="Heading3" w:type="paragraph">
@@ -11075,13 +10818,16 @@
         <w:ilvl w:val="2"/>
         <w:numId w:val="42"/>
       </w:numPr>
-      <w:spacing w:after="80" w:before="160"/>
+      <w:spacing w:after="120" w:before="240" w:line="288" w:lineRule="auto"/>
       <w:outlineLvl w:val="2"/>
+      <w:keepNext/>
+      <w:keepLines/>
     </w:pPr>
     <w:rPr>
-      <w:color w:themeColor="text1" w:val="000000"/>
-      <w:sz w:val="28"/>
-      <w:szCs w:val="28"/>
+      <w:rFonts w:ascii="Arial" w:cs="Arial" w:eastAsia="Arial" w:hAnsi="Arial"/>
+      <w:color w:themeColor="text1" w:val="333333"/>
+      <w:sz w:val="26"/>
+      <w:szCs w:val="26"/>
     </w:rPr>
   </w:style>
   <w:style w:styleId="Heading4" w:type="paragraph">
@@ -11408,9 +11154,11 @@
     <w:qFormat/>
     <w:rsid w:val="00AC7473"/>
     <w:pPr>
-      <w:spacing w:after="120" w:line="240" w:lineRule="auto"/>
+      <w:spacing w:after="100" w:before="0" w:line="288" w:lineRule="auto"/>
       <w:contextualSpacing/>
       <w:jc w:val="center"/>
+      <w:keepNext/>
+      <w:keepLines/>
     </w:pPr>
     <w:rPr>
       <w:rFonts w:asciiTheme="majorHAnsi" w:cstheme="majorBidi" w:eastAsiaTheme="majorEastAsia" w:hAnsiTheme="majorHAnsi"/>
@@ -11452,9 +11200,12 @@
         <w:ilvl w:val="1"/>
       </w:numPr>
       <w:jc w:val="center"/>
+      <w:spacing w:after="260" w:before="0" w:line="288" w:lineRule="auto"/>
+      <w:keepNext/>
+      <w:keepLines/>
     </w:pPr>
     <w:rPr>
-      <w:rFonts w:asciiTheme="majorHAnsi" w:cstheme="majorBidi" w:eastAsiaTheme="majorEastAsia" w:hAnsiTheme="majorHAnsi"/>
+      <w:rFonts w:ascii="Arial" w:asciiTheme="majorHAnsi" w:cs="Arial" w:cstheme="majorBidi" w:eastAsia="Arial" w:eastAsiaTheme="majorEastAsia" w:hAnsi="Arial" w:hAnsiTheme="majorHAnsi"/>
       <w:color w:themeColor="text1" w:themeTint="A6" w:val="595959"/>
       <w:spacing w:val="15"/>
       <w:sz w:val="28"/>
@@ -11515,7 +11266,14 @@
     <w:pPr>
       <w:ind w:left="720"/>
       <w:contextualSpacing/>
+      <w:spacing w:after="120" w:before="0" w:line="288" w:lineRule="auto"/>
     </w:pPr>
+    <w:rPr>
+      <w:rFonts w:ascii="Arial" w:cs="Arial" w:eastAsia="Arial" w:hAnsi="Arial"/>
+      <w:sz w:val="23"/>
+      <w:szCs w:val="23"/>
+      <w:color w:val="222222"/>
+    </w:rPr>
   </w:style>
   <w:style w:styleId="IntenseEmphasis" w:type="character">
     <w:name w:val="Intense Emphasis"/>
@@ -11687,190 +11445,271 @@
     <w:autoRedefine/>
     <w:qFormat/>
     <w:pPr>
-      <w:shd w:color="auto" w:fill="F1F3F5" w:val="clear"/>
-      <w:wordWrap w:val="0"/>
+      <w:shd w:color="auto" w:fill="F7F7F7" w:val="clear"/>
+      <w:wordWrap w:val="1"/>
+      <w:spacing w:after="160" w:before="120" w:line="264" w:lineRule="auto"/>
+      <w:ind w:left="160" w:right="160"/>
+      <w:pBdr>
+        <w:left w:color="C8102E" w:space="12" w:sz="14" w:val="single"/>
+        <w:top w:color="D9D9D9" w:space="6" w:sz="4" w:val="single"/>
+        <w:bottom w:color="D9D9D9" w:space="6" w:sz="4" w:val="single"/>
+        <w:right w:color="D9D9D9" w:space="6" w:sz="4" w:val="single"/>
+      </w:pBdr>
     </w:pPr>
+    <w:rPr>
+      <w:rFonts w:ascii="Courier New" w:cs="Courier New" w:eastAsia="Courier New" w:hAnsi="Courier New"/>
+      <w:sz w:val="19"/>
+      <w:szCs w:val="19"/>
+      <w:color w:val="1F2937"/>
+    </w:rPr>
   </w:style>
   <w:style w:customStyle="1" w:styleId="KeywordTok" w:type="character">
     <w:name w:val="KeywordTok"/>
     <w:rPr>
+      <w:rFonts w:ascii="Courier New" w:cs="Courier New" w:eastAsia="Courier New" w:hAnsi="Courier New"/>
       <w:b/>
       <w:color w:val="003B4F"/>
-      <w:shd w:color="auto" w:fill="F1F3F5" w:val="clear"/>
+      <w:shd w:color="auto" w:fill="F7F7F7" w:val="clear"/>
+      <w:sz w:val="19"/>
+      <w:szCs w:val="19"/>
     </w:rPr>
   </w:style>
   <w:style w:customStyle="1" w:styleId="DataTypeTok" w:type="character">
     <w:name w:val="DataTypeTok"/>
     <w:rsid w:val="008B5ADE"/>
     <w:rPr>
-      <w:rFonts w:asciiTheme="minorHAnsi" w:hAnsiTheme="minorHAnsi"/>
+      <w:rFonts w:ascii="Courier New" w:asciiTheme="minorHAnsi" w:cs="Courier New" w:eastAsia="Courier New" w:hAnsi="Courier New" w:hAnsiTheme="minorHAnsi"/>
       <w:color w:val="AD0000"/>
-      <w:shd w:color="auto" w:fill="F1F3F5" w:val="clear"/>
+      <w:shd w:color="auto" w:fill="F7F7F7" w:val="clear"/>
+      <w:sz w:val="19"/>
+      <w:szCs w:val="19"/>
     </w:rPr>
   </w:style>
   <w:style w:customStyle="1" w:styleId="DecValTok" w:type="character">
     <w:name w:val="DecValTok"/>
     <w:rPr>
+      <w:rFonts w:ascii="Courier New" w:cs="Courier New" w:eastAsia="Courier New" w:hAnsi="Courier New"/>
       <w:color w:val="AD0000"/>
-      <w:shd w:color="auto" w:fill="F1F3F5" w:val="clear"/>
+      <w:shd w:color="auto" w:fill="F7F7F7" w:val="clear"/>
+      <w:sz w:val="19"/>
+      <w:szCs w:val="19"/>
     </w:rPr>
   </w:style>
   <w:style w:customStyle="1" w:styleId="BaseNTok" w:type="character">
     <w:name w:val="BaseNTok"/>
     <w:rsid w:val="008B5ADE"/>
     <w:rPr>
-      <w:rFonts w:asciiTheme="minorHAnsi" w:hAnsiTheme="minorHAnsi"/>
+      <w:rFonts w:ascii="Courier New" w:asciiTheme="minorHAnsi" w:cs="Courier New" w:eastAsia="Courier New" w:hAnsi="Courier New" w:hAnsiTheme="minorHAnsi"/>
       <w:color w:val="AD0000"/>
-      <w:shd w:color="auto" w:fill="F1F3F5" w:val="clear"/>
+      <w:shd w:color="auto" w:fill="F7F7F7" w:val="clear"/>
+      <w:sz w:val="19"/>
+      <w:szCs w:val="19"/>
     </w:rPr>
   </w:style>
   <w:style w:customStyle="1" w:styleId="FloatTok" w:type="character">
     <w:name w:val="FloatTok"/>
     <w:rPr>
+      <w:rFonts w:ascii="Courier New" w:cs="Courier New" w:eastAsia="Courier New" w:hAnsi="Courier New"/>
       <w:color w:val="AD0000"/>
-      <w:shd w:color="auto" w:fill="F1F3F5" w:val="clear"/>
+      <w:shd w:color="auto" w:fill="F7F7F7" w:val="clear"/>
+      <w:sz w:val="19"/>
+      <w:szCs w:val="19"/>
     </w:rPr>
   </w:style>
   <w:style w:customStyle="1" w:styleId="ConstantTok" w:type="character">
     <w:name w:val="ConstantTok"/>
     <w:rPr>
+      <w:rFonts w:ascii="Courier New" w:cs="Courier New" w:eastAsia="Courier New" w:hAnsi="Courier New"/>
       <w:color w:val="8F5902"/>
-      <w:shd w:color="auto" w:fill="F1F3F5" w:val="clear"/>
+      <w:shd w:color="auto" w:fill="F7F7F7" w:val="clear"/>
+      <w:sz w:val="19"/>
+      <w:szCs w:val="19"/>
     </w:rPr>
   </w:style>
   <w:style w:customStyle="1" w:styleId="CharTok" w:type="character">
     <w:name w:val="CharTok"/>
     <w:rsid w:val="008B5ADE"/>
     <w:rPr>
-      <w:rFonts w:asciiTheme="minorHAnsi" w:hAnsiTheme="minorHAnsi"/>
+      <w:rFonts w:ascii="Courier New" w:asciiTheme="minorHAnsi" w:cs="Courier New" w:eastAsia="Courier New" w:hAnsi="Courier New" w:hAnsiTheme="minorHAnsi"/>
       <w:color w:val="20794D"/>
-      <w:shd w:color="auto" w:fill="F1F3F5" w:val="clear"/>
+      <w:shd w:color="auto" w:fill="F7F7F7" w:val="clear"/>
+      <w:sz w:val="19"/>
+      <w:szCs w:val="19"/>
     </w:rPr>
   </w:style>
   <w:style w:customStyle="1" w:styleId="SpecialCharTok" w:type="character">
     <w:name w:val="SpecialCharTok"/>
     <w:rPr>
+      <w:rFonts w:ascii="Courier New" w:cs="Courier New" w:eastAsia="Courier New" w:hAnsi="Courier New"/>
       <w:color w:val="5E5E5E"/>
-      <w:shd w:color="auto" w:fill="F1F3F5" w:val="clear"/>
+      <w:shd w:color="auto" w:fill="F7F7F7" w:val="clear"/>
+      <w:sz w:val="19"/>
+      <w:szCs w:val="19"/>
     </w:rPr>
   </w:style>
   <w:style w:customStyle="1" w:styleId="StringTok" w:type="character">
     <w:name w:val="StringTok"/>
     <w:rPr>
+      <w:rFonts w:ascii="Courier New" w:cs="Courier New" w:eastAsia="Courier New" w:hAnsi="Courier New"/>
       <w:color w:val="20794D"/>
-      <w:shd w:color="auto" w:fill="F1F3F5" w:val="clear"/>
+      <w:shd w:color="auto" w:fill="F7F7F7" w:val="clear"/>
+      <w:sz w:val="19"/>
+      <w:szCs w:val="19"/>
     </w:rPr>
   </w:style>
   <w:style w:customStyle="1" w:styleId="VerbatimStringTok" w:type="character">
     <w:name w:val="VerbatimStringTok"/>
     <w:rPr>
+      <w:rFonts w:ascii="Courier New" w:cs="Courier New" w:eastAsia="Courier New" w:hAnsi="Courier New"/>
       <w:color w:val="20794D"/>
-      <w:shd w:color="auto" w:fill="F1F3F5" w:val="clear"/>
+      <w:shd w:color="auto" w:fill="F7F7F7" w:val="clear"/>
+      <w:sz w:val="19"/>
+      <w:szCs w:val="19"/>
     </w:rPr>
   </w:style>
   <w:style w:customStyle="1" w:styleId="SpecialStringTok" w:type="character">
     <w:name w:val="SpecialStringTok"/>
     <w:rPr>
+      <w:rFonts w:ascii="Courier New" w:cs="Courier New" w:eastAsia="Courier New" w:hAnsi="Courier New"/>
       <w:color w:val="20794D"/>
-      <w:shd w:color="auto" w:fill="F1F3F5" w:val="clear"/>
+      <w:shd w:color="auto" w:fill="F7F7F7" w:val="clear"/>
+      <w:sz w:val="19"/>
+      <w:szCs w:val="19"/>
     </w:rPr>
   </w:style>
   <w:style w:customStyle="1" w:styleId="ImportTok" w:type="character">
     <w:name w:val="ImportTok"/>
     <w:rPr>
+      <w:rFonts w:ascii="Courier New" w:cs="Courier New" w:eastAsia="Courier New" w:hAnsi="Courier New"/>
       <w:color w:val="00769E"/>
-      <w:shd w:color="auto" w:fill="F1F3F5" w:val="clear"/>
+      <w:shd w:color="auto" w:fill="F7F7F7" w:val="clear"/>
+      <w:sz w:val="19"/>
+      <w:szCs w:val="19"/>
     </w:rPr>
   </w:style>
   <w:style w:customStyle="1" w:styleId="CommentTok" w:type="character">
     <w:name w:val="CommentTok"/>
     <w:rPr>
+      <w:rFonts w:ascii="Courier New" w:cs="Courier New" w:eastAsia="Courier New" w:hAnsi="Courier New"/>
       <w:color w:val="5E5E5E"/>
-      <w:shd w:color="auto" w:fill="F1F3F5" w:val="clear"/>
+      <w:shd w:color="auto" w:fill="F7F7F7" w:val="clear"/>
+      <w:sz w:val="19"/>
+      <w:szCs w:val="19"/>
     </w:rPr>
   </w:style>
   <w:style w:customStyle="1" w:styleId="DocumentationTok" w:type="character">
     <w:name w:val="DocumentationTok"/>
     <w:rsid w:val="008B5ADE"/>
     <w:rPr>
-      <w:rFonts w:asciiTheme="minorHAnsi" w:hAnsiTheme="minorHAnsi"/>
+      <w:rFonts w:ascii="Courier New" w:asciiTheme="minorHAnsi" w:cs="Courier New" w:eastAsia="Courier New" w:hAnsi="Courier New" w:hAnsiTheme="minorHAnsi"/>
       <w:i/>
       <w:color w:val="5E5E5E"/>
-      <w:shd w:color="auto" w:fill="F1F3F5" w:val="clear"/>
+      <w:shd w:color="auto" w:fill="F7F7F7" w:val="clear"/>
+      <w:sz w:val="19"/>
+      <w:szCs w:val="19"/>
     </w:rPr>
   </w:style>
   <w:style w:customStyle="1" w:styleId="AnnotationTok" w:type="character">
     <w:name w:val="AnnotationTok"/>
     <w:rPr>
+      <w:rFonts w:ascii="Courier New" w:cs="Courier New" w:eastAsia="Courier New" w:hAnsi="Courier New"/>
       <w:color w:val="5E5E5E"/>
-      <w:shd w:color="auto" w:fill="F1F3F5" w:val="clear"/>
+      <w:shd w:color="auto" w:fill="F7F7F7" w:val="clear"/>
+      <w:sz w:val="19"/>
+      <w:szCs w:val="19"/>
     </w:rPr>
   </w:style>
   <w:style w:customStyle="1" w:styleId="CommentVarTok" w:type="character">
     <w:name w:val="CommentVarTok"/>
     <w:rPr>
+      <w:rFonts w:ascii="Courier New" w:cs="Courier New" w:eastAsia="Courier New" w:hAnsi="Courier New"/>
       <w:i/>
       <w:color w:val="5E5E5E"/>
-      <w:shd w:color="auto" w:fill="F1F3F5" w:val="clear"/>
+      <w:shd w:color="auto" w:fill="F7F7F7" w:val="clear"/>
+      <w:sz w:val="19"/>
+      <w:szCs w:val="19"/>
     </w:rPr>
   </w:style>
   <w:style w:customStyle="1" w:styleId="OtherTok" w:type="character">
     <w:name w:val="OtherTok"/>
     <w:rPr>
+      <w:rFonts w:ascii="Courier New" w:cs="Courier New" w:eastAsia="Courier New" w:hAnsi="Courier New"/>
       <w:color w:val="003B4F"/>
-      <w:shd w:color="auto" w:fill="F1F3F5" w:val="clear"/>
+      <w:shd w:color="auto" w:fill="F7F7F7" w:val="clear"/>
+      <w:sz w:val="19"/>
+      <w:szCs w:val="19"/>
     </w:rPr>
   </w:style>
   <w:style w:customStyle="1" w:styleId="FunctionTok" w:type="character">
     <w:name w:val="FunctionTok"/>
     <w:rPr>
+      <w:rFonts w:ascii="Courier New" w:cs="Courier New" w:eastAsia="Courier New" w:hAnsi="Courier New"/>
       <w:color w:val="4758AB"/>
-      <w:shd w:color="auto" w:fill="F1F3F5" w:val="clear"/>
+      <w:shd w:color="auto" w:fill="F7F7F7" w:val="clear"/>
+      <w:sz w:val="19"/>
+      <w:szCs w:val="19"/>
     </w:rPr>
   </w:style>
   <w:style w:customStyle="1" w:styleId="VariableTok" w:type="character">
     <w:name w:val="VariableTok"/>
     <w:rPr>
+      <w:rFonts w:ascii="Courier New" w:cs="Courier New" w:eastAsia="Courier New" w:hAnsi="Courier New"/>
       <w:color w:val="111111"/>
-      <w:shd w:color="auto" w:fill="F1F3F5" w:val="clear"/>
+      <w:shd w:color="auto" w:fill="F7F7F7" w:val="clear"/>
+      <w:sz w:val="19"/>
+      <w:szCs w:val="19"/>
     </w:rPr>
   </w:style>
   <w:style w:customStyle="1" w:styleId="ControlFlowTok" w:type="character">
     <w:name w:val="ControlFlowTok"/>
     <w:rPr>
+      <w:rFonts w:ascii="Courier New" w:cs="Courier New" w:eastAsia="Courier New" w:hAnsi="Courier New"/>
       <w:b/>
       <w:color w:val="003B4F"/>
-      <w:shd w:color="auto" w:fill="F1F3F5" w:val="clear"/>
+      <w:shd w:color="auto" w:fill="F7F7F7" w:val="clear"/>
+      <w:sz w:val="19"/>
+      <w:szCs w:val="19"/>
     </w:rPr>
   </w:style>
   <w:style w:customStyle="1" w:styleId="OperatorTok" w:type="character">
     <w:name w:val="OperatorTok"/>
     <w:rPr>
+      <w:rFonts w:ascii="Courier New" w:cs="Courier New" w:eastAsia="Courier New" w:hAnsi="Courier New"/>
       <w:color w:val="5E5E5E"/>
-      <w:shd w:color="auto" w:fill="F1F3F5" w:val="clear"/>
+      <w:shd w:color="auto" w:fill="F7F7F7" w:val="clear"/>
+      <w:sz w:val="19"/>
+      <w:szCs w:val="19"/>
     </w:rPr>
   </w:style>
   <w:style w:customStyle="1" w:styleId="BuiltInTok" w:type="character">
     <w:name w:val="BuiltInTok"/>
     <w:rsid w:val="008B5ADE"/>
     <w:rPr>
-      <w:rFonts w:asciiTheme="minorHAnsi" w:hAnsiTheme="minorHAnsi"/>
+      <w:rFonts w:ascii="Courier New" w:asciiTheme="minorHAnsi" w:cs="Courier New" w:eastAsia="Courier New" w:hAnsi="Courier New" w:hAnsiTheme="minorHAnsi"/>
       <w:color w:val="003B4F"/>
-      <w:shd w:color="auto" w:fill="F1F3F5" w:val="clear"/>
+      <w:shd w:color="auto" w:fill="F7F7F7" w:val="clear"/>
+      <w:sz w:val="19"/>
+      <w:szCs w:val="19"/>
     </w:rPr>
   </w:style>
   <w:style w:customStyle="1" w:styleId="ExtensionTok" w:type="character">
     <w:name w:val="ExtensionTok"/>
     <w:rPr>
+      <w:rFonts w:ascii="Courier New" w:cs="Courier New" w:eastAsia="Courier New" w:hAnsi="Courier New"/>
       <w:color w:val="003B4F"/>
-      <w:shd w:color="auto" w:fill="F1F3F5" w:val="clear"/>
+      <w:shd w:color="auto" w:fill="F7F7F7" w:val="clear"/>
+      <w:sz w:val="19"/>
+      <w:szCs w:val="19"/>
     </w:rPr>
   </w:style>
   <w:style w:customStyle="1" w:styleId="PreprocessorTok" w:type="character">
     <w:name w:val="PreprocessorTok"/>
     <w:rPr>
+      <w:rFonts w:ascii="Courier New" w:cs="Courier New" w:eastAsia="Courier New" w:hAnsi="Courier New"/>
       <w:color w:val="AD0000"/>
-      <w:shd w:color="auto" w:fill="F1F3F5" w:val="clear"/>
+      <w:shd w:color="auto" w:fill="F7F7F7" w:val="clear"/>
+      <w:sz w:val="19"/>
+      <w:szCs w:val="19"/>
     </w:rPr>
   </w:style>
   <w:style w:customStyle="1" w:styleId="AttributeTok" w:type="character">
@@ -11878,31 +11717,42 @@
     <w:qFormat/>
     <w:rsid w:val="008B5ADE"/>
     <w:rPr>
-      <w:rFonts w:asciiTheme="minorHAnsi" w:hAnsiTheme="minorHAnsi"/>
+      <w:rFonts w:ascii="Courier New" w:asciiTheme="minorHAnsi" w:cs="Courier New" w:eastAsia="Courier New" w:hAnsi="Courier New" w:hAnsiTheme="minorHAnsi"/>
       <w:color w:val="657422"/>
-      <w:shd w:color="auto" w:fill="F1F3F5" w:val="clear"/>
+      <w:shd w:color="auto" w:fill="F7F7F7" w:val="clear"/>
+      <w:sz w:val="19"/>
+      <w:szCs w:val="19"/>
     </w:rPr>
   </w:style>
   <w:style w:customStyle="1" w:styleId="RegionMarkerTok" w:type="character">
     <w:name w:val="RegionMarkerTok"/>
     <w:rPr>
+      <w:rFonts w:ascii="Courier New" w:cs="Courier New" w:eastAsia="Courier New" w:hAnsi="Courier New"/>
       <w:color w:val="003B4F"/>
-      <w:shd w:color="auto" w:fill="F1F3F5" w:val="clear"/>
+      <w:shd w:color="auto" w:fill="F7F7F7" w:val="clear"/>
+      <w:sz w:val="19"/>
+      <w:szCs w:val="19"/>
     </w:rPr>
   </w:style>
   <w:style w:customStyle="1" w:styleId="InformationTok" w:type="character">
     <w:name w:val="InformationTok"/>
     <w:rPr>
+      <w:rFonts w:ascii="Courier New" w:cs="Courier New" w:eastAsia="Courier New" w:hAnsi="Courier New"/>
       <w:color w:val="5E5E5E"/>
-      <w:shd w:color="auto" w:fill="F1F3F5" w:val="clear"/>
+      <w:shd w:color="auto" w:fill="F7F7F7" w:val="clear"/>
+      <w:sz w:val="19"/>
+      <w:szCs w:val="19"/>
     </w:rPr>
   </w:style>
   <w:style w:customStyle="1" w:styleId="WarningTok" w:type="character">
     <w:name w:val="WarningTok"/>
     <w:rPr>
+      <w:rFonts w:ascii="Courier New" w:cs="Courier New" w:eastAsia="Courier New" w:hAnsi="Courier New"/>
       <w:i/>
       <w:color w:val="5E5E5E"/>
-      <w:shd w:color="auto" w:fill="F1F3F5" w:val="clear"/>
+      <w:shd w:color="auto" w:fill="F7F7F7" w:val="clear"/>
+      <w:sz w:val="19"/>
+      <w:szCs w:val="19"/>
     </w:rPr>
   </w:style>
   <w:style w:customStyle="1" w:styleId="AlertTok" w:type="character">
@@ -11910,23 +11760,31 @@
     <w:qFormat/>
     <w:rsid w:val="008B5ADE"/>
     <w:rPr>
-      <w:rFonts w:asciiTheme="minorHAnsi" w:hAnsiTheme="minorHAnsi"/>
+      <w:rFonts w:ascii="Courier New" w:asciiTheme="minorHAnsi" w:cs="Courier New" w:eastAsia="Courier New" w:hAnsi="Courier New" w:hAnsiTheme="minorHAnsi"/>
       <w:color w:val="AD0000"/>
-      <w:shd w:color="auto" w:fill="F1F3F5" w:val="clear"/>
+      <w:shd w:color="auto" w:fill="F7F7F7" w:val="clear"/>
+      <w:sz w:val="19"/>
+      <w:szCs w:val="19"/>
     </w:rPr>
   </w:style>
   <w:style w:customStyle="1" w:styleId="ErrorTok" w:type="character">
     <w:name w:val="ErrorTok"/>
     <w:rPr>
+      <w:rFonts w:ascii="Courier New" w:cs="Courier New" w:eastAsia="Courier New" w:hAnsi="Courier New"/>
       <w:color w:val="AD0000"/>
-      <w:shd w:color="auto" w:fill="F1F3F5" w:val="clear"/>
+      <w:shd w:color="auto" w:fill="F7F7F7" w:val="clear"/>
+      <w:sz w:val="19"/>
+      <w:szCs w:val="19"/>
     </w:rPr>
   </w:style>
   <w:style w:customStyle="1" w:styleId="NormalTok" w:type="character">
     <w:name w:val="NormalTok"/>
     <w:rPr>
+      <w:rFonts w:ascii="Courier New" w:cs="Courier New" w:eastAsia="Courier New" w:hAnsi="Courier New"/>
       <w:color w:val="003B4F"/>
-      <w:shd w:color="auto" w:fill="F1F3F5" w:val="clear"/>
+      <w:shd w:color="auto" w:fill="F7F7F7" w:val="clear"/>
+      <w:sz w:val="19"/>
+      <w:szCs w:val="19"/>
     </w:rPr>
   </w:style>
   <w:style w:customStyle="1" w:styleId="Section1" w:type="character">
@@ -12776,6 +12634,7 @@
       <w:spacing w:after="200" w:line="240" w:lineRule="auto"/>
     </w:pPr>
     <w:rPr>
+      <w:rFonts w:ascii="Arial" w:cs="Arial" w:eastAsia="Arial" w:hAnsi="Arial"/>
       <w:i/>
       <w:iCs/>
       <w:color w:themeColor="text2" w:val="44546A"/>
@@ -12816,11 +12675,15 @@
     <w:qFormat/>
     <w:rsid w:val="00491A31"/>
     <w:pPr>
-      <w:spacing w:after="180" w:before="180" w:line="240" w:lineRule="auto"/>
+      <w:spacing w:after="160" w:before="0" w:line="300" w:lineRule="auto"/>
     </w:pPr>
     <w:rPr>
+      <w:rFonts w:ascii="Arial" w:cs="Arial" w:eastAsia="Arial" w:hAnsi="Arial"/>
       <w:kern w:val="0"/>
       <w14:ligatures w14:val="none"/>
+      <w:sz w:val="23"/>
+      <w:szCs w:val="23"/>
+      <w:color w:val="222222"/>
     </w:rPr>
   </w:style>
   <w:style w:customStyle="1" w:styleId="VerbatimChar" w:type="character">
@@ -12830,8 +12693,11 @@
     <w:qFormat/>
     <w:rsid w:val="00D15FFF"/>
     <w:rPr>
-      <w:rFonts w:ascii="Atkinson Hyperlegible" w:hAnsi="Atkinson Hyperlegible"/>
+      <w:rFonts w:ascii="Courier New" w:cs="Courier New" w:eastAsia="Courier New" w:hAnsi="Courier New"/>
       <w:shd w:color="auto" w:fill="F1F3F5" w:val="clear"/>
+      <w:sz w:val="20"/>
+      <w:szCs w:val="20"/>
+      <w:color w:val="1F2937"/>
     </w:rPr>
   </w:style>
   <w:style w:styleId="BodyText" w:type="paragraph">
@@ -12844,8 +12710,14 @@
     <w:qFormat/>
     <w:rsid w:val="00AA286D"/>
     <w:pPr>
-      <w:spacing w:after="240" w:before="120"/>
+      <w:spacing w:after="160" w:before="0" w:line="300" w:lineRule="auto"/>
     </w:pPr>
+    <w:rPr>
+      <w:rFonts w:ascii="Arial" w:cs="Arial" w:eastAsia="Arial" w:hAnsi="Arial"/>
+      <w:sz w:val="23"/>
+      <w:szCs w:val="23"/>
+      <w:color w:val="222222"/>
+    </w:rPr>
   </w:style>
   <w:style w:customStyle="1" w:styleId="BodyTextChar" w:type="character">
     <w:name w:val="Body Text Char"/>
@@ -12860,11 +12732,15 @@
     <w:qFormat/>
     <w:rsid w:val="00D15FFF"/>
     <w:pPr>
-      <w:spacing w:after="36" w:before="36" w:line="240" w:lineRule="auto"/>
+      <w:spacing w:after="120" w:before="0" w:line="288" w:lineRule="auto"/>
     </w:pPr>
     <w:rPr>
+      <w:rFonts w:ascii="Arial" w:cs="Arial" w:eastAsia="Arial" w:hAnsi="Arial"/>
       <w:kern w:val="0"/>
       <w14:ligatures w14:val="none"/>
+      <w:sz w:val="23"/>
+      <w:szCs w:val="23"/>
+      <w:color w:val="222222"/>
     </w:rPr>
   </w:style>
   <w:style w:styleId="FootnoteReference" w:type="character">
@@ -13716,20 +13592,22 @@
     <w:qFormat/>
     <w:rsid w:val="00050EB4"/>
     <w:pPr>
-      <w:numPr>
-        <w:numId w:val="51"/>
-      </w:numPr>
       <w:pBdr>
-        <w:top w:color="auto" w:space="5" w:sz="4" w:val="dotted"/>
-        <w:left w:color="auto" w:space="4" w:sz="4" w:val="dotted"/>
-        <w:bottom w:color="auto" w:space="5" w:sz="4" w:val="dotted"/>
-        <w:right w:color="auto" w:space="4" w:sz="4" w:val="dotted"/>
+        <w:top w:color="B7B7B7" w:space="12" w:sz="6" w:val="single"/>
+        <w:left w:color="C8102E" w:space="12" w:sz="14" w:val="single"/>
+        <w:bottom w:color="B7B7B7" w:space="12" w:sz="6" w:val="single"/>
+        <w:right w:color="B7B7B7" w:space="12" w:sz="6" w:val="single"/>
       </w:pBdr>
-      <w:ind w:right="1008"/>
+      <w:ind w:left="240" w:right="240"/>
+      <w:spacing w:after="360" w:before="180" w:line="300" w:lineRule="auto"/>
+      <w:widowControl/>
+      <w:shd w:color="auto" w:fill="F7F7F7" w:val="clear"/>
     </w:pPr>
     <w:rPr>
-      <w:rFonts w:cs="Times New Roman (Body CS)"/>
-      <w:sz w:val="22"/>
+      <w:rFonts w:ascii="Arial" w:cs="Arial" w:eastAsia="Arial" w:hAnsi="Arial"/>
+      <w:sz w:val="23"/>
+      <w:szCs w:val="23"/>
+      <w:color w:val="222222"/>
     </w:rPr>
   </w:style>
   <w:style w:styleId="HTMLAddress" w:type="paragraph">
@@ -13808,7 +13686,7 @@
       </w:pBdr>
       <w:shd w:color="auto" w:fill="auto" w:val="clear"/>
       <w:spacing w:line="360" w:lineRule="auto"/>
-      <w:ind w:left="-1152" w:right="-1152"/>
+      <w:ind w:left="0" w:right="0"/>
     </w:pPr>
     <w:rPr>
       <w:sz w:val="20"/>
@@ -13946,7 +13824,7 @@
     <w:qFormat/>
     <w:rsid w:val="00E6184A"/>
     <w:rPr>
-      <w:rFonts w:asciiTheme="minorHAnsi" w:hAnsiTheme="minorHAnsi"/>
+      <w:rFonts w:ascii="Arial" w:asciiTheme="minorHAnsi" w:cs="Arial" w:eastAsia="Arial" w:hAnsi="Arial" w:hAnsiTheme="minorHAnsi"/>
       <w:b/>
       <w:i w:val="0"/>
       <w:caps w:val="0"/>

</xml_diff>